<commit_message>
Avance 2, obj SIG, fotos BPMN y continuacion C)
</commit_message>
<xml_diff>
--- a/informe/Informe_Entrega1_PapasFritasRUTA.docx
+++ b/informe/Informe_Entrega1_PapasFritasRUTA.docx
@@ -1,6 +1,6 @@
 
 <file path=word/document.xml><?xml version="1.0" encoding="utf-8"?>
-<w:document xmlns:wpc="http://schemas.microsoft.com/office/word/2010/wordprocessingCanvas" xmlns:cx="http://schemas.microsoft.com/office/drawing/2014/chartex" xmlns:cx1="http://schemas.microsoft.com/office/drawing/2015/9/8/chartex" xmlns:cx2="http://schemas.microsoft.com/office/drawing/2015/10/21/chartex" xmlns:cx3="http://schemas.microsoft.com/office/drawing/2016/5/9/chartex" xmlns:cx4="http://schemas.microsoft.com/office/drawing/2016/5/10/chartex" xmlns:cx5="http://schemas.microsoft.com/office/drawing/2016/5/11/chartex" xmlns:cx6="http://schemas.microsoft.com/office/drawing/2016/5/12/chartex" xmlns:cx7="http://schemas.microsoft.com/office/drawing/2016/5/13/chartex" xmlns:cx8="http://schemas.microsoft.com/office/drawing/2016/5/14/chartex" xmlns:mc="http://schemas.openxmlformats.org/markup-compatibility/2006" xmlns:aink="http://schemas.microsoft.com/office/drawing/2016/ink" xmlns:am3d="http://schemas.microsoft.com/office/drawing/2017/model3d" xmlns:o="urn:schemas-microsoft-com:office:office" xmlns:oel="http://schemas.microsoft.com/office/2019/extlst" xmlns:r="http://schemas.openxmlformats.org/officeDocument/2006/relationships" xmlns:m="http://schemas.openxmlformats.org/officeDocument/2006/math" xmlns:v="urn:schemas-microsoft-com:vml" xmlns:wp14="http://schemas.microsoft.com/office/word/2010/wordprocessingDrawing" xmlns:wp="http://schemas.openxmlformats.org/drawingml/2006/wordprocessingDrawing" xmlns:w10="urn:schemas-microsoft-com:office:word" xmlns:w="http://schemas.openxmlformats.org/wordprocessingml/2006/main" xmlns:w14="http://schemas.microsoft.com/office/word/2010/wordml" xmlns:w15="http://schemas.microsoft.com/office/word/2012/wordml" xmlns:w16cex="http://schemas.microsoft.com/office/word/2018/wordml/cex" xmlns:w16cid="http://schemas.microsoft.com/office/word/2016/wordml/cid" xmlns:w16="http://schemas.microsoft.com/office/word/2018/wordml" xmlns:w16du="http://schemas.microsoft.com/office/word/2023/wordml/word16du" xmlns:w16sdtdh="http://schemas.microsoft.com/office/word/2020/wordml/sdtdatahash" xmlns:w16sdtfl="http://schemas.microsoft.com/office/word/2024/wordml/sdtformatlock" xmlns:w16se="http://schemas.microsoft.com/office/word/2015/wordml/symex" xmlns:wpg="http://schemas.microsoft.com/office/word/2010/wordprocessingGroup" xmlns:wpi="http://schemas.microsoft.com/office/word/2010/wordprocessingInk" xmlns:wne="http://schemas.microsoft.com/office/word/2006/wordml" xmlns:wps="http://schemas.microsoft.com/office/word/2010/wordprocessingShape" mc:Ignorable="w14 w15 w16se w16cid w16 w16cex w16sdtdh w16sdtfl w16du wp14">
+<w:document xmlns:wpc="http://schemas.microsoft.com/office/word/2010/wordprocessingCanvas" xmlns:cx="http://schemas.microsoft.com/office/drawing/2014/chartex" xmlns:cx1="http://schemas.microsoft.com/office/drawing/2015/9/8/chartex" xmlns:cx2="http://schemas.microsoft.com/office/drawing/2015/10/21/chartex" xmlns:cx3="http://schemas.microsoft.com/office/drawing/2016/5/9/chartex" xmlns:cx4="http://schemas.microsoft.com/office/drawing/2016/5/10/chartex" xmlns:cx5="http://schemas.microsoft.com/office/drawing/2016/5/11/chartex" xmlns:cx6="http://schemas.microsoft.com/office/drawing/2016/5/12/chartex" xmlns:cx7="http://schemas.microsoft.com/office/drawing/2016/5/13/chartex" xmlns:cx8="http://schemas.microsoft.com/office/drawing/2016/5/14/chartex" xmlns:mc="http://schemas.openxmlformats.org/markup-compatibility/2006" xmlns:aink="http://schemas.microsoft.com/office/drawing/2016/ink" xmlns:am3d="http://schemas.microsoft.com/office/drawing/2017/model3d" xmlns:o="urn:schemas-microsoft-com:office:office" xmlns:oel="http://schemas.microsoft.com/office/2019/extlst" xmlns:r="http://schemas.openxmlformats.org/officeDocument/2006/relationships" xmlns:m="http://schemas.openxmlformats.org/officeDocument/2006/math" xmlns:v="urn:schemas-microsoft-com:vml" xmlns:wp14="http://schemas.microsoft.com/office/word/2010/wordprocessingDrawing" xmlns:wp="http://schemas.openxmlformats.org/drawingml/2006/wordprocessingDrawing" xmlns:w10="urn:schemas-microsoft-com:office:word" xmlns:w="http://schemas.openxmlformats.org/wordprocessingml/2006/main" xmlns:w14="http://schemas.microsoft.com/office/word/2010/wordml" xmlns:w15="http://schemas.microsoft.com/office/word/2012/wordml" xmlns:w16cex="http://schemas.microsoft.com/office/word/2018/wordml/cex" xmlns:w16cid="http://schemas.microsoft.com/office/word/2016/wordml/cid" xmlns:w16="http://schemas.microsoft.com/office/word/2018/wordml" xmlns:w16du="http://schemas.microsoft.com/office/word/2023/wordml/word16du" xmlns:w16sdtdh="http://schemas.microsoft.com/office/word/2020/wordml/sdtdatahash" xmlns:w16sdtfl="http://schemas.microsoft.com/office/word/2024/wordml/sdtformatlock" xmlns:w16se="http://schemas.microsoft.com/office/word/2015/wordml/symex" xmlns:wpg="http://schemas.microsoft.com/office/word/2010/wordprocessingGroup" xmlns:wpi="http://schemas.microsoft.com/office/word/2010/wordprocessingInk" xmlns:wne="http://schemas.microsoft.com/office/word/2006/wordml" xmlns:wps="http://schemas.microsoft.com/office/word/2010/wordprocessingShape" xmlns:a="http://schemas.openxmlformats.org/drawingml/2006/main" xmlns:pic="http://schemas.openxmlformats.org/drawingml/2006/picture" xmlns:a14="http://schemas.microsoft.com/office/drawing/2010/main" mc:Ignorable="w14 w15 w16se w16cid w16 w16cex w16sdtdh w16sdtfl w16du wp14">
   <w:body>
     <w:p>
       <w:pPr>
@@ -172,16 +172,23 @@
         <w:spacing w:before="300" w:after="100"/>
         <w:jc w:val="center"/>
         <w:rPr>
-          <w:b/>
-          <w:bCs/>
-        </w:rPr>
-      </w:pPr>
-      <w:r>
-        <w:rPr>
-          <w:b/>
-          <w:bCs/>
+          <w:b w:val="1"/>
+          <w:bCs w:val="1"/>
+        </w:rPr>
+      </w:pPr>
+      <w:r>
+        <w:rPr>
+          <w:b w:val="1"/>
+          <w:bCs w:val="1"/>
         </w:rPr>
         <w:t>Gonzalo Orellana</w:t>
+      </w:r>
+      <w:r>
+        <w:rPr>
+          <w:b w:val="1"/>
+          <w:bCs w:val="1"/>
+        </w:rPr>
+        <w:t>, 21.742.345-7, 202360556-5</w:t>
       </w:r>
     </w:p>
     <w:p>
@@ -295,6 +302,11 @@
       <w:pPr>
         <w:pStyle w:val="Normal"/>
       </w:pPr>
+    </w:p>
+    <w:p>
+      <w:pPr>
+        <w:pStyle w:val="Normal"/>
+      </w:pPr>
       <w:r>
         <w:rPr/>
         <w:t>Nombre: Ruta.</w:t>
@@ -458,6 +470,16 @@
       <w:pPr>
         <w:pStyle w:val="Normal"/>
         <w:ind w:left="0"/>
+        <w:rPr>
+          <w:b w:val="0"/>
+          <w:bCs w:val="0"/>
+        </w:rPr>
+      </w:pPr>
+    </w:p>
+    <w:p>
+      <w:pPr>
+        <w:pStyle w:val="Normal"/>
+        <w:ind w:left="0"/>
       </w:pPr>
       <w:r>
         <w:rPr>
@@ -630,6 +652,16 @@
       <w:pPr>
         <w:pStyle w:val="Normal"/>
         <w:ind w:left="0"/>
+        <w:rPr>
+          <w:b w:val="0"/>
+          <w:bCs w:val="0"/>
+        </w:rPr>
+      </w:pPr>
+    </w:p>
+    <w:p>
+      <w:pPr>
+        <w:pStyle w:val="Normal"/>
+        <w:ind w:left="0"/>
       </w:pPr>
       <w:r>
         <w:rPr>
@@ -787,6 +819,16 @@
         </w:rPr>
         <w:t>Impacto del problema</w:t>
       </w:r>
+    </w:p>
+    <w:p>
+      <w:pPr>
+        <w:pStyle w:val="Normal"/>
+        <w:ind w:left="0"/>
+        <w:rPr>
+          <w:b w:val="0"/>
+          <w:bCs w:val="0"/>
+        </w:rPr>
+      </w:pPr>
     </w:p>
     <w:p>
       <w:pPr>
@@ -1032,6 +1074,8 @@
         <w:pStyle w:val="Normal"/>
         <w:spacing w:before="240" w:beforeAutospacing="off" w:after="240" w:afterAutospacing="off"/>
         <w:ind w:left="0"/>
+      </w:pPr>
+      <w:r>
         <w:rPr>
           <w:rFonts w:ascii="Calibri" w:hAnsi="Calibri" w:eastAsia="Calibri" w:cs="Calibri"/>
           <w:b w:val="0"/>
@@ -1041,7 +1085,571 @@
           <w:szCs w:val="22"/>
           <w:lang w:val="es-419"/>
         </w:rPr>
-      </w:pPr>
+        <w:t xml:space="preserve">El objetivo del SIG </w:t>
+      </w:r>
+      <w:r>
+        <w:rPr>
+          <w:rFonts w:ascii="Calibri" w:hAnsi="Calibri" w:eastAsia="Calibri" w:cs="Calibri"/>
+          <w:b w:val="0"/>
+          <w:bCs w:val="0"/>
+          <w:noProof w:val="0"/>
+          <w:sz w:val="22"/>
+          <w:szCs w:val="22"/>
+          <w:lang w:val="es-419"/>
+        </w:rPr>
+        <w:t xml:space="preserve">propuesto es mejorar la </w:t>
+      </w:r>
+      <w:r>
+        <w:rPr>
+          <w:rFonts w:ascii="Calibri" w:hAnsi="Calibri" w:eastAsia="Calibri" w:cs="Calibri"/>
+          <w:b w:val="0"/>
+          <w:bCs w:val="0"/>
+          <w:noProof w:val="0"/>
+          <w:sz w:val="22"/>
+          <w:szCs w:val="22"/>
+          <w:lang w:val="es-419"/>
+        </w:rPr>
+        <w:t>gestión</w:t>
+      </w:r>
+      <w:r>
+        <w:rPr>
+          <w:rFonts w:ascii="Calibri" w:hAnsi="Calibri" w:eastAsia="Calibri" w:cs="Calibri"/>
+          <w:b w:val="0"/>
+          <w:bCs w:val="0"/>
+          <w:noProof w:val="0"/>
+          <w:sz w:val="22"/>
+          <w:szCs w:val="22"/>
+          <w:lang w:val="es-419"/>
+        </w:rPr>
+        <w:t xml:space="preserve"> y </w:t>
+      </w:r>
+      <w:r>
+        <w:rPr>
+          <w:rFonts w:ascii="Calibri" w:hAnsi="Calibri" w:eastAsia="Calibri" w:cs="Calibri"/>
+          <w:b w:val="0"/>
+          <w:bCs w:val="0"/>
+          <w:noProof w:val="0"/>
+          <w:sz w:val="22"/>
+          <w:szCs w:val="22"/>
+          <w:lang w:val="es-419"/>
+        </w:rPr>
+        <w:t xml:space="preserve">el seguimiento de los pedidos realizados </w:t>
+      </w:r>
+      <w:r>
+        <w:rPr>
+          <w:rFonts w:ascii="Calibri" w:hAnsi="Calibri" w:eastAsia="Calibri" w:cs="Calibri"/>
+          <w:b w:val="0"/>
+          <w:bCs w:val="0"/>
+          <w:noProof w:val="0"/>
+          <w:sz w:val="22"/>
+          <w:szCs w:val="22"/>
+          <w:lang w:val="es-419"/>
+        </w:rPr>
+        <w:t>mediante</w:t>
+      </w:r>
+      <w:r>
+        <w:rPr>
+          <w:rFonts w:ascii="Calibri" w:hAnsi="Calibri" w:eastAsia="Calibri" w:cs="Calibri"/>
+          <w:b w:val="0"/>
+          <w:bCs w:val="0"/>
+          <w:noProof w:val="0"/>
+          <w:sz w:val="22"/>
+          <w:szCs w:val="22"/>
+          <w:lang w:val="es-419"/>
+        </w:rPr>
+        <w:t xml:space="preserve"> la </w:t>
+      </w:r>
+      <w:r>
+        <w:rPr>
+          <w:rFonts w:ascii="Calibri" w:hAnsi="Calibri" w:eastAsia="Calibri" w:cs="Calibri"/>
+          <w:b w:val="0"/>
+          <w:bCs w:val="0"/>
+          <w:noProof w:val="0"/>
+          <w:sz w:val="22"/>
+          <w:szCs w:val="22"/>
+          <w:lang w:val="es-419"/>
+        </w:rPr>
+        <w:t>página</w:t>
+      </w:r>
+      <w:r>
+        <w:rPr>
+          <w:rFonts w:ascii="Calibri" w:hAnsi="Calibri" w:eastAsia="Calibri" w:cs="Calibri"/>
+          <w:b w:val="0"/>
+          <w:bCs w:val="0"/>
+          <w:noProof w:val="0"/>
+          <w:sz w:val="22"/>
+          <w:szCs w:val="22"/>
+          <w:lang w:val="es-419"/>
+        </w:rPr>
+        <w:t xml:space="preserve"> web de Ruta. La idea de es</w:t>
+      </w:r>
+      <w:r>
+        <w:rPr>
+          <w:rFonts w:ascii="Calibri" w:hAnsi="Calibri" w:eastAsia="Calibri" w:cs="Calibri"/>
+          <w:b w:val="0"/>
+          <w:bCs w:val="0"/>
+          <w:noProof w:val="0"/>
+          <w:sz w:val="22"/>
+          <w:szCs w:val="22"/>
+          <w:lang w:val="es-419"/>
+        </w:rPr>
+        <w:t xml:space="preserve">to es que el sistema le permita a Ruta registrar cada pedido, conocer en </w:t>
+      </w:r>
+      <w:r>
+        <w:rPr>
+          <w:rFonts w:ascii="Calibri" w:hAnsi="Calibri" w:eastAsia="Calibri" w:cs="Calibri"/>
+          <w:b w:val="0"/>
+          <w:bCs w:val="0"/>
+          <w:noProof w:val="0"/>
+          <w:sz w:val="22"/>
+          <w:szCs w:val="22"/>
+          <w:lang w:val="es-419"/>
+        </w:rPr>
+        <w:t>qué</w:t>
+      </w:r>
+      <w:r>
+        <w:rPr>
+          <w:rFonts w:ascii="Calibri" w:hAnsi="Calibri" w:eastAsia="Calibri" w:cs="Calibri"/>
+          <w:b w:val="0"/>
+          <w:bCs w:val="0"/>
+          <w:noProof w:val="0"/>
+          <w:sz w:val="22"/>
+          <w:szCs w:val="22"/>
+          <w:lang w:val="es-419"/>
+        </w:rPr>
+        <w:t xml:space="preserve"> estado se encuentra y saber </w:t>
+      </w:r>
+      <w:r>
+        <w:rPr>
+          <w:rFonts w:ascii="Calibri" w:hAnsi="Calibri" w:eastAsia="Calibri" w:cs="Calibri"/>
+          <w:b w:val="0"/>
+          <w:bCs w:val="0"/>
+          <w:noProof w:val="0"/>
+          <w:sz w:val="22"/>
+          <w:szCs w:val="22"/>
+          <w:lang w:val="es-419"/>
+        </w:rPr>
+        <w:t>cuánto</w:t>
+      </w:r>
+      <w:r>
+        <w:rPr>
+          <w:rFonts w:ascii="Calibri" w:hAnsi="Calibri" w:eastAsia="Calibri" w:cs="Calibri"/>
+          <w:b w:val="0"/>
+          <w:bCs w:val="0"/>
+          <w:noProof w:val="0"/>
+          <w:sz w:val="22"/>
+          <w:szCs w:val="22"/>
+          <w:lang w:val="es-419"/>
+        </w:rPr>
+        <w:t xml:space="preserve"> tiempo lleva pendiente</w:t>
+      </w:r>
+      <w:r>
+        <w:rPr>
+          <w:rFonts w:ascii="Calibri" w:hAnsi="Calibri" w:eastAsia="Calibri" w:cs="Calibri"/>
+          <w:b w:val="0"/>
+          <w:bCs w:val="0"/>
+          <w:noProof w:val="0"/>
+          <w:sz w:val="22"/>
+          <w:szCs w:val="22"/>
+          <w:lang w:val="es-419"/>
+        </w:rPr>
+        <w:t>.</w:t>
+      </w:r>
+    </w:p>
+    <w:p>
+      <w:pPr>
+        <w:pStyle w:val="Normal"/>
+        <w:spacing w:before="240" w:beforeAutospacing="off" w:after="240" w:afterAutospacing="off"/>
+        <w:ind w:left="0"/>
+        <w:rPr>
+          <w:rFonts w:ascii="Calibri" w:hAnsi="Calibri" w:eastAsia="Calibri" w:cs="Calibri"/>
+          <w:b w:val="0"/>
+          <w:bCs w:val="0"/>
+          <w:noProof w:val="0"/>
+          <w:sz w:val="22"/>
+          <w:szCs w:val="22"/>
+          <w:lang w:val="es-419"/>
+        </w:rPr>
+      </w:pPr>
+      <w:r>
+        <w:rPr>
+          <w:rFonts w:ascii="Calibri" w:hAnsi="Calibri" w:eastAsia="Calibri" w:cs="Calibri"/>
+          <w:b w:val="0"/>
+          <w:bCs w:val="0"/>
+          <w:noProof w:val="0"/>
+          <w:sz w:val="22"/>
+          <w:szCs w:val="22"/>
+          <w:lang w:val="es-419"/>
+        </w:rPr>
+        <w:t xml:space="preserve">Actualmente la </w:t>
+      </w:r>
+      <w:r>
+        <w:rPr>
+          <w:rFonts w:ascii="Calibri" w:hAnsi="Calibri" w:eastAsia="Calibri" w:cs="Calibri"/>
+          <w:b w:val="0"/>
+          <w:bCs w:val="0"/>
+          <w:noProof w:val="0"/>
+          <w:sz w:val="22"/>
+          <w:szCs w:val="22"/>
+          <w:lang w:val="es-419"/>
+        </w:rPr>
+        <w:t>preparación</w:t>
+      </w:r>
+      <w:r>
+        <w:rPr>
+          <w:rFonts w:ascii="Calibri" w:hAnsi="Calibri" w:eastAsia="Calibri" w:cs="Calibri"/>
+          <w:b w:val="0"/>
+          <w:bCs w:val="0"/>
+          <w:noProof w:val="0"/>
+          <w:sz w:val="22"/>
+          <w:szCs w:val="22"/>
+          <w:lang w:val="es-419"/>
+        </w:rPr>
+        <w:t xml:space="preserve"> de los pedidos y su entrega a la empresa de transporte demora </w:t>
+      </w:r>
+      <w:r>
+        <w:rPr>
+          <w:rFonts w:ascii="Calibri" w:hAnsi="Calibri" w:eastAsia="Calibri" w:cs="Calibri"/>
+          <w:b w:val="0"/>
+          <w:bCs w:val="0"/>
+          <w:noProof w:val="0"/>
+          <w:sz w:val="22"/>
+          <w:szCs w:val="22"/>
+          <w:lang w:val="es-419"/>
+        </w:rPr>
+        <w:t>aproximadamente</w:t>
+      </w:r>
+      <w:r>
+        <w:rPr>
+          <w:rFonts w:ascii="Calibri" w:hAnsi="Calibri" w:eastAsia="Calibri" w:cs="Calibri"/>
+          <w:b w:val="0"/>
+          <w:bCs w:val="0"/>
+          <w:noProof w:val="0"/>
+          <w:sz w:val="22"/>
+          <w:szCs w:val="22"/>
+          <w:lang w:val="es-419"/>
+        </w:rPr>
+        <w:t xml:space="preserve"> entre 5 y 7 </w:t>
+      </w:r>
+      <w:r>
+        <w:rPr>
+          <w:rFonts w:ascii="Calibri" w:hAnsi="Calibri" w:eastAsia="Calibri" w:cs="Calibri"/>
+          <w:b w:val="0"/>
+          <w:bCs w:val="0"/>
+          <w:noProof w:val="0"/>
+          <w:sz w:val="22"/>
+          <w:szCs w:val="22"/>
+          <w:lang w:val="es-419"/>
+        </w:rPr>
+        <w:t>días</w:t>
+      </w:r>
+      <w:r>
+        <w:rPr>
+          <w:rFonts w:ascii="Calibri" w:hAnsi="Calibri" w:eastAsia="Calibri" w:cs="Calibri"/>
+          <w:b w:val="0"/>
+          <w:bCs w:val="0"/>
+          <w:noProof w:val="0"/>
+          <w:sz w:val="22"/>
+          <w:szCs w:val="22"/>
+          <w:lang w:val="es-419"/>
+        </w:rPr>
+        <w:t xml:space="preserve">. Con este sistema se busca reducir ese tiempo y acercarlo a los 2 </w:t>
+      </w:r>
+      <w:r>
+        <w:rPr>
+          <w:rFonts w:ascii="Calibri" w:hAnsi="Calibri" w:eastAsia="Calibri" w:cs="Calibri"/>
+          <w:b w:val="0"/>
+          <w:bCs w:val="0"/>
+          <w:noProof w:val="0"/>
+          <w:sz w:val="22"/>
+          <w:szCs w:val="22"/>
+          <w:lang w:val="es-419"/>
+        </w:rPr>
+        <w:t>días</w:t>
+      </w:r>
+      <w:r>
+        <w:rPr>
+          <w:rFonts w:ascii="Calibri" w:hAnsi="Calibri" w:eastAsia="Calibri" w:cs="Calibri"/>
+          <w:b w:val="0"/>
+          <w:bCs w:val="0"/>
+          <w:noProof w:val="0"/>
+          <w:sz w:val="22"/>
+          <w:szCs w:val="22"/>
+          <w:lang w:val="es-419"/>
+        </w:rPr>
+        <w:t xml:space="preserve"> que </w:t>
+      </w:r>
+      <w:r>
+        <w:rPr>
+          <w:rFonts w:ascii="Calibri" w:hAnsi="Calibri" w:eastAsia="Calibri" w:cs="Calibri"/>
+          <w:b w:val="0"/>
+          <w:bCs w:val="0"/>
+          <w:noProof w:val="0"/>
+          <w:sz w:val="22"/>
+          <w:szCs w:val="22"/>
+          <w:lang w:val="es-419"/>
+        </w:rPr>
+        <w:t>aproximadamente</w:t>
+      </w:r>
+      <w:r>
+        <w:rPr>
+          <w:rFonts w:ascii="Calibri" w:hAnsi="Calibri" w:eastAsia="Calibri" w:cs="Calibri"/>
+          <w:b w:val="0"/>
+          <w:bCs w:val="0"/>
+          <w:noProof w:val="0"/>
+          <w:sz w:val="22"/>
+          <w:szCs w:val="22"/>
+          <w:lang w:val="es-419"/>
+        </w:rPr>
+        <w:t xml:space="preserve"> presentan otros c</w:t>
+      </w:r>
+      <w:r>
+        <w:rPr>
+          <w:rFonts w:ascii="Calibri" w:hAnsi="Calibri" w:eastAsia="Calibri" w:cs="Calibri"/>
+          <w:b w:val="0"/>
+          <w:bCs w:val="0"/>
+          <w:noProof w:val="0"/>
+          <w:sz w:val="22"/>
+          <w:szCs w:val="22"/>
+          <w:lang w:val="es-419"/>
+        </w:rPr>
+        <w:t>anales relacionados como supermercados y distribuidores.</w:t>
+      </w:r>
+    </w:p>
+    <w:p>
+      <w:pPr>
+        <w:pStyle w:val="Normal"/>
+        <w:spacing w:before="240" w:beforeAutospacing="off" w:after="240" w:afterAutospacing="off"/>
+        <w:ind w:left="0"/>
+      </w:pPr>
+      <w:r>
+        <w:rPr>
+          <w:rFonts w:ascii="Calibri" w:hAnsi="Calibri" w:eastAsia="Calibri" w:cs="Calibri"/>
+          <w:b w:val="0"/>
+          <w:bCs w:val="0"/>
+          <w:noProof w:val="0"/>
+          <w:sz w:val="22"/>
+          <w:szCs w:val="22"/>
+          <w:lang w:val="es-419"/>
+        </w:rPr>
+        <w:t xml:space="preserve">El sistema </w:t>
+      </w:r>
+      <w:r>
+        <w:rPr>
+          <w:rFonts w:ascii="Calibri" w:hAnsi="Calibri" w:eastAsia="Calibri" w:cs="Calibri"/>
+          <w:b w:val="0"/>
+          <w:bCs w:val="0"/>
+          <w:noProof w:val="0"/>
+          <w:sz w:val="22"/>
+          <w:szCs w:val="22"/>
+          <w:lang w:val="es-419"/>
+        </w:rPr>
+        <w:t>permitiría</w:t>
+      </w:r>
+      <w:r>
+        <w:rPr>
+          <w:rFonts w:ascii="Calibri" w:hAnsi="Calibri" w:eastAsia="Calibri" w:cs="Calibri"/>
+          <w:b w:val="0"/>
+          <w:bCs w:val="0"/>
+          <w:noProof w:val="0"/>
+          <w:sz w:val="22"/>
+          <w:szCs w:val="22"/>
+          <w:lang w:val="es-419"/>
+        </w:rPr>
+        <w:t xml:space="preserve"> tener toda la </w:t>
+      </w:r>
+      <w:r>
+        <w:rPr>
+          <w:rFonts w:ascii="Calibri" w:hAnsi="Calibri" w:eastAsia="Calibri" w:cs="Calibri"/>
+          <w:b w:val="0"/>
+          <w:bCs w:val="0"/>
+          <w:noProof w:val="0"/>
+          <w:sz w:val="22"/>
+          <w:szCs w:val="22"/>
+          <w:lang w:val="es-419"/>
+        </w:rPr>
+        <w:t>información</w:t>
+      </w:r>
+      <w:r>
+        <w:rPr>
+          <w:rFonts w:ascii="Calibri" w:hAnsi="Calibri" w:eastAsia="Calibri" w:cs="Calibri"/>
+          <w:b w:val="0"/>
+          <w:bCs w:val="0"/>
+          <w:noProof w:val="0"/>
+          <w:sz w:val="22"/>
+          <w:szCs w:val="22"/>
+          <w:lang w:val="es-419"/>
+        </w:rPr>
+        <w:t xml:space="preserve"> de los pedidos organizada, como la fecha en que se </w:t>
+      </w:r>
+      <w:r>
+        <w:rPr>
+          <w:rFonts w:ascii="Calibri" w:hAnsi="Calibri" w:eastAsia="Calibri" w:cs="Calibri"/>
+          <w:b w:val="0"/>
+          <w:bCs w:val="0"/>
+          <w:noProof w:val="0"/>
+          <w:sz w:val="22"/>
+          <w:szCs w:val="22"/>
+          <w:lang w:val="es-419"/>
+        </w:rPr>
+        <w:t>realizó</w:t>
+      </w:r>
+      <w:r>
+        <w:rPr>
+          <w:rFonts w:ascii="Calibri" w:hAnsi="Calibri" w:eastAsia="Calibri" w:cs="Calibri"/>
+          <w:b w:val="0"/>
+          <w:bCs w:val="0"/>
+          <w:noProof w:val="0"/>
+          <w:sz w:val="22"/>
+          <w:szCs w:val="22"/>
+          <w:lang w:val="es-419"/>
+        </w:rPr>
+        <w:t>, que o cuan</w:t>
+      </w:r>
+      <w:r>
+        <w:rPr>
+          <w:rFonts w:ascii="Calibri" w:hAnsi="Calibri" w:eastAsia="Calibri" w:cs="Calibri"/>
+          <w:b w:val="0"/>
+          <w:bCs w:val="0"/>
+          <w:noProof w:val="0"/>
+          <w:sz w:val="22"/>
+          <w:szCs w:val="22"/>
+          <w:lang w:val="es-419"/>
+        </w:rPr>
+        <w:t xml:space="preserve">tos productos se solicitaron, el cliente, y lo </w:t>
+      </w:r>
+      <w:r>
+        <w:rPr>
+          <w:rFonts w:ascii="Calibri" w:hAnsi="Calibri" w:eastAsia="Calibri" w:cs="Calibri"/>
+          <w:b w:val="0"/>
+          <w:bCs w:val="0"/>
+          <w:noProof w:val="0"/>
+          <w:sz w:val="22"/>
+          <w:szCs w:val="22"/>
+          <w:lang w:val="es-419"/>
+        </w:rPr>
+        <w:t>más</w:t>
+      </w:r>
+      <w:r>
+        <w:rPr>
+          <w:rFonts w:ascii="Calibri" w:hAnsi="Calibri" w:eastAsia="Calibri" w:cs="Calibri"/>
+          <w:b w:val="0"/>
+          <w:bCs w:val="0"/>
+          <w:noProof w:val="0"/>
+          <w:sz w:val="22"/>
+          <w:szCs w:val="22"/>
+          <w:lang w:val="es-419"/>
+        </w:rPr>
+        <w:t xml:space="preserve"> relevante para el objetivo </w:t>
+      </w:r>
+      <w:r>
+        <w:rPr>
+          <w:rFonts w:ascii="Calibri" w:hAnsi="Calibri" w:eastAsia="Calibri" w:cs="Calibri"/>
+          <w:b w:val="0"/>
+          <w:bCs w:val="0"/>
+          <w:noProof w:val="0"/>
+          <w:sz w:val="22"/>
+          <w:szCs w:val="22"/>
+          <w:lang w:val="es-419"/>
+        </w:rPr>
+        <w:t>planteado</w:t>
+      </w:r>
+      <w:r>
+        <w:rPr>
+          <w:rFonts w:ascii="Calibri" w:hAnsi="Calibri" w:eastAsia="Calibri" w:cs="Calibri"/>
+          <w:b w:val="0"/>
+          <w:bCs w:val="0"/>
+          <w:noProof w:val="0"/>
+          <w:sz w:val="22"/>
+          <w:szCs w:val="22"/>
+          <w:lang w:val="es-419"/>
+        </w:rPr>
+        <w:t>, s</w:t>
+      </w:r>
+      <w:r>
+        <w:rPr>
+          <w:rFonts w:ascii="Calibri" w:hAnsi="Calibri" w:eastAsia="Calibri" w:cs="Calibri"/>
+          <w:b w:val="0"/>
+          <w:bCs w:val="0"/>
+          <w:noProof w:val="0"/>
+          <w:sz w:val="22"/>
+          <w:szCs w:val="22"/>
+          <w:lang w:val="es-419"/>
+        </w:rPr>
+        <w:t xml:space="preserve">u </w:t>
+      </w:r>
+      <w:r>
+        <w:rPr>
+          <w:rFonts w:ascii="Calibri" w:hAnsi="Calibri" w:eastAsia="Calibri" w:cs="Calibri"/>
+          <w:b w:val="0"/>
+          <w:bCs w:val="0"/>
+          <w:noProof w:val="0"/>
+          <w:sz w:val="22"/>
+          <w:szCs w:val="22"/>
+          <w:lang w:val="es-419"/>
+        </w:rPr>
+        <w:t>situación</w:t>
+      </w:r>
+      <w:r>
+        <w:rPr>
+          <w:rFonts w:ascii="Calibri" w:hAnsi="Calibri" w:eastAsia="Calibri" w:cs="Calibri"/>
+          <w:b w:val="0"/>
+          <w:bCs w:val="0"/>
+          <w:noProof w:val="0"/>
+          <w:sz w:val="22"/>
+          <w:szCs w:val="22"/>
+          <w:lang w:val="es-419"/>
+        </w:rPr>
+        <w:t xml:space="preserve"> actual, si esta atrasado y cuantos </w:t>
+      </w:r>
+      <w:r>
+        <w:rPr>
+          <w:rFonts w:ascii="Calibri" w:hAnsi="Calibri" w:eastAsia="Calibri" w:cs="Calibri"/>
+          <w:b w:val="0"/>
+          <w:bCs w:val="0"/>
+          <w:noProof w:val="0"/>
+          <w:sz w:val="22"/>
+          <w:szCs w:val="22"/>
+          <w:lang w:val="es-419"/>
+        </w:rPr>
+        <w:t>días</w:t>
+      </w:r>
+      <w:r>
+        <w:rPr>
+          <w:rFonts w:ascii="Calibri" w:hAnsi="Calibri" w:eastAsia="Calibri" w:cs="Calibri"/>
+          <w:b w:val="0"/>
+          <w:bCs w:val="0"/>
+          <w:noProof w:val="0"/>
+          <w:sz w:val="22"/>
+          <w:szCs w:val="22"/>
+          <w:lang w:val="es-419"/>
+        </w:rPr>
+        <w:t xml:space="preserve"> de lo </w:t>
+      </w:r>
+      <w:r>
+        <w:rPr>
+          <w:rFonts w:ascii="Calibri" w:hAnsi="Calibri" w:eastAsia="Calibri" w:cs="Calibri"/>
+          <w:b w:val="0"/>
+          <w:bCs w:val="0"/>
+          <w:noProof w:val="0"/>
+          <w:sz w:val="22"/>
+          <w:szCs w:val="22"/>
+          <w:lang w:val="es-419"/>
+        </w:rPr>
+        <w:t>mismo. Además</w:t>
+      </w:r>
+      <w:r>
+        <w:rPr>
+          <w:rFonts w:ascii="Calibri" w:hAnsi="Calibri" w:eastAsia="Calibri" w:cs="Calibri"/>
+          <w:b w:val="0"/>
+          <w:bCs w:val="0"/>
+          <w:noProof w:val="0"/>
+          <w:sz w:val="22"/>
+          <w:szCs w:val="22"/>
+          <w:lang w:val="es-419"/>
+        </w:rPr>
+        <w:t xml:space="preserve"> de esto el sistema ayudaría a facilitar el trabajo del dueño, ya que podría identificar rápidamente los pedidos que han demorado más y deberían ser atendidos primeros, así no tendría que revisar manualmente cada pedido y se reducirían los tiempos en hacer esta tarea.</w:t>
+      </w:r>
     </w:p>
     <w:p>
       <w:pPr>
@@ -1881,8 +2489,2463 @@
           <w:b w:val="1"/>
           <w:bCs w:val="1"/>
         </w:rPr>
-        <w:t>Requisitos funcionales</w:t>
-      </w:r>
+        <w:t xml:space="preserve">Requisitos </w:t>
+      </w:r>
+      <w:r>
+        <w:rPr>
+          <w:b w:val="1"/>
+          <w:bCs w:val="1"/>
+        </w:rPr>
+        <w:t>del SIG</w:t>
+      </w:r>
+    </w:p>
+    <w:p>
+      <w:pPr>
+        <w:pStyle w:val="Normal"/>
+        <w:rPr>
+          <w:b w:val="1"/>
+          <w:bCs w:val="1"/>
+        </w:rPr>
+      </w:pPr>
+    </w:p>
+    <w:p>
+      <w:pPr>
+        <w:pStyle w:val="Normal"/>
+      </w:pPr>
+      <w:r>
+        <w:rPr>
+          <w:b w:val="1"/>
+          <w:bCs w:val="1"/>
+        </w:rPr>
+        <w:t>8.1 Requisitos funcionales</w:t>
+      </w:r>
+    </w:p>
+    <w:p>
+      <w:pPr>
+        <w:pStyle w:val="Normal"/>
+        <w:rPr>
+          <w:b w:val="0"/>
+          <w:bCs w:val="0"/>
+        </w:rPr>
+      </w:pPr>
+    </w:p>
+    <w:p>
+      <w:pPr>
+        <w:pStyle w:val="Normal"/>
+      </w:pPr>
+      <w:r>
+        <w:rPr>
+          <w:b w:val="0"/>
+          <w:bCs w:val="0"/>
+        </w:rPr>
+        <w:t xml:space="preserve">Los requisitos funcionales correspondes a ciertas funciones que </w:t>
+      </w:r>
+      <w:r>
+        <w:rPr>
+          <w:b w:val="0"/>
+          <w:bCs w:val="0"/>
+        </w:rPr>
+        <w:t>deberá</w:t>
+      </w:r>
+      <w:r>
+        <w:rPr>
+          <w:b w:val="0"/>
+          <w:bCs w:val="0"/>
+        </w:rPr>
+        <w:t xml:space="preserve"> cumplir el SIG para cumplir el </w:t>
+      </w:r>
+      <w:r>
+        <w:rPr>
+          <w:b w:val="0"/>
+          <w:bCs w:val="0"/>
+        </w:rPr>
+        <w:t>objetivo</w:t>
+      </w:r>
+      <w:r>
+        <w:rPr>
+          <w:b w:val="0"/>
+          <w:bCs w:val="0"/>
+        </w:rPr>
+        <w:t xml:space="preserve"> mencionado en el punto </w:t>
+      </w:r>
+      <w:r>
+        <w:rPr>
+          <w:b w:val="1"/>
+          <w:bCs w:val="1"/>
+        </w:rPr>
+        <w:t xml:space="preserve">5. </w:t>
+      </w:r>
+      <w:r>
+        <w:rPr>
+          <w:b w:val="0"/>
+          <w:bCs w:val="0"/>
+        </w:rPr>
+        <w:t xml:space="preserve">Para observar su prioridad se va a utilizar la </w:t>
+      </w:r>
+      <w:r>
+        <w:rPr>
+          <w:b w:val="0"/>
+          <w:bCs w:val="0"/>
+        </w:rPr>
+        <w:t>metodología</w:t>
+      </w:r>
+      <w:r>
+        <w:rPr>
+          <w:b w:val="0"/>
+          <w:bCs w:val="0"/>
+        </w:rPr>
+        <w:t xml:space="preserve"> MoSCoW, donde M(Must) se </w:t>
+      </w:r>
+      <w:r>
+        <w:rPr>
+          <w:b w:val="0"/>
+          <w:bCs w:val="0"/>
+        </w:rPr>
+        <w:t>usará</w:t>
+      </w:r>
+      <w:r>
+        <w:rPr>
+          <w:b w:val="0"/>
+          <w:bCs w:val="0"/>
+        </w:rPr>
+        <w:t xml:space="preserve"> para los requisitos </w:t>
+      </w:r>
+      <w:r>
+        <w:rPr>
+          <w:b w:val="0"/>
+          <w:bCs w:val="0"/>
+        </w:rPr>
+        <w:t>que,</w:t>
+      </w:r>
+      <w:r>
+        <w:rPr>
+          <w:b w:val="0"/>
+          <w:bCs w:val="0"/>
+        </w:rPr>
+        <w:t xml:space="preserve"> si o si d</w:t>
+      </w:r>
+      <w:r>
+        <w:rPr>
+          <w:b w:val="0"/>
+          <w:bCs w:val="0"/>
+        </w:rPr>
+        <w:t>eben estar, S(</w:t>
+      </w:r>
+      <w:r>
+        <w:rPr>
+          <w:b w:val="0"/>
+          <w:bCs w:val="0"/>
+        </w:rPr>
+        <w:t>should</w:t>
+      </w:r>
+      <w:r>
+        <w:rPr>
+          <w:b w:val="0"/>
+          <w:bCs w:val="0"/>
+        </w:rPr>
+        <w:t>) corresponde a</w:t>
+      </w:r>
+      <w:r>
+        <w:rPr>
+          <w:b w:val="0"/>
+          <w:bCs w:val="0"/>
+        </w:rPr>
+        <w:t xml:space="preserve"> requisitos importantes, C(</w:t>
+      </w:r>
+      <w:r>
+        <w:rPr>
+          <w:b w:val="0"/>
+          <w:bCs w:val="0"/>
+        </w:rPr>
+        <w:t>Could</w:t>
+      </w:r>
+      <w:r>
+        <w:rPr>
+          <w:b w:val="0"/>
+          <w:bCs w:val="0"/>
+        </w:rPr>
+        <w:t>) a requisi</w:t>
+      </w:r>
+      <w:r>
+        <w:rPr>
+          <w:b w:val="0"/>
+          <w:bCs w:val="0"/>
+        </w:rPr>
+        <w:t xml:space="preserve">tos que </w:t>
+      </w:r>
+      <w:r>
+        <w:rPr>
+          <w:b w:val="0"/>
+          <w:bCs w:val="0"/>
+        </w:rPr>
+        <w:t>podrían</w:t>
+      </w:r>
+      <w:r>
+        <w:rPr>
+          <w:b w:val="0"/>
+          <w:bCs w:val="0"/>
+        </w:rPr>
+        <w:t xml:space="preserve"> estar y aporta</w:t>
+      </w:r>
+      <w:r>
+        <w:rPr>
+          <w:b w:val="0"/>
+          <w:bCs w:val="0"/>
+        </w:rPr>
+        <w:t>r al sistema,</w:t>
+      </w:r>
+      <w:r>
+        <w:rPr>
+          <w:b w:val="0"/>
+          <w:bCs w:val="0"/>
+        </w:rPr>
+        <w:t xml:space="preserve"> y W(Won´t) a elementos que no </w:t>
+      </w:r>
+      <w:r>
+        <w:rPr>
+          <w:b w:val="0"/>
+          <w:bCs w:val="0"/>
+        </w:rPr>
+        <w:t>estarán</w:t>
+      </w:r>
+      <w:r>
+        <w:rPr>
+          <w:b w:val="0"/>
+          <w:bCs w:val="0"/>
+        </w:rPr>
+        <w:t xml:space="preserve"> por </w:t>
+      </w:r>
+      <w:r>
+        <w:rPr>
+          <w:b w:val="0"/>
+          <w:bCs w:val="0"/>
+        </w:rPr>
+        <w:t>distintas</w:t>
+      </w:r>
+      <w:r>
+        <w:rPr>
+          <w:b w:val="0"/>
+          <w:bCs w:val="0"/>
+        </w:rPr>
+        <w:t xml:space="preserve"> razones. Estos van en orden descendente, es decir, </w:t>
+      </w:r>
+      <w:r>
+        <w:rPr>
+          <w:b w:val="0"/>
+          <w:bCs w:val="0"/>
+        </w:rPr>
+        <w:t xml:space="preserve">M para los </w:t>
+      </w:r>
+      <w:r>
+        <w:rPr>
+          <w:b w:val="0"/>
+          <w:bCs w:val="0"/>
+        </w:rPr>
+        <w:t>más</w:t>
+      </w:r>
+      <w:r>
+        <w:rPr>
+          <w:b w:val="0"/>
+          <w:bCs w:val="0"/>
+        </w:rPr>
+        <w:t xml:space="preserve"> prioritarios, luego </w:t>
+      </w:r>
+      <w:r>
+        <w:rPr>
+          <w:b w:val="0"/>
+          <w:bCs w:val="0"/>
+        </w:rPr>
+        <w:t>S, C</w:t>
+      </w:r>
+      <w:r>
+        <w:rPr>
+          <w:b w:val="0"/>
+          <w:bCs w:val="0"/>
+        </w:rPr>
+        <w:t xml:space="preserve"> y finalmente W en orden de prioridad.</w:t>
+      </w:r>
+    </w:p>
+    <w:p>
+      <w:pPr>
+        <w:pStyle w:val="Normal"/>
+        <w:rPr>
+          <w:b w:val="0"/>
+          <w:bCs w:val="0"/>
+        </w:rPr>
+      </w:pPr>
+    </w:p>
+    <w:tbl>
+      <w:tblPr>
+        <w:tblStyle w:val="TableGrid"/>
+        <w:tblW w:w="0" w:type="auto"/>
+        <w:tblLook w:val="06A0" w:firstRow="1" w:lastRow="0" w:firstColumn="1" w:lastColumn="0" w:noHBand="1" w:noVBand="1"/>
+      </w:tblPr>
+      <w:tblGrid>
+        <w:gridCol w:w="1215"/>
+        <w:gridCol w:w="4395"/>
+        <w:gridCol w:w="1095"/>
+        <w:gridCol w:w="2835"/>
+      </w:tblGrid>
+      <w:tr>
+        <w:trPr>
+          <w:trHeight w:val="300"/>
+        </w:trPr>
+        <w:tc>
+          <w:tcPr>
+            <w:tcW w:w="1215" w:type="dxa"/>
+            <w:tcMar/>
+          </w:tcPr>
+          <w:p>
+            <w:pPr>
+              <w:pStyle w:val="Normal"/>
+            </w:pPr>
+            <w:r>
+              <w:rPr>
+                <w:b w:val="0"/>
+                <w:bCs w:val="0"/>
+              </w:rPr>
+              <w:t>Id (</w:t>
+            </w:r>
+            <w:r>
+              <w:rPr>
+                <w:b w:val="0"/>
+                <w:bCs w:val="0"/>
+              </w:rPr>
+              <w:t>RF-00)</w:t>
+            </w:r>
+          </w:p>
+        </w:tc>
+        <w:tc>
+          <w:tcPr>
+            <w:tcW w:w="4395" w:type="dxa"/>
+            <w:tcMar/>
+          </w:tcPr>
+          <w:p>
+            <w:pPr>
+              <w:pStyle w:val="Normal"/>
+            </w:pPr>
+            <w:r>
+              <w:rPr>
+                <w:b w:val="0"/>
+                <w:bCs w:val="0"/>
+              </w:rPr>
+              <w:t>Requisito funcional</w:t>
+            </w:r>
+          </w:p>
+        </w:tc>
+        <w:tc>
+          <w:tcPr>
+            <w:tcW w:w="1095" w:type="dxa"/>
+            <w:tcMar/>
+          </w:tcPr>
+          <w:p>
+            <w:pPr>
+              <w:pStyle w:val="Normal"/>
+            </w:pPr>
+            <w:r>
+              <w:rPr>
+                <w:b w:val="0"/>
+                <w:bCs w:val="0"/>
+              </w:rPr>
+              <w:t>Prioridad</w:t>
+            </w:r>
+          </w:p>
+        </w:tc>
+        <w:tc>
+          <w:tcPr>
+            <w:tcW w:w="2835" w:type="dxa"/>
+            <w:tcMar/>
+          </w:tcPr>
+          <w:p>
+            <w:pPr>
+              <w:pStyle w:val="Normal"/>
+            </w:pPr>
+            <w:r>
+              <w:rPr>
+                <w:b w:val="0"/>
+                <w:bCs w:val="0"/>
+              </w:rPr>
+              <w:t>Trazabilidad al problema</w:t>
+            </w:r>
+          </w:p>
+        </w:tc>
+      </w:tr>
+      <w:tr>
+        <w:trPr>
+          <w:trHeight w:val="300"/>
+        </w:trPr>
+        <w:tc>
+          <w:tcPr>
+            <w:tcW w:w="1215" w:type="dxa"/>
+            <w:tcMar/>
+          </w:tcPr>
+          <w:p>
+            <w:pPr>
+              <w:pStyle w:val="Normal"/>
+            </w:pPr>
+            <w:r>
+              <w:rPr>
+                <w:b w:val="0"/>
+                <w:bCs w:val="0"/>
+              </w:rPr>
+              <w:t>RF-01</w:t>
+            </w:r>
+          </w:p>
+        </w:tc>
+        <w:tc>
+          <w:tcPr>
+            <w:tcW w:w="4395" w:type="dxa"/>
+            <w:tcMar/>
+          </w:tcPr>
+          <w:p>
+            <w:pPr>
+              <w:pStyle w:val="Normal"/>
+            </w:pPr>
+            <w:r>
+              <w:rPr>
+                <w:b w:val="0"/>
+                <w:bCs w:val="0"/>
+              </w:rPr>
+              <w:t xml:space="preserve">El SIG tiene que permitir registrar los pedidos realizados por la </w:t>
+            </w:r>
+            <w:r>
+              <w:rPr>
+                <w:b w:val="0"/>
+                <w:bCs w:val="0"/>
+              </w:rPr>
+              <w:t>página</w:t>
+            </w:r>
+            <w:r>
+              <w:rPr>
+                <w:b w:val="0"/>
+                <w:bCs w:val="0"/>
+              </w:rPr>
+              <w:t xml:space="preserve"> web</w:t>
+            </w:r>
+            <w:r>
+              <w:rPr>
+                <w:b w:val="0"/>
+                <w:bCs w:val="0"/>
+              </w:rPr>
+              <w:t xml:space="preserve">, incluyendo los datos </w:t>
+            </w:r>
+            <w:r>
+              <w:rPr>
+                <w:b w:val="0"/>
+                <w:bCs w:val="0"/>
+              </w:rPr>
+              <w:t>esenciales</w:t>
+            </w:r>
+            <w:r>
+              <w:rPr>
+                <w:b w:val="0"/>
+                <w:bCs w:val="0"/>
+              </w:rPr>
+              <w:t xml:space="preserve"> del </w:t>
+            </w:r>
+            <w:r>
+              <w:rPr>
+                <w:b w:val="0"/>
+                <w:bCs w:val="0"/>
+              </w:rPr>
+              <w:t xml:space="preserve">mismo (fecha, cantidad, </w:t>
+            </w:r>
+            <w:r>
+              <w:rPr>
+                <w:b w:val="0"/>
+                <w:bCs w:val="0"/>
+              </w:rPr>
+              <w:t>etc.)</w:t>
+            </w:r>
+          </w:p>
+        </w:tc>
+        <w:tc>
+          <w:tcPr>
+            <w:tcW w:w="1095" w:type="dxa"/>
+            <w:tcMar/>
+          </w:tcPr>
+          <w:p>
+            <w:pPr>
+              <w:pStyle w:val="Normal"/>
+            </w:pPr>
+            <w:r>
+              <w:rPr>
+                <w:b w:val="0"/>
+                <w:bCs w:val="0"/>
+              </w:rPr>
+              <w:t>M</w:t>
+            </w:r>
+          </w:p>
+        </w:tc>
+        <w:tc>
+          <w:tcPr>
+            <w:tcW w:w="2835" w:type="dxa"/>
+            <w:tcMar/>
+          </w:tcPr>
+          <w:p>
+            <w:pPr>
+              <w:pStyle w:val="Normal"/>
+            </w:pPr>
+            <w:r>
+              <w:rPr>
+                <w:b w:val="0"/>
+                <w:bCs w:val="0"/>
+              </w:rPr>
+              <w:t>Permite tener los datos de cada pedido para organizarlos y facilitar el seguimiento.</w:t>
+            </w:r>
+          </w:p>
+        </w:tc>
+      </w:tr>
+      <w:tr>
+        <w:trPr>
+          <w:trHeight w:val="300"/>
+        </w:trPr>
+        <w:tc>
+          <w:tcPr>
+            <w:tcW w:w="1215" w:type="dxa"/>
+            <w:tcMar/>
+          </w:tcPr>
+          <w:p>
+            <w:pPr>
+              <w:pStyle w:val="Normal"/>
+            </w:pPr>
+            <w:r>
+              <w:rPr>
+                <w:b w:val="0"/>
+                <w:bCs w:val="0"/>
+              </w:rPr>
+              <w:t>RF-02</w:t>
+            </w:r>
+          </w:p>
+        </w:tc>
+        <w:tc>
+          <w:tcPr>
+            <w:tcW w:w="4395" w:type="dxa"/>
+            <w:tcMar/>
+          </w:tcPr>
+          <w:p>
+            <w:pPr>
+              <w:pStyle w:val="Normal"/>
+              <w:rPr>
+                <w:b w:val="0"/>
+                <w:bCs w:val="0"/>
+              </w:rPr>
+            </w:pPr>
+            <w:r>
+              <w:rPr>
+                <w:b w:val="0"/>
+                <w:bCs w:val="0"/>
+              </w:rPr>
+              <w:t>El SIG debe permitir actualizar el estado de cada uno de los pedidos, mostrando si esta entregado, pendi</w:t>
+            </w:r>
+            <w:r>
+              <w:rPr>
+                <w:b w:val="0"/>
+                <w:bCs w:val="0"/>
+              </w:rPr>
+              <w:t>ente, despechado, etc.</w:t>
+            </w:r>
+          </w:p>
+        </w:tc>
+        <w:tc>
+          <w:tcPr>
+            <w:tcW w:w="1095" w:type="dxa"/>
+            <w:tcMar/>
+          </w:tcPr>
+          <w:p>
+            <w:pPr>
+              <w:pStyle w:val="Normal"/>
+            </w:pPr>
+            <w:r>
+              <w:rPr>
+                <w:b w:val="0"/>
+                <w:bCs w:val="0"/>
+              </w:rPr>
+              <w:t>M</w:t>
+            </w:r>
+          </w:p>
+        </w:tc>
+        <w:tc>
+          <w:tcPr>
+            <w:tcW w:w="2835" w:type="dxa"/>
+            <w:tcMar/>
+          </w:tcPr>
+          <w:p>
+            <w:pPr>
+              <w:pStyle w:val="Normal"/>
+            </w:pPr>
+            <w:r>
+              <w:rPr>
+                <w:b w:val="0"/>
+                <w:bCs w:val="0"/>
+              </w:rPr>
+              <w:t xml:space="preserve">Logra identificar la etapa de los pedidos y ver cuales </w:t>
+            </w:r>
+            <w:r>
+              <w:rPr>
+                <w:b w:val="0"/>
+                <w:bCs w:val="0"/>
+              </w:rPr>
+              <w:t>están</w:t>
+            </w:r>
+            <w:r>
+              <w:rPr>
+                <w:b w:val="0"/>
+                <w:bCs w:val="0"/>
+              </w:rPr>
+              <w:t xml:space="preserve"> pendientes.</w:t>
+            </w:r>
+          </w:p>
+        </w:tc>
+      </w:tr>
+      <w:tr>
+        <w:trPr>
+          <w:trHeight w:val="300"/>
+        </w:trPr>
+        <w:tc>
+          <w:tcPr>
+            <w:tcW w:w="1215" w:type="dxa"/>
+            <w:tcMar/>
+          </w:tcPr>
+          <w:p>
+            <w:pPr>
+              <w:pStyle w:val="Normal"/>
+            </w:pPr>
+            <w:r>
+              <w:rPr>
+                <w:b w:val="0"/>
+                <w:bCs w:val="0"/>
+              </w:rPr>
+              <w:t>RF-03</w:t>
+            </w:r>
+          </w:p>
+        </w:tc>
+        <w:tc>
+          <w:tcPr>
+            <w:tcW w:w="4395" w:type="dxa"/>
+            <w:tcMar/>
+          </w:tcPr>
+          <w:p>
+            <w:pPr>
+              <w:pStyle w:val="Normal"/>
+            </w:pPr>
+            <w:r>
+              <w:rPr>
+                <w:b w:val="0"/>
+                <w:bCs w:val="0"/>
+              </w:rPr>
+              <w:t>El SIG tiene que calcular los días que lleva pendiente un pedido.</w:t>
+            </w:r>
+          </w:p>
+        </w:tc>
+        <w:tc>
+          <w:tcPr>
+            <w:tcW w:w="1095" w:type="dxa"/>
+            <w:tcMar/>
+          </w:tcPr>
+          <w:p>
+            <w:pPr>
+              <w:pStyle w:val="Normal"/>
+            </w:pPr>
+            <w:r>
+              <w:rPr>
+                <w:b w:val="0"/>
+                <w:bCs w:val="0"/>
+              </w:rPr>
+              <w:t>M</w:t>
+            </w:r>
+          </w:p>
+        </w:tc>
+        <w:tc>
+          <w:tcPr>
+            <w:tcW w:w="2835" w:type="dxa"/>
+            <w:tcMar/>
+          </w:tcPr>
+          <w:p>
+            <w:pPr>
+              <w:pStyle w:val="Normal"/>
+            </w:pPr>
+            <w:r>
+              <w:rPr>
+                <w:b w:val="0"/>
+                <w:bCs w:val="0"/>
+              </w:rPr>
+              <w:t>Permite organizar y conocer los tiempos de preparación y de despacho de cada pedido.</w:t>
+            </w:r>
+          </w:p>
+        </w:tc>
+      </w:tr>
+      <w:tr>
+        <w:trPr>
+          <w:trHeight w:val="300"/>
+        </w:trPr>
+        <w:tc>
+          <w:tcPr>
+            <w:tcW w:w="1215" w:type="dxa"/>
+            <w:tcMar/>
+          </w:tcPr>
+          <w:p>
+            <w:pPr>
+              <w:pStyle w:val="Normal"/>
+            </w:pPr>
+            <w:r>
+              <w:rPr>
+                <w:b w:val="0"/>
+                <w:bCs w:val="0"/>
+              </w:rPr>
+              <w:t>RF-04</w:t>
+            </w:r>
+          </w:p>
+        </w:tc>
+        <w:tc>
+          <w:tcPr>
+            <w:tcW w:w="4395" w:type="dxa"/>
+            <w:tcMar/>
+          </w:tcPr>
+          <w:p>
+            <w:pPr>
+              <w:pStyle w:val="Normal"/>
+              <w:rPr>
+                <w:b w:val="0"/>
+                <w:bCs w:val="0"/>
+              </w:rPr>
+            </w:pPr>
+            <w:r>
+              <w:rPr>
+                <w:b w:val="0"/>
+                <w:bCs w:val="0"/>
+              </w:rPr>
+              <w:t xml:space="preserve">El SIG debe identificar los pedidos que superen el tiempo </w:t>
+            </w:r>
+            <w:r>
+              <w:rPr>
+                <w:b w:val="0"/>
+                <w:bCs w:val="0"/>
+              </w:rPr>
+              <w:t xml:space="preserve">pensado entre </w:t>
+            </w:r>
+            <w:r>
+              <w:rPr>
+                <w:b w:val="0"/>
+                <w:bCs w:val="0"/>
+              </w:rPr>
+              <w:t>preparación</w:t>
+            </w:r>
+            <w:r>
+              <w:rPr>
+                <w:b w:val="0"/>
+                <w:bCs w:val="0"/>
+              </w:rPr>
+              <w:t xml:space="preserve"> y despacho</w:t>
+            </w:r>
+            <w:r>
+              <w:rPr>
+                <w:b w:val="0"/>
+                <w:bCs w:val="0"/>
+              </w:rPr>
+              <w:t>.</w:t>
+            </w:r>
+          </w:p>
+        </w:tc>
+        <w:tc>
+          <w:tcPr>
+            <w:tcW w:w="1095" w:type="dxa"/>
+            <w:tcMar/>
+          </w:tcPr>
+          <w:p>
+            <w:pPr>
+              <w:pStyle w:val="Normal"/>
+            </w:pPr>
+            <w:r>
+              <w:rPr>
+                <w:b w:val="0"/>
+                <w:bCs w:val="0"/>
+              </w:rPr>
+              <w:t>M</w:t>
+            </w:r>
+          </w:p>
+        </w:tc>
+        <w:tc>
+          <w:tcPr>
+            <w:tcW w:w="2835" w:type="dxa"/>
+            <w:tcMar/>
+          </w:tcPr>
+          <w:p>
+            <w:pPr>
+              <w:pStyle w:val="Normal"/>
+              <w:rPr>
+                <w:b w:val="0"/>
+                <w:bCs w:val="0"/>
+              </w:rPr>
+            </w:pPr>
+            <w:r>
+              <w:rPr>
+                <w:b w:val="0"/>
+                <w:bCs w:val="0"/>
+              </w:rPr>
+              <w:t>Permite saber cuáles son los pedidos que llevan más tiempo sin ser entregados para darles prioridad.</w:t>
+            </w:r>
+          </w:p>
+        </w:tc>
+      </w:tr>
+      <w:tr>
+        <w:trPr>
+          <w:trHeight w:val="300"/>
+        </w:trPr>
+        <w:tc>
+          <w:tcPr>
+            <w:tcW w:w="1215" w:type="dxa"/>
+            <w:tcMar/>
+          </w:tcPr>
+          <w:p>
+            <w:pPr>
+              <w:pStyle w:val="Normal"/>
+            </w:pPr>
+            <w:r>
+              <w:rPr>
+                <w:b w:val="0"/>
+                <w:bCs w:val="0"/>
+              </w:rPr>
+              <w:t>RF-05</w:t>
+            </w:r>
+          </w:p>
+        </w:tc>
+        <w:tc>
+          <w:tcPr>
+            <w:tcW w:w="4395" w:type="dxa"/>
+            <w:tcMar/>
+          </w:tcPr>
+          <w:p>
+            <w:pPr>
+              <w:pStyle w:val="Normal"/>
+            </w:pPr>
+            <w:r>
+              <w:rPr>
+                <w:b w:val="0"/>
+                <w:bCs w:val="0"/>
+              </w:rPr>
+              <w:t>El SIG tiene que lograr filtrar lo pedidos según el estado en el que se encuentren.</w:t>
+            </w:r>
+          </w:p>
+        </w:tc>
+        <w:tc>
+          <w:tcPr>
+            <w:tcW w:w="1095" w:type="dxa"/>
+            <w:tcMar/>
+          </w:tcPr>
+          <w:p>
+            <w:pPr>
+              <w:pStyle w:val="Normal"/>
+            </w:pPr>
+            <w:r>
+              <w:rPr>
+                <w:b w:val="0"/>
+                <w:bCs w:val="0"/>
+              </w:rPr>
+              <w:t>S</w:t>
+            </w:r>
+          </w:p>
+        </w:tc>
+        <w:tc>
+          <w:tcPr>
+            <w:tcW w:w="2835" w:type="dxa"/>
+            <w:tcMar/>
+          </w:tcPr>
+          <w:p>
+            <w:pPr>
+              <w:pStyle w:val="Normal"/>
+            </w:pPr>
+            <w:r>
+              <w:rPr>
+                <w:b w:val="0"/>
+                <w:bCs w:val="0"/>
+              </w:rPr>
+              <w:t xml:space="preserve">Facilita revisar los pedidos que necesitan </w:t>
+            </w:r>
+            <w:r>
+              <w:rPr>
+                <w:b w:val="0"/>
+                <w:bCs w:val="0"/>
+              </w:rPr>
+              <w:t>más</w:t>
+            </w:r>
+            <w:r>
+              <w:rPr>
+                <w:b w:val="0"/>
+                <w:bCs w:val="0"/>
+              </w:rPr>
+              <w:t xml:space="preserve"> urgencia.</w:t>
+            </w:r>
+          </w:p>
+        </w:tc>
+      </w:tr>
+      <w:tr>
+        <w:trPr>
+          <w:trHeight w:val="300"/>
+        </w:trPr>
+        <w:tc>
+          <w:tcPr>
+            <w:tcW w:w="1215" w:type="dxa"/>
+            <w:tcMar/>
+          </w:tcPr>
+          <w:p>
+            <w:pPr>
+              <w:pStyle w:val="Normal"/>
+            </w:pPr>
+            <w:r>
+              <w:rPr>
+                <w:b w:val="0"/>
+                <w:bCs w:val="0"/>
+              </w:rPr>
+              <w:t>RF-06</w:t>
+            </w:r>
+          </w:p>
+        </w:tc>
+        <w:tc>
+          <w:tcPr>
+            <w:tcW w:w="4395" w:type="dxa"/>
+            <w:tcMar/>
+          </w:tcPr>
+          <w:p>
+            <w:pPr>
+              <w:pStyle w:val="Normal"/>
+            </w:pPr>
+            <w:r>
+              <w:rPr>
+                <w:b w:val="0"/>
+                <w:bCs w:val="0"/>
+              </w:rPr>
+              <w:t xml:space="preserve">El SIG debe mostrar un </w:t>
+            </w:r>
+            <w:r>
+              <w:rPr>
+                <w:b w:val="0"/>
+                <w:bCs w:val="0"/>
+              </w:rPr>
+              <w:t>resumen</w:t>
+            </w:r>
+            <w:r>
+              <w:rPr>
+                <w:b w:val="0"/>
+                <w:bCs w:val="0"/>
+              </w:rPr>
+              <w:t xml:space="preserve"> de los pedidos, mostrando la cantidad de pedidos entregados, pendientes, etc.</w:t>
+            </w:r>
+          </w:p>
+        </w:tc>
+        <w:tc>
+          <w:tcPr>
+            <w:tcW w:w="1095" w:type="dxa"/>
+            <w:tcMar/>
+          </w:tcPr>
+          <w:p>
+            <w:pPr>
+              <w:pStyle w:val="Normal"/>
+            </w:pPr>
+            <w:r>
+              <w:rPr>
+                <w:b w:val="0"/>
+                <w:bCs w:val="0"/>
+              </w:rPr>
+              <w:t>S</w:t>
+            </w:r>
+          </w:p>
+        </w:tc>
+        <w:tc>
+          <w:tcPr>
+            <w:tcW w:w="2835" w:type="dxa"/>
+            <w:tcMar/>
+          </w:tcPr>
+          <w:p>
+            <w:pPr>
+              <w:pStyle w:val="Normal"/>
+            </w:pPr>
+            <w:r>
+              <w:rPr>
+                <w:b w:val="0"/>
+                <w:bCs w:val="0"/>
+              </w:rPr>
+              <w:t xml:space="preserve">Permite buscar los estados de </w:t>
+            </w:r>
+            <w:r>
+              <w:rPr>
+                <w:b w:val="0"/>
+                <w:bCs w:val="0"/>
+              </w:rPr>
+              <w:t>interés</w:t>
+            </w:r>
+            <w:r>
+              <w:rPr>
+                <w:b w:val="0"/>
+                <w:bCs w:val="0"/>
+              </w:rPr>
+              <w:t xml:space="preserve"> sin tener que buscarlos manualmente.</w:t>
+            </w:r>
+          </w:p>
+        </w:tc>
+      </w:tr>
+      <w:tr>
+        <w:trPr>
+          <w:trHeight w:val="300"/>
+        </w:trPr>
+        <w:tc>
+          <w:tcPr>
+            <w:tcW w:w="1215" w:type="dxa"/>
+            <w:tcMar/>
+          </w:tcPr>
+          <w:p>
+            <w:pPr>
+              <w:pStyle w:val="Normal"/>
+            </w:pPr>
+            <w:r>
+              <w:rPr>
+                <w:b w:val="0"/>
+                <w:bCs w:val="0"/>
+              </w:rPr>
+              <w:t>RF-07</w:t>
+            </w:r>
+          </w:p>
+        </w:tc>
+        <w:tc>
+          <w:tcPr>
+            <w:tcW w:w="4395" w:type="dxa"/>
+            <w:tcMar/>
+          </w:tcPr>
+          <w:p>
+            <w:pPr>
+              <w:pStyle w:val="Normal"/>
+            </w:pPr>
+            <w:r>
+              <w:rPr>
+                <w:b w:val="0"/>
+                <w:bCs w:val="0"/>
+              </w:rPr>
+              <w:t xml:space="preserve">El SIG puede generar un reporte con los pedidos y los tiempos de </w:t>
+            </w:r>
+            <w:r>
+              <w:rPr>
+                <w:b w:val="0"/>
+                <w:bCs w:val="0"/>
+              </w:rPr>
+              <w:t>estos</w:t>
+            </w:r>
+            <w:r>
+              <w:rPr>
+                <w:b w:val="0"/>
+                <w:bCs w:val="0"/>
+              </w:rPr>
+              <w:t xml:space="preserve"> en ser entregados.</w:t>
+            </w:r>
+          </w:p>
+        </w:tc>
+        <w:tc>
+          <w:tcPr>
+            <w:tcW w:w="1095" w:type="dxa"/>
+            <w:tcMar/>
+          </w:tcPr>
+          <w:p>
+            <w:pPr>
+              <w:pStyle w:val="Normal"/>
+            </w:pPr>
+            <w:r>
+              <w:rPr>
+                <w:b w:val="0"/>
+                <w:bCs w:val="0"/>
+              </w:rPr>
+              <w:t>C</w:t>
+            </w:r>
+          </w:p>
+        </w:tc>
+        <w:tc>
+          <w:tcPr>
+            <w:tcW w:w="2835" w:type="dxa"/>
+            <w:tcMar/>
+          </w:tcPr>
+          <w:p>
+            <w:pPr>
+              <w:pStyle w:val="Normal"/>
+              <w:rPr>
+                <w:b w:val="0"/>
+                <w:bCs w:val="0"/>
+              </w:rPr>
+            </w:pPr>
+            <w:r>
+              <w:rPr>
+                <w:b w:val="0"/>
+                <w:bCs w:val="0"/>
+              </w:rPr>
+              <w:t xml:space="preserve">Permite visualizar y comparar los tiempos </w:t>
+            </w:r>
+            <w:r>
+              <w:rPr>
+                <w:b w:val="0"/>
+                <w:bCs w:val="0"/>
+              </w:rPr>
+              <w:t>en relación con el</w:t>
+            </w:r>
+            <w:r>
+              <w:rPr>
+                <w:b w:val="0"/>
+                <w:bCs w:val="0"/>
+              </w:rPr>
+              <w:t xml:space="preserve"> </w:t>
+            </w:r>
+            <w:r>
+              <w:rPr>
+                <w:b w:val="0"/>
+                <w:bCs w:val="0"/>
+              </w:rPr>
+              <w:t xml:space="preserve">tiempo </w:t>
+            </w:r>
+            <w:r>
+              <w:rPr>
+                <w:b w:val="0"/>
+                <w:bCs w:val="0"/>
+              </w:rPr>
+              <w:t>objetivo.</w:t>
+            </w:r>
+          </w:p>
+        </w:tc>
+      </w:tr>
+      <w:tr>
+        <w:trPr>
+          <w:trHeight w:val="300"/>
+        </w:trPr>
+        <w:tc>
+          <w:tcPr>
+            <w:tcW w:w="1215" w:type="dxa"/>
+            <w:tcMar/>
+          </w:tcPr>
+          <w:p>
+            <w:pPr>
+              <w:pStyle w:val="Normal"/>
+            </w:pPr>
+            <w:r>
+              <w:rPr>
+                <w:b w:val="0"/>
+                <w:bCs w:val="0"/>
+              </w:rPr>
+              <w:t>RF-08</w:t>
+            </w:r>
+          </w:p>
+        </w:tc>
+        <w:tc>
+          <w:tcPr>
+            <w:tcW w:w="4395" w:type="dxa"/>
+            <w:tcMar/>
+          </w:tcPr>
+          <w:p>
+            <w:pPr>
+              <w:pStyle w:val="Normal"/>
+              <w:rPr>
+                <w:b w:val="0"/>
+                <w:bCs w:val="0"/>
+              </w:rPr>
+            </w:pPr>
+            <w:r>
+              <w:rPr>
+                <w:b w:val="0"/>
+                <w:bCs w:val="0"/>
+              </w:rPr>
+              <w:t xml:space="preserve">El SIG no </w:t>
+            </w:r>
+            <w:r>
+              <w:rPr>
+                <w:b w:val="0"/>
+                <w:bCs w:val="0"/>
+              </w:rPr>
+              <w:t>seguirá</w:t>
+            </w:r>
+            <w:r>
+              <w:rPr>
+                <w:b w:val="0"/>
+                <w:bCs w:val="0"/>
+              </w:rPr>
+              <w:t xml:space="preserve"> el estado del pedido una vez se despache, es decir, sea entregado a transporte.</w:t>
+            </w:r>
+          </w:p>
+        </w:tc>
+        <w:tc>
+          <w:tcPr>
+            <w:tcW w:w="1095" w:type="dxa"/>
+            <w:tcMar/>
+          </w:tcPr>
+          <w:p>
+            <w:pPr>
+              <w:pStyle w:val="Normal"/>
+            </w:pPr>
+            <w:r>
+              <w:rPr>
+                <w:b w:val="0"/>
+                <w:bCs w:val="0"/>
+              </w:rPr>
+              <w:t>W</w:t>
+            </w:r>
+          </w:p>
+        </w:tc>
+        <w:tc>
+          <w:tcPr>
+            <w:tcW w:w="2835" w:type="dxa"/>
+            <w:tcMar/>
+          </w:tcPr>
+          <w:p>
+            <w:pPr>
+              <w:pStyle w:val="Normal"/>
+            </w:pPr>
+            <w:r>
+              <w:rPr>
+                <w:b w:val="0"/>
+                <w:bCs w:val="0"/>
+              </w:rPr>
+              <w:t>Ayuda a que el sistema se enfoque en el problema identificado, que no tiene que ver con la entrega de la empresa.</w:t>
+            </w:r>
+          </w:p>
+        </w:tc>
+      </w:tr>
+    </w:tbl>
+    <w:p>
+      <w:pPr>
+        <w:pStyle w:val="Normal"/>
+        <w:rPr>
+          <w:b w:val="1"/>
+          <w:bCs w:val="1"/>
+        </w:rPr>
+      </w:pPr>
+    </w:p>
+    <w:p>
+      <w:pPr>
+        <w:pStyle w:val="Normal"/>
+        <w:rPr>
+          <w:b w:val="1"/>
+          <w:bCs w:val="1"/>
+        </w:rPr>
+      </w:pPr>
+    </w:p>
+    <w:p>
+      <w:pPr>
+        <w:pStyle w:val="Ttulo"/>
+        <w:rPr>
+          <w:sz w:val="32"/>
+          <w:szCs w:val="32"/>
+        </w:rPr>
+      </w:pPr>
+    </w:p>
+    <w:p>
+      <w:pPr>
+        <w:pStyle w:val="Ttulo"/>
+        <w:rPr>
+          <w:sz w:val="32"/>
+          <w:szCs w:val="32"/>
+        </w:rPr>
+      </w:pPr>
+    </w:p>
+    <w:p>
+      <w:pPr>
+        <w:pStyle w:val="Ttulo"/>
+        <w:rPr>
+          <w:sz w:val="32"/>
+          <w:szCs w:val="32"/>
+        </w:rPr>
+      </w:pPr>
+    </w:p>
+    <w:p>
+      <w:pPr>
+        <w:pStyle w:val="Ttulo"/>
+        <w:rPr>
+          <w:sz w:val="32"/>
+          <w:szCs w:val="32"/>
+        </w:rPr>
+      </w:pPr>
+    </w:p>
+    <w:p>
+      <w:pPr>
+        <w:pStyle w:val="Ttulo"/>
+        <w:rPr>
+          <w:sz w:val="32"/>
+          <w:szCs w:val="32"/>
+        </w:rPr>
+      </w:pPr>
+    </w:p>
+    <w:p>
+      <w:pPr>
+        <w:pStyle w:val="Ttulo"/>
+      </w:pPr>
+      <w:r>
+        <w:rPr>
+          <w:sz w:val="32"/>
+          <w:szCs w:val="32"/>
+        </w:rPr>
+        <w:t>D. Procesos BPMN</w:t>
+      </w:r>
+    </w:p>
+    <w:p>
+      <w:pPr>
+        <w:pStyle w:val="Ttulo"/>
+        <w:rPr>
+          <w:sz w:val="32"/>
+          <w:szCs w:val="32"/>
+        </w:rPr>
+      </w:pPr>
+    </w:p>
+    <w:p>
+      <w:pPr>
+        <w:pStyle w:val="Normal"/>
+      </w:pPr>
+      <w:r>
+        <w:rPr>
+          <w:b w:val="1"/>
+          <w:bCs w:val="1"/>
+        </w:rPr>
+        <w:t>BPMN AS-IS del Proceso crítico</w:t>
+      </w:r>
+    </w:p>
+    <w:p>
+      <w:pPr>
+        <w:pStyle w:val="Normal"/>
+        <w:rPr>
+          <w:b w:val="1"/>
+          <w:bCs w:val="1"/>
+        </w:rPr>
+      </w:pPr>
+      <w:r>
+        <w:drawing>
+          <wp:inline wp14:editId="32882E55" wp14:anchorId="6ABE7605">
+            <wp:extent cx="6057900" cy="2667000"/>
+            <wp:effectExtent l="0" t="0" r="0" b="0"/>
+            <wp:docPr id="2000107106" name="drawing"/>
+            <wp:cNvGraphicFramePr>
+              <a:graphicFrameLocks noChangeAspect="1"/>
+            </wp:cNvGraphicFramePr>
+            <a:graphic>
+              <a:graphicData xmlns:a="http://schemas.openxmlformats.org/drawingml/2006/main" uri="http://schemas.openxmlformats.org/drawingml/2006/picture">
+                <pic:pic xmlns:pic="http://schemas.openxmlformats.org/drawingml/2006/picture">
+                  <pic:nvPicPr>
+                    <pic:cNvPr id="2000107106" name="Picture 2000107106"/>
+                    <pic:cNvPicPr/>
+                  </pic:nvPicPr>
+                  <pic:blipFill>
+                    <a:blip xmlns:r="http://schemas.openxmlformats.org/officeDocument/2006/relationships" r:embed="rId1190927229">
+                      <a:extLst>
+                        <a:ext uri="{28A0092B-C50C-407E-A947-70E740481C1C}">
+                          <a14:useLocalDpi xmlns:a14="http://schemas.microsoft.com/office/drawing/2010/main"/>
+                        </a:ext>
+                      </a:extLst>
+                    </a:blip>
+                    <a:stretch>
+                      <a:fillRect/>
+                    </a:stretch>
+                  </pic:blipFill>
+                  <pic:spPr>
+                    <a:xfrm>
+                      <a:off x="0" y="0"/>
+                      <a:ext cx="6057900" cy="2667000"/>
+                    </a:xfrm>
+                    <a:prstGeom prst="rect">
+                      <a:avLst/>
+                    </a:prstGeom>
+                  </pic:spPr>
+                </pic:pic>
+              </a:graphicData>
+            </a:graphic>
+          </wp:inline>
+        </w:drawing>
+      </w:r>
+    </w:p>
+    <w:p>
+      <w:pPr>
+        <w:pStyle w:val="Normal"/>
+        <w:ind w:left="0"/>
+        <w:rPr>
+          <w:b w:val="1"/>
+          <w:bCs w:val="1"/>
+        </w:rPr>
+      </w:pPr>
+    </w:p>
+    <w:p>
+      <w:pPr>
+        <w:pStyle w:val="Normal"/>
+        <w:ind w:left="0"/>
+        <w:rPr>
+          <w:b w:val="1"/>
+          <w:bCs w:val="1"/>
+        </w:rPr>
+      </w:pPr>
+    </w:p>
+    <w:p>
+      <w:pPr>
+        <w:pStyle w:val="Normal"/>
+        <w:ind w:left="0"/>
+        <w:rPr>
+          <w:b w:val="1"/>
+          <w:bCs w:val="1"/>
+        </w:rPr>
+      </w:pPr>
+    </w:p>
+    <w:p>
+      <w:pPr>
+        <w:pStyle w:val="Normal"/>
+        <w:ind w:left="0"/>
+        <w:rPr>
+          <w:b w:val="1"/>
+          <w:bCs w:val="1"/>
+        </w:rPr>
+      </w:pPr>
+    </w:p>
+    <w:p>
+      <w:pPr>
+        <w:pStyle w:val="Normal"/>
+        <w:ind w:left="0"/>
+        <w:rPr>
+          <w:b w:val="1"/>
+          <w:bCs w:val="1"/>
+        </w:rPr>
+      </w:pPr>
+    </w:p>
+    <w:p>
+      <w:pPr>
+        <w:pStyle w:val="Normal"/>
+        <w:ind w:left="0"/>
+        <w:rPr>
+          <w:b w:val="1"/>
+          <w:bCs w:val="1"/>
+        </w:rPr>
+      </w:pPr>
+    </w:p>
+    <w:p>
+      <w:pPr>
+        <w:pStyle w:val="Normal"/>
+        <w:ind w:left="0"/>
+        <w:rPr>
+          <w:b w:val="1"/>
+          <w:bCs w:val="1"/>
+        </w:rPr>
+      </w:pPr>
+    </w:p>
+    <w:p>
+      <w:pPr>
+        <w:pStyle w:val="Normal"/>
+        <w:ind w:left="0"/>
+        <w:rPr>
+          <w:b w:val="1"/>
+          <w:bCs w:val="1"/>
+        </w:rPr>
+      </w:pPr>
+    </w:p>
+    <w:p>
+      <w:pPr>
+        <w:pStyle w:val="Normal"/>
+        <w:ind w:left="0"/>
+        <w:rPr>
+          <w:b w:val="1"/>
+          <w:bCs w:val="1"/>
+        </w:rPr>
+      </w:pPr>
+    </w:p>
+    <w:p>
+      <w:pPr>
+        <w:pStyle w:val="Normal"/>
+        <w:ind w:left="0"/>
+        <w:rPr>
+          <w:b w:val="1"/>
+          <w:bCs w:val="1"/>
+        </w:rPr>
+      </w:pPr>
+    </w:p>
+    <w:p>
+      <w:pPr>
+        <w:pStyle w:val="Normal"/>
+        <w:ind w:left="0"/>
+      </w:pPr>
+      <w:r>
+        <w:rPr>
+          <w:b w:val="1"/>
+          <w:bCs w:val="1"/>
+        </w:rPr>
+        <w:t xml:space="preserve">BPMN </w:t>
+      </w:r>
+      <w:r>
+        <w:rPr>
+          <w:b w:val="1"/>
+          <w:bCs w:val="1"/>
+        </w:rPr>
+        <w:t>to</w:t>
+      </w:r>
+      <w:r>
+        <w:rPr>
+          <w:b w:val="1"/>
+          <w:bCs w:val="1"/>
+        </w:rPr>
+        <w:t xml:space="preserve">-be con </w:t>
+      </w:r>
+      <w:r>
+        <w:rPr>
+          <w:b w:val="1"/>
+          <w:bCs w:val="1"/>
+        </w:rPr>
+        <w:t>intervención</w:t>
+      </w:r>
+      <w:r>
+        <w:rPr>
+          <w:b w:val="1"/>
+          <w:bCs w:val="1"/>
+        </w:rPr>
+        <w:t xml:space="preserve"> del SIG</w:t>
+      </w:r>
+    </w:p>
+    <w:p>
+      <w:pPr>
+        <w:pStyle w:val="Normal"/>
+        <w:ind w:left="0"/>
+        <w:rPr>
+          <w:b w:val="1"/>
+          <w:bCs w:val="1"/>
+        </w:rPr>
+      </w:pPr>
+      <w:r>
+        <w:drawing>
+          <wp:inline wp14:editId="1B749E1E" wp14:anchorId="0D2F0102">
+            <wp:extent cx="6057900" cy="2667000"/>
+            <wp:effectExtent l="0" t="0" r="0" b="0"/>
+            <wp:docPr id="594886252" name="drawing"/>
+            <wp:cNvGraphicFramePr>
+              <a:graphicFrameLocks noChangeAspect="1"/>
+            </wp:cNvGraphicFramePr>
+            <a:graphic>
+              <a:graphicData xmlns:a="http://schemas.openxmlformats.org/drawingml/2006/main" uri="http://schemas.openxmlformats.org/drawingml/2006/picture">
+                <pic:pic xmlns:pic="http://schemas.openxmlformats.org/drawingml/2006/picture">
+                  <pic:nvPicPr>
+                    <pic:cNvPr id="594886252" name="Picture 594886252"/>
+                    <pic:cNvPicPr/>
+                  </pic:nvPicPr>
+                  <pic:blipFill>
+                    <a:blip xmlns:r="http://schemas.openxmlformats.org/officeDocument/2006/relationships" r:embed="rId78039643">
+                      <a:extLst>
+                        <a:ext uri="{28A0092B-C50C-407E-A947-70E740481C1C}">
+                          <a14:useLocalDpi xmlns:a14="http://schemas.microsoft.com/office/drawing/2010/main"/>
+                        </a:ext>
+                      </a:extLst>
+                    </a:blip>
+                    <a:stretch>
+                      <a:fillRect/>
+                    </a:stretch>
+                  </pic:blipFill>
+                  <pic:spPr>
+                    <a:xfrm>
+                      <a:off x="0" y="0"/>
+                      <a:ext cx="6057900" cy="2667000"/>
+                    </a:xfrm>
+                    <a:prstGeom prst="rect">
+                      <a:avLst/>
+                    </a:prstGeom>
+                  </pic:spPr>
+                </pic:pic>
+              </a:graphicData>
+            </a:graphic>
+          </wp:inline>
+        </w:drawing>
+      </w:r>
+    </w:p>
+    <w:p>
+      <w:pPr>
+        <w:pStyle w:val="Normal"/>
+        <w:ind w:left="0"/>
+        <w:rPr>
+          <w:b w:val="1"/>
+          <w:bCs w:val="1"/>
+        </w:rPr>
+      </w:pPr>
+    </w:p>
+    <w:p>
+      <w:pPr>
+        <w:pStyle w:val="Normal"/>
+        <w:ind w:left="0"/>
+      </w:pPr>
+      <w:r>
+        <w:rPr>
+          <w:b w:val="1"/>
+          <w:bCs w:val="1"/>
+        </w:rPr>
+        <w:t>Tabla con breve explicación de las mejoras</w:t>
+      </w:r>
+    </w:p>
+    <w:p>
+      <w:pPr>
+        <w:pStyle w:val="Normal"/>
+        <w:ind w:left="0"/>
+        <w:rPr>
+          <w:b w:val="1"/>
+          <w:bCs w:val="1"/>
+        </w:rPr>
+      </w:pPr>
+    </w:p>
+    <w:tbl>
+      <w:tblPr>
+        <w:tblStyle w:val="TableGrid"/>
+        <w:tblW w:w="0" w:type="auto"/>
+        <w:tblLook w:val="06A0" w:firstRow="1" w:lastRow="0" w:firstColumn="1" w:lastColumn="0" w:noHBand="1" w:noVBand="1"/>
+      </w:tblPr>
+      <w:tblGrid>
+        <w:gridCol w:w="3180"/>
+        <w:gridCol w:w="3180"/>
+        <w:gridCol w:w="3180"/>
+      </w:tblGrid>
+      <w:tr>
+        <w:trPr>
+          <w:trHeight w:val="300"/>
+        </w:trPr>
+        <w:tc>
+          <w:tcPr>
+            <w:tcW w:w="3180" w:type="dxa"/>
+            <w:tcMar/>
+          </w:tcPr>
+          <w:p>
+            <w:pPr>
+              <w:pStyle w:val="Normal"/>
+            </w:pPr>
+            <w:r>
+              <w:rPr>
+                <w:b w:val="1"/>
+                <w:bCs w:val="1"/>
+              </w:rPr>
+              <w:t>Qué se automatiza</w:t>
+            </w:r>
+          </w:p>
+        </w:tc>
+        <w:tc>
+          <w:tcPr>
+            <w:tcW w:w="3180" w:type="dxa"/>
+            <w:tcMar/>
+          </w:tcPr>
+          <w:p>
+            <w:pPr>
+              <w:pStyle w:val="Normal"/>
+            </w:pPr>
+            <w:r>
+              <w:rPr>
+                <w:b w:val="1"/>
+                <w:bCs w:val="1"/>
+              </w:rPr>
+              <w:t>Qué se controla</w:t>
+            </w:r>
+          </w:p>
+        </w:tc>
+        <w:tc>
+          <w:tcPr>
+            <w:tcW w:w="3180" w:type="dxa"/>
+            <w:tcMar/>
+          </w:tcPr>
+          <w:p>
+            <w:pPr>
+              <w:pStyle w:val="Normal"/>
+            </w:pPr>
+            <w:r>
+              <w:rPr>
+                <w:b w:val="1"/>
+                <w:bCs w:val="1"/>
+              </w:rPr>
+              <w:t>Qué se mide</w:t>
+            </w:r>
+          </w:p>
+        </w:tc>
+      </w:tr>
+      <w:tr>
+        <w:trPr>
+          <w:trHeight w:val="300"/>
+        </w:trPr>
+        <w:tc>
+          <w:tcPr>
+            <w:tcW w:w="3180" w:type="dxa"/>
+            <w:tcMar/>
+          </w:tcPr>
+          <w:p>
+            <w:pPr>
+              <w:pStyle w:val="Prrafodelista"/>
+              <w:numPr>
+                <w:ilvl w:val="0"/>
+                <w:numId w:val="11"/>
+              </w:numPr>
+              <w:jc w:val="both"/>
+              <w:rPr/>
+            </w:pPr>
+            <w:r>
+              <w:rPr>
+                <w:b w:val="0"/>
+                <w:bCs w:val="0"/>
+              </w:rPr>
+              <w:t xml:space="preserve">Ingesta de datos: Captura e ingreso automático del pedido desde la tienda web a la base de datos central </w:t>
+            </w:r>
+          </w:p>
+        </w:tc>
+        <w:tc>
+          <w:tcPr>
+            <w:tcW w:w="3180" w:type="dxa"/>
+            <w:tcMar/>
+          </w:tcPr>
+          <w:p>
+            <w:pPr>
+              <w:pStyle w:val="Prrafodelista"/>
+              <w:numPr>
+                <w:ilvl w:val="0"/>
+                <w:numId w:val="11"/>
+              </w:numPr>
+              <w:jc w:val="both"/>
+              <w:rPr/>
+            </w:pPr>
+            <w:r>
+              <w:rPr>
+                <w:b w:val="0"/>
+                <w:bCs w:val="0"/>
+              </w:rPr>
+              <w:t>Visibilidad de pedidos en riesgo: Identificación visual rápida (semáforo de alerta) de órdenes próximas a vencer su plazo de preparación</w:t>
+            </w:r>
+          </w:p>
+        </w:tc>
+        <w:tc>
+          <w:tcPr>
+            <w:tcW w:w="3180" w:type="dxa"/>
+            <w:tcMar/>
+          </w:tcPr>
+          <w:p>
+            <w:pPr>
+              <w:pStyle w:val="Prrafodelista"/>
+              <w:numPr>
+                <w:ilvl w:val="0"/>
+                <w:numId w:val="11"/>
+              </w:numPr>
+              <w:jc w:val="both"/>
+              <w:rPr/>
+            </w:pPr>
+            <w:r>
+              <w:rPr>
+                <w:b w:val="0"/>
+                <w:bCs w:val="0"/>
+              </w:rPr>
+              <w:t>Tiempo de Ciclo Interno (KPI Operacional): Medición de las horas transcurridas desde la entrada del pedido hasta su entrega a la empresa de transporte (Meta: 2 días)</w:t>
+            </w:r>
+          </w:p>
+        </w:tc>
+      </w:tr>
+      <w:tr>
+        <w:trPr>
+          <w:trHeight w:val="300"/>
+        </w:trPr>
+        <w:tc>
+          <w:tcPr>
+            <w:tcW w:w="3180" w:type="dxa"/>
+            <w:tcMar/>
+          </w:tcPr>
+          <w:p>
+            <w:pPr>
+              <w:pStyle w:val="Prrafodelista"/>
+              <w:numPr>
+                <w:ilvl w:val="0"/>
+                <w:numId w:val="11"/>
+              </w:numPr>
+              <w:jc w:val="both"/>
+              <w:rPr/>
+            </w:pPr>
+            <w:r>
+              <w:rPr>
+                <w:b w:val="0"/>
+                <w:bCs w:val="0"/>
+              </w:rPr>
+              <w:t xml:space="preserve">Priorización de la cola: Clasificación automática de los pedidos, según su </w:t>
+            </w:r>
+            <w:r>
+              <w:rPr>
+                <w:b w:val="0"/>
+                <w:bCs w:val="0"/>
+              </w:rPr>
+              <w:t>antiguedad</w:t>
+            </w:r>
+          </w:p>
+        </w:tc>
+        <w:tc>
+          <w:tcPr>
+            <w:tcW w:w="3180" w:type="dxa"/>
+            <w:tcMar/>
+          </w:tcPr>
+          <w:p>
+            <w:pPr>
+              <w:pStyle w:val="Prrafodelista"/>
+              <w:numPr>
+                <w:ilvl w:val="0"/>
+                <w:numId w:val="11"/>
+              </w:numPr>
+              <w:jc w:val="both"/>
+              <w:rPr/>
+            </w:pPr>
+            <w:r>
+              <w:rPr>
+                <w:b w:val="0"/>
+                <w:bCs w:val="0"/>
+              </w:rPr>
+              <w:t>Integridad de la información: Erradicación de pedidos extraviados, traspasados con errores o postergados en planillas manuales</w:t>
+            </w:r>
+          </w:p>
+        </w:tc>
+        <w:tc>
+          <w:tcPr>
+            <w:tcW w:w="3180" w:type="dxa"/>
+            <w:tcMar/>
+          </w:tcPr>
+          <w:p>
+            <w:pPr>
+              <w:pStyle w:val="Prrafodelista"/>
+              <w:numPr>
+                <w:ilvl w:val="0"/>
+                <w:numId w:val="11"/>
+              </w:numPr>
+              <w:jc w:val="both"/>
+              <w:rPr>
+                <w:b w:val="0"/>
+                <w:bCs w:val="0"/>
+              </w:rPr>
+            </w:pPr>
+          </w:p>
+        </w:tc>
+      </w:tr>
+      <w:tr>
+        <w:trPr>
+          <w:trHeight w:val="1362"/>
+        </w:trPr>
+        <w:tc>
+          <w:tcPr>
+            <w:tcW w:w="3180" w:type="dxa"/>
+            <w:tcMar/>
+          </w:tcPr>
+          <w:p>
+            <w:pPr>
+              <w:pStyle w:val="Prrafodelista"/>
+              <w:numPr>
+                <w:ilvl w:val="0"/>
+                <w:numId w:val="11"/>
+              </w:numPr>
+              <w:jc w:val="both"/>
+              <w:rPr>
+                <w:b w:val="0"/>
+                <w:bCs w:val="0"/>
+              </w:rPr>
+            </w:pPr>
+            <w:r>
+              <w:rPr>
+                <w:b w:val="0"/>
+                <w:bCs w:val="0"/>
+              </w:rPr>
+              <w:t>Notificaciones y Alertas: Disparo de recordatorios automáticos al dueño cuando una orden excede las 24 horas en estado "Pendiente"</w:t>
+            </w:r>
+          </w:p>
+        </w:tc>
+        <w:tc>
+          <w:tcPr>
+            <w:tcW w:w="3180" w:type="dxa"/>
+            <w:tcMar/>
+          </w:tcPr>
+          <w:p>
+            <w:pPr>
+              <w:pStyle w:val="Prrafodelista"/>
+              <w:numPr>
+                <w:ilvl w:val="0"/>
+                <w:numId w:val="11"/>
+              </w:numPr>
+              <w:jc w:val="both"/>
+              <w:rPr>
+                <w:b w:val="0"/>
+                <w:bCs w:val="0"/>
+              </w:rPr>
+            </w:pPr>
+            <w:r>
+              <w:rPr>
+                <w:b w:val="0"/>
+                <w:bCs w:val="0"/>
+              </w:rPr>
+              <w:t>Estandarización del flujo: Control estricto del cambio de estados</w:t>
+            </w:r>
+            <w:r>
+              <w:rPr>
+                <w:b w:val="0"/>
+                <w:bCs w:val="0"/>
+              </w:rPr>
+              <w:t>.</w:t>
+            </w:r>
+          </w:p>
+          <w:p>
+            <w:pPr>
+              <w:pStyle w:val="Normal"/>
+              <w:ind w:left="0"/>
+              <w:jc w:val="both"/>
+              <w:rPr>
+                <w:b w:val="0"/>
+                <w:bCs w:val="0"/>
+              </w:rPr>
+            </w:pPr>
+          </w:p>
+        </w:tc>
+        <w:tc>
+          <w:tcPr>
+            <w:tcW w:w="3180" w:type="dxa"/>
+            <w:tcMar/>
+          </w:tcPr>
+          <w:p>
+            <w:pPr>
+              <w:pStyle w:val="Prrafodelista"/>
+              <w:numPr>
+                <w:ilvl w:val="0"/>
+                <w:numId w:val="11"/>
+              </w:numPr>
+              <w:rPr>
+                <w:b w:val="1"/>
+                <w:bCs w:val="1"/>
+              </w:rPr>
+            </w:pPr>
+          </w:p>
+        </w:tc>
+      </w:tr>
+    </w:tbl>
+    <w:p>
+      <w:pPr>
+        <w:pStyle w:val="Normal"/>
+        <w:ind w:left="0"/>
+        <w:rPr>
+          <w:b w:val="0"/>
+          <w:bCs w:val="0"/>
+        </w:rPr>
+      </w:pPr>
+    </w:p>
+    <w:p>
+      <w:pPr>
+        <w:pStyle w:val="Normal"/>
+        <w:ind w:left="0"/>
+        <w:rPr>
+          <w:b w:val="0"/>
+          <w:bCs w:val="0"/>
+        </w:rPr>
+      </w:pPr>
+    </w:p>
+    <w:p>
+      <w:pPr>
+        <w:pStyle w:val="Normal"/>
+        <w:ind w:left="0"/>
+        <w:rPr>
+          <w:b w:val="0"/>
+          <w:bCs w:val="0"/>
+        </w:rPr>
+      </w:pPr>
+    </w:p>
+    <w:p>
+      <w:pPr>
+        <w:pStyle w:val="Ttulo"/>
+      </w:pPr>
+      <w:r>
+        <w:rPr>
+          <w:sz w:val="32"/>
+          <w:szCs w:val="32"/>
+        </w:rPr>
+        <w:t>E. Modelo de datos Preliminar</w:t>
+      </w:r>
+    </w:p>
+    <w:p>
+      <w:pPr>
+        <w:pStyle w:val="Ttulo"/>
+        <w:rPr>
+          <w:sz w:val="32"/>
+          <w:szCs w:val="32"/>
+        </w:rPr>
+      </w:pPr>
+    </w:p>
+    <w:p>
+      <w:pPr>
+        <w:pStyle w:val="Ttulo"/>
+        <w:rPr>
+          <w:sz w:val="32"/>
+          <w:szCs w:val="32"/>
+        </w:rPr>
+      </w:pPr>
+    </w:p>
+    <w:p>
+      <w:pPr>
+        <w:pStyle w:val="Ttulo"/>
+        <w:rPr>
+          <w:sz w:val="32"/>
+          <w:szCs w:val="32"/>
+        </w:rPr>
+      </w:pPr>
+    </w:p>
+    <w:p>
+      <w:pPr>
+        <w:pStyle w:val="Ttulo"/>
+        <w:rPr>
+          <w:sz w:val="32"/>
+          <w:szCs w:val="32"/>
+        </w:rPr>
+      </w:pPr>
+    </w:p>
+    <w:p>
+      <w:pPr>
+        <w:pStyle w:val="Ttulo"/>
+        <w:rPr>
+          <w:sz w:val="32"/>
+          <w:szCs w:val="32"/>
+        </w:rPr>
+      </w:pPr>
+    </w:p>
+    <w:p>
+      <w:pPr>
+        <w:pStyle w:val="Ttulo"/>
+        <w:rPr>
+          <w:sz w:val="32"/>
+          <w:szCs w:val="32"/>
+        </w:rPr>
+      </w:pPr>
+    </w:p>
+    <w:p>
+      <w:pPr>
+        <w:pStyle w:val="Ttulo"/>
+        <w:rPr>
+          <w:sz w:val="32"/>
+          <w:szCs w:val="32"/>
+        </w:rPr>
+      </w:pPr>
+    </w:p>
+    <w:p>
+      <w:pPr>
+        <w:pStyle w:val="Ttulo"/>
+        <w:rPr>
+          <w:sz w:val="32"/>
+          <w:szCs w:val="32"/>
+        </w:rPr>
+      </w:pPr>
+    </w:p>
+    <w:p>
+      <w:pPr>
+        <w:pStyle w:val="Ttulo"/>
+        <w:rPr>
+          <w:sz w:val="32"/>
+          <w:szCs w:val="32"/>
+        </w:rPr>
+      </w:pPr>
+    </w:p>
+    <w:p>
+      <w:pPr>
+        <w:pStyle w:val="Ttulo"/>
+        <w:rPr>
+          <w:sz w:val="32"/>
+          <w:szCs w:val="32"/>
+        </w:rPr>
+      </w:pPr>
+    </w:p>
+    <w:p>
+      <w:pPr>
+        <w:pStyle w:val="Ttulo"/>
+        <w:rPr>
+          <w:sz w:val="32"/>
+          <w:szCs w:val="32"/>
+        </w:rPr>
+      </w:pPr>
+    </w:p>
+    <w:p>
+      <w:pPr>
+        <w:pStyle w:val="Ttulo"/>
+        <w:rPr>
+          <w:sz w:val="32"/>
+          <w:szCs w:val="32"/>
+        </w:rPr>
+      </w:pPr>
+      <w:r>
+        <w:rPr>
+          <w:sz w:val="32"/>
+          <w:szCs w:val="32"/>
+        </w:rPr>
+        <w:t xml:space="preserve">F. Arquitectura lógica y </w:t>
+      </w:r>
+      <w:r>
+        <w:rPr>
+          <w:sz w:val="32"/>
+          <w:szCs w:val="32"/>
+        </w:rPr>
+        <w:t>stack</w:t>
+      </w:r>
+      <w:r>
+        <w:rPr>
+          <w:sz w:val="32"/>
+          <w:szCs w:val="32"/>
+        </w:rPr>
+        <w:t xml:space="preserve"> tentativo</w:t>
+      </w:r>
+    </w:p>
+    <w:p>
+      <w:pPr>
+        <w:pStyle w:val="Normal"/>
+        <w:rPr>
+          <w:sz w:val="32"/>
+          <w:szCs w:val="32"/>
+        </w:rPr>
+      </w:pPr>
+    </w:p>
+    <w:p>
+      <w:pPr>
+        <w:pStyle w:val="Ttulo"/>
+        <w:rPr>
+          <w:sz w:val="32"/>
+          <w:szCs w:val="32"/>
+        </w:rPr>
+      </w:pPr>
+    </w:p>
+    <w:p>
+      <w:pPr>
+        <w:pStyle w:val="Normal"/>
+        <w:ind w:left="0"/>
+        <w:rPr>
+          <w:b w:val="0"/>
+          <w:bCs w:val="0"/>
+        </w:rPr>
+      </w:pPr>
+    </w:p>
+    <w:p>
+      <w:pPr>
+        <w:pStyle w:val="Normal"/>
+        <w:ind w:left="0"/>
+        <w:rPr>
+          <w:b w:val="0"/>
+          <w:bCs w:val="0"/>
+        </w:rPr>
+      </w:pPr>
+    </w:p>
+    <w:p>
+      <w:pPr>
+        <w:pStyle w:val="Normal"/>
+        <w:ind w:left="0"/>
+        <w:rPr>
+          <w:b w:val="0"/>
+          <w:bCs w:val="0"/>
+        </w:rPr>
+      </w:pPr>
+    </w:p>
+    <w:p>
+      <w:pPr>
+        <w:pStyle w:val="Normal"/>
+        <w:ind w:left="0"/>
+        <w:rPr>
+          <w:b w:val="0"/>
+          <w:bCs w:val="0"/>
+        </w:rPr>
+      </w:pPr>
+    </w:p>
+    <w:p>
+      <w:pPr>
+        <w:pStyle w:val="Normal"/>
+        <w:ind w:left="0"/>
+        <w:rPr>
+          <w:b w:val="0"/>
+          <w:bCs w:val="0"/>
+        </w:rPr>
+      </w:pPr>
+    </w:p>
+    <w:p>
+      <w:pPr>
+        <w:pStyle w:val="Normal"/>
+        <w:ind w:left="0"/>
+        <w:rPr>
+          <w:b w:val="0"/>
+          <w:bCs w:val="0"/>
+        </w:rPr>
+      </w:pPr>
+    </w:p>
+    <w:p>
+      <w:pPr>
+        <w:pStyle w:val="Normal"/>
+        <w:ind w:left="0"/>
+        <w:rPr>
+          <w:b w:val="0"/>
+          <w:bCs w:val="0"/>
+        </w:rPr>
+      </w:pPr>
+    </w:p>
+    <w:p>
+      <w:pPr>
+        <w:pStyle w:val="Normal"/>
+        <w:ind w:left="0"/>
+        <w:rPr>
+          <w:b w:val="0"/>
+          <w:bCs w:val="0"/>
+        </w:rPr>
+      </w:pPr>
+    </w:p>
+    <w:p>
+      <w:pPr>
+        <w:pStyle w:val="Normal"/>
+        <w:ind w:left="0"/>
+        <w:rPr>
+          <w:b w:val="0"/>
+          <w:bCs w:val="0"/>
+        </w:rPr>
+      </w:pPr>
+    </w:p>
+    <w:p>
+      <w:pPr>
+        <w:pStyle w:val="Normal"/>
+        <w:ind w:left="0"/>
+        <w:rPr>
+          <w:b w:val="0"/>
+          <w:bCs w:val="0"/>
+        </w:rPr>
+      </w:pPr>
+    </w:p>
+    <w:p>
+      <w:pPr>
+        <w:pStyle w:val="Ttulo"/>
+        <w:rPr>
+          <w:sz w:val="32"/>
+          <w:szCs w:val="32"/>
+        </w:rPr>
+      </w:pPr>
+      <w:r>
+        <w:rPr>
+          <w:sz w:val="32"/>
+          <w:szCs w:val="32"/>
+        </w:rPr>
+        <w:t>G. Plan de Entrega y 2 riesgos</w:t>
+      </w:r>
+    </w:p>
+    <w:p>
+      <w:pPr>
+        <w:pStyle w:val="Normal"/>
+        <w:ind w:left="0"/>
+        <w:rPr>
+          <w:b w:val="0"/>
+          <w:bCs w:val="0"/>
+        </w:rPr>
+      </w:pPr>
+    </w:p>
+    <w:p>
+      <w:pPr>
+        <w:pStyle w:val="Normal"/>
+        <w:ind w:left="0"/>
+        <w:rPr>
+          <w:b w:val="0"/>
+          <w:bCs w:val="0"/>
+        </w:rPr>
+      </w:pPr>
+    </w:p>
+    <w:p>
+      <w:pPr>
+        <w:pStyle w:val="Normal"/>
+        <w:ind w:left="0"/>
+        <w:rPr>
+          <w:b w:val="0"/>
+          <w:bCs w:val="0"/>
+        </w:rPr>
+      </w:pPr>
+    </w:p>
+    <w:p>
+      <w:pPr>
+        <w:pStyle w:val="Normal"/>
+        <w:ind w:left="0"/>
+        <w:rPr>
+          <w:b w:val="0"/>
+          <w:bCs w:val="0"/>
+        </w:rPr>
+      </w:pPr>
+    </w:p>
+    <w:p>
+      <w:pPr>
+        <w:pStyle w:val="Normal"/>
+        <w:ind w:left="0"/>
+        <w:rPr>
+          <w:b w:val="0"/>
+          <w:bCs w:val="0"/>
+        </w:rPr>
+      </w:pPr>
+    </w:p>
+    <w:p>
+      <w:pPr>
+        <w:pStyle w:val="Normal"/>
+        <w:ind w:left="0"/>
+        <w:rPr>
+          <w:b w:val="0"/>
+          <w:bCs w:val="0"/>
+        </w:rPr>
+      </w:pPr>
+    </w:p>
+    <w:p>
+      <w:pPr>
+        <w:pStyle w:val="Normal"/>
+        <w:ind w:left="0"/>
+        <w:rPr>
+          <w:b w:val="0"/>
+          <w:bCs w:val="0"/>
+        </w:rPr>
+      </w:pPr>
+    </w:p>
+    <w:p>
+      <w:pPr>
+        <w:pStyle w:val="Normal"/>
+        <w:ind w:left="0"/>
+        <w:rPr>
+          <w:b w:val="0"/>
+          <w:bCs w:val="0"/>
+        </w:rPr>
+      </w:pPr>
+    </w:p>
+    <w:p>
+      <w:pPr>
+        <w:pStyle w:val="Normal"/>
+        <w:ind w:left="0"/>
+        <w:rPr>
+          <w:b w:val="0"/>
+          <w:bCs w:val="0"/>
+        </w:rPr>
+      </w:pPr>
+    </w:p>
+    <w:p>
+      <w:pPr>
+        <w:pStyle w:val="Normal"/>
+        <w:ind w:left="0"/>
+        <w:rPr>
+          <w:b w:val="0"/>
+          <w:bCs w:val="0"/>
+        </w:rPr>
+      </w:pPr>
+    </w:p>
+    <w:p>
+      <w:pPr>
+        <w:pStyle w:val="Normal"/>
+        <w:ind w:left="0"/>
+        <w:rPr>
+          <w:b w:val="0"/>
+          <w:bCs w:val="0"/>
+        </w:rPr>
+      </w:pPr>
+    </w:p>
+    <w:p>
+      <w:pPr>
+        <w:pStyle w:val="Normal"/>
+        <w:ind w:left="0"/>
+        <w:rPr>
+          <w:b w:val="0"/>
+          <w:bCs w:val="0"/>
+        </w:rPr>
+      </w:pPr>
+    </w:p>
+    <w:p>
+      <w:pPr>
+        <w:pStyle w:val="Normal"/>
+        <w:ind w:left="0"/>
+        <w:rPr>
+          <w:b w:val="0"/>
+          <w:bCs w:val="0"/>
+        </w:rPr>
+      </w:pPr>
+    </w:p>
+    <w:p>
+      <w:pPr>
+        <w:pStyle w:val="Normal"/>
+        <w:ind w:left="0"/>
+        <w:rPr>
+          <w:b w:val="0"/>
+          <w:bCs w:val="0"/>
+        </w:rPr>
+      </w:pPr>
+    </w:p>
+    <w:p>
+      <w:pPr>
+        <w:pStyle w:val="Normal"/>
+        <w:ind w:left="0"/>
+        <w:rPr>
+          <w:b w:val="0"/>
+          <w:bCs w:val="0"/>
+        </w:rPr>
+      </w:pPr>
+    </w:p>
+    <w:p>
+      <w:pPr>
+        <w:pStyle w:val="Normal"/>
+        <w:ind w:left="0"/>
+        <w:rPr>
+          <w:b w:val="0"/>
+          <w:bCs w:val="0"/>
+        </w:rPr>
+      </w:pPr>
+    </w:p>
+    <w:p>
+      <w:pPr>
+        <w:pStyle w:val="Normal"/>
+        <w:ind w:left="0"/>
+        <w:rPr>
+          <w:b w:val="0"/>
+          <w:bCs w:val="0"/>
+        </w:rPr>
+      </w:pPr>
+    </w:p>
+    <w:p>
+      <w:pPr>
+        <w:pStyle w:val="Normal"/>
+        <w:ind w:left="0"/>
+        <w:rPr>
+          <w:b w:val="0"/>
+          <w:bCs w:val="0"/>
+        </w:rPr>
+      </w:pPr>
+    </w:p>
+    <w:p>
+      <w:pPr>
+        <w:pStyle w:val="Normal"/>
+        <w:ind w:left="0"/>
+        <w:rPr>
+          <w:b w:val="0"/>
+          <w:bCs w:val="0"/>
+        </w:rPr>
+      </w:pPr>
+    </w:p>
+    <w:p>
+      <w:pPr>
+        <w:pStyle w:val="Normal"/>
+        <w:ind w:left="0"/>
+        <w:rPr>
+          <w:b w:val="0"/>
+          <w:bCs w:val="0"/>
+        </w:rPr>
+      </w:pPr>
+    </w:p>
+    <w:p>
+      <w:pPr>
+        <w:pStyle w:val="Normal"/>
+        <w:ind w:left="0"/>
+        <w:rPr>
+          <w:b w:val="0"/>
+          <w:bCs w:val="0"/>
+        </w:rPr>
+      </w:pPr>
+    </w:p>
+    <w:p>
+      <w:pPr>
+        <w:pStyle w:val="Normal"/>
+        <w:ind w:left="0"/>
+        <w:rPr>
+          <w:b w:val="0"/>
+          <w:bCs w:val="0"/>
+        </w:rPr>
+      </w:pPr>
+    </w:p>
+    <w:p>
+      <w:pPr>
+        <w:pStyle w:val="Normal"/>
+        <w:ind w:left="0"/>
+        <w:rPr>
+          <w:b w:val="0"/>
+          <w:bCs w:val="0"/>
+        </w:rPr>
+      </w:pPr>
+    </w:p>
+    <w:p>
+      <w:pPr>
+        <w:pStyle w:val="Normal"/>
+        <w:ind w:left="0"/>
+        <w:rPr>
+          <w:b w:val="0"/>
+          <w:bCs w:val="0"/>
+        </w:rPr>
+      </w:pPr>
     </w:p>
     <w:p>
       <w:pPr>
@@ -1985,7 +5048,7 @@
     </w:pPr>
     <w:r>
       <w:drawing>
-        <wp:anchor distT="0" distB="0" distL="114300" distR="114300" simplePos="0" relativeHeight="251658240" behindDoc="1" locked="0" layoutInCell="1" allowOverlap="1" wp14:anchorId="248B1DAB" wp14:editId="145BD42E">
+        <wp:anchor distT="0" distB="0" distL="114300" distR="114300" simplePos="0" relativeHeight="251658240" behindDoc="1" locked="0" layoutInCell="1" allowOverlap="1" wp14:anchorId="248B1DAB" wp14:editId="2C14E321">
           <wp:simplePos x="0" y="0"/>
           <wp:positionH relativeFrom="column">
             <wp:posOffset>-695325</wp:posOffset>
@@ -2046,6 +5109,118 @@
 
 <file path=word/numbering.xml><?xml version="1.0" encoding="utf-8"?>
 <w:numbering xmlns:wpc="http://schemas.microsoft.com/office/word/2010/wordprocessingCanvas" xmlns:cx="http://schemas.microsoft.com/office/drawing/2014/chartex" xmlns:cx1="http://schemas.microsoft.com/office/drawing/2015/9/8/chartex" xmlns:cx2="http://schemas.microsoft.com/office/drawing/2015/10/21/chartex" xmlns:cx3="http://schemas.microsoft.com/office/drawing/2016/5/9/chartex" xmlns:cx4="http://schemas.microsoft.com/office/drawing/2016/5/10/chartex" xmlns:cx5="http://schemas.microsoft.com/office/drawing/2016/5/11/chartex" xmlns:cx6="http://schemas.microsoft.com/office/drawing/2016/5/12/chartex" xmlns:cx7="http://schemas.microsoft.com/office/drawing/2016/5/13/chartex" xmlns:cx8="http://schemas.microsoft.com/office/drawing/2016/5/14/chartex" xmlns:mc="http://schemas.openxmlformats.org/markup-compatibility/2006" xmlns:aink="http://schemas.microsoft.com/office/drawing/2016/ink" xmlns:am3d="http://schemas.microsoft.com/office/drawing/2017/model3d" xmlns:o="urn:schemas-microsoft-com:office:office" xmlns:oel="http://schemas.microsoft.com/office/2019/extlst" xmlns:r="http://schemas.openxmlformats.org/officeDocument/2006/relationships" xmlns:m="http://schemas.openxmlformats.org/officeDocument/2006/math" xmlns:v="urn:schemas-microsoft-com:vml" xmlns:wp14="http://schemas.microsoft.com/office/word/2010/wordprocessingDrawing" xmlns:wp="http://schemas.openxmlformats.org/drawingml/2006/wordprocessingDrawing" xmlns:w10="urn:schemas-microsoft-com:office:word" xmlns:w="http://schemas.openxmlformats.org/wordprocessingml/2006/main" xmlns:w14="http://schemas.microsoft.com/office/word/2010/wordml" xmlns:w15="http://schemas.microsoft.com/office/word/2012/wordml" xmlns:w16cex="http://schemas.microsoft.com/office/word/2018/wordml/cex" xmlns:w16cid="http://schemas.microsoft.com/office/word/2016/wordml/cid" xmlns:w16="http://schemas.microsoft.com/office/word/2018/wordml" xmlns:w16du="http://schemas.microsoft.com/office/word/2023/wordml/word16du" xmlns:w16sdtdh="http://schemas.microsoft.com/office/word/2020/wordml/sdtdatahash" xmlns:w16sdtfl="http://schemas.microsoft.com/office/word/2024/wordml/sdtformatlock" xmlns:w16se="http://schemas.microsoft.com/office/word/2015/wordml/symex" xmlns:wpg="http://schemas.microsoft.com/office/word/2010/wordprocessingGroup" xmlns:wpi="http://schemas.microsoft.com/office/word/2010/wordprocessingInk" xmlns:wne="http://schemas.microsoft.com/office/word/2006/wordml" xmlns:wps="http://schemas.microsoft.com/office/word/2010/wordprocessingShape" mc:Ignorable="w14 w15 w16se w16cid w16 w16cex w16sdtdh w16sdtfl w16du wp14">
+  <w:abstractNum xmlns:w="http://schemas.openxmlformats.org/wordprocessingml/2006/main" w:abstractNumId="10">
+    <w:nsid w:val="32af5599"/>
+    <w:multiLevelType xmlns:w="http://schemas.openxmlformats.org/wordprocessingml/2006/main" w:val="hybridMultilevel"/>
+    <w:lvl xmlns:w="http://schemas.openxmlformats.org/wordprocessingml/2006/main" w:ilvl="0">
+      <w:start w:val="1"/>
+      <w:numFmt w:val="bullet"/>
+      <w:lvlText w:val=""/>
+      <w:lvlJc w:val="left"/>
+      <w:pPr>
+        <w:ind w:left="720" w:hanging="360"/>
+      </w:pPr>
+      <w:rPr>
+        <w:rFonts w:hint="default" w:ascii="Symbol" w:hAnsi="Symbol"/>
+      </w:rPr>
+    </w:lvl>
+    <w:lvl xmlns:w="http://schemas.openxmlformats.org/wordprocessingml/2006/main" w:ilvl="1">
+      <w:start w:val="1"/>
+      <w:numFmt w:val="bullet"/>
+      <w:lvlText w:val="o"/>
+      <w:lvlJc w:val="left"/>
+      <w:pPr>
+        <w:ind w:left="1440" w:hanging="360"/>
+      </w:pPr>
+      <w:rPr>
+        <w:rFonts w:hint="default" w:ascii="Courier New" w:hAnsi="Courier New"/>
+      </w:rPr>
+    </w:lvl>
+    <w:lvl xmlns:w="http://schemas.openxmlformats.org/wordprocessingml/2006/main" w:ilvl="2">
+      <w:start w:val="1"/>
+      <w:numFmt w:val="bullet"/>
+      <w:lvlText w:val=""/>
+      <w:lvlJc w:val="left"/>
+      <w:pPr>
+        <w:ind w:left="2160" w:hanging="360"/>
+      </w:pPr>
+      <w:rPr>
+        <w:rFonts w:hint="default" w:ascii="Wingdings" w:hAnsi="Wingdings"/>
+      </w:rPr>
+    </w:lvl>
+    <w:lvl xmlns:w="http://schemas.openxmlformats.org/wordprocessingml/2006/main" w:ilvl="3">
+      <w:start w:val="1"/>
+      <w:numFmt w:val="bullet"/>
+      <w:lvlText w:val=""/>
+      <w:lvlJc w:val="left"/>
+      <w:pPr>
+        <w:ind w:left="2880" w:hanging="360"/>
+      </w:pPr>
+      <w:rPr>
+        <w:rFonts w:hint="default" w:ascii="Symbol" w:hAnsi="Symbol"/>
+      </w:rPr>
+    </w:lvl>
+    <w:lvl xmlns:w="http://schemas.openxmlformats.org/wordprocessingml/2006/main" w:ilvl="4">
+      <w:start w:val="1"/>
+      <w:numFmt w:val="bullet"/>
+      <w:lvlText w:val="o"/>
+      <w:lvlJc w:val="left"/>
+      <w:pPr>
+        <w:ind w:left="3600" w:hanging="360"/>
+      </w:pPr>
+      <w:rPr>
+        <w:rFonts w:hint="default" w:ascii="Courier New" w:hAnsi="Courier New"/>
+      </w:rPr>
+    </w:lvl>
+    <w:lvl xmlns:w="http://schemas.openxmlformats.org/wordprocessingml/2006/main" w:ilvl="5">
+      <w:start w:val="1"/>
+      <w:numFmt w:val="bullet"/>
+      <w:lvlText w:val=""/>
+      <w:lvlJc w:val="left"/>
+      <w:pPr>
+        <w:ind w:left="4320" w:hanging="360"/>
+      </w:pPr>
+      <w:rPr>
+        <w:rFonts w:hint="default" w:ascii="Wingdings" w:hAnsi="Wingdings"/>
+      </w:rPr>
+    </w:lvl>
+    <w:lvl xmlns:w="http://schemas.openxmlformats.org/wordprocessingml/2006/main" w:ilvl="6">
+      <w:start w:val="1"/>
+      <w:numFmt w:val="bullet"/>
+      <w:lvlText w:val=""/>
+      <w:lvlJc w:val="left"/>
+      <w:pPr>
+        <w:ind w:left="5040" w:hanging="360"/>
+      </w:pPr>
+      <w:rPr>
+        <w:rFonts w:hint="default" w:ascii="Symbol" w:hAnsi="Symbol"/>
+      </w:rPr>
+    </w:lvl>
+    <w:lvl xmlns:w="http://schemas.openxmlformats.org/wordprocessingml/2006/main" w:ilvl="7">
+      <w:start w:val="1"/>
+      <w:numFmt w:val="bullet"/>
+      <w:lvlText w:val="o"/>
+      <w:lvlJc w:val="left"/>
+      <w:pPr>
+        <w:ind w:left="5760" w:hanging="360"/>
+      </w:pPr>
+      <w:rPr>
+        <w:rFonts w:hint="default" w:ascii="Courier New" w:hAnsi="Courier New"/>
+      </w:rPr>
+    </w:lvl>
+    <w:lvl xmlns:w="http://schemas.openxmlformats.org/wordprocessingml/2006/main" w:ilvl="8">
+      <w:start w:val="1"/>
+      <w:numFmt w:val="bullet"/>
+      <w:lvlText w:val=""/>
+      <w:lvlJc w:val="left"/>
+      <w:pPr>
+        <w:ind w:left="6480" w:hanging="360"/>
+      </w:pPr>
+      <w:rPr>
+        <w:rFonts w:hint="default" w:ascii="Wingdings" w:hAnsi="Wingdings"/>
+      </w:rPr>
+    </w:lvl>
+  </w:abstractNum>
   <w:abstractNum xmlns:w="http://schemas.openxmlformats.org/wordprocessingml/2006/main" w:abstractNumId="9">
     <w:nsid w:val="24b508ae"/>
     <w:multiLevelType xmlns:w="http://schemas.openxmlformats.org/wordprocessingml/2006/main" w:val="hybridMultilevel"/>
@@ -3204,6 +6379,9 @@
       </w:rPr>
     </w:lvl>
   </w:abstractNum>
+  <w:num w:numId="11">
+    <w:abstractNumId w:val="10"/>
+  </w:num>
   <w:num w:numId="10">
     <w:abstractNumId w:val="9"/>
   </w:num>

</xml_diff>

<commit_message>
Avance 3 requisitos no funcionales
</commit_message>
<xml_diff>
--- a/informe/Informe_Entrega1_PapasFritasRUTA.docx
+++ b/informe/Informe_Entrega1_PapasFritasRUTA.docx
@@ -90,26 +90,144 @@
     </w:p>
     <w:p>
       <w:pPr>
-        <w:spacing w:after="300"/>
+        <w:spacing w:before="300" w:after="300"/>
         <w:jc w:val="center"/>
       </w:pPr>
       <w:r>
+        <w:rPr>
+          <w:b w:val="1"/>
+          <w:bCs w:val="1"/>
+          <w:sz w:val="24"/>
+          <w:szCs w:val="24"/>
+        </w:rPr>
+        <w:t>Ruta-Papas Fritas</w:t>
+      </w:r>
+    </w:p>
+    <w:p>
+      <w:pPr>
+        <w:spacing w:before="240" w:beforeAutospacing="off" w:after="240" w:afterAutospacing="off"/>
+        <w:jc w:val="center"/>
+        <w:rPr>
+          <w:rFonts w:ascii="Calibri" w:hAnsi="Calibri" w:eastAsia="Calibri" w:cs="Calibri"/>
+          <w:b w:val="1"/>
+          <w:bCs w:val="1"/>
+          <w:noProof w:val="0"/>
+          <w:sz w:val="24"/>
+          <w:szCs w:val="24"/>
+          <w:lang w:val="es-419"/>
+        </w:rPr>
+      </w:pPr>
+      <w:r>
+        <w:rPr>
+          <w:rFonts w:ascii="Calibri" w:hAnsi="Calibri" w:eastAsia="Calibri" w:cs="Calibri"/>
+          <w:b w:val="1"/>
+          <w:bCs w:val="1"/>
+          <w:noProof w:val="0"/>
+          <w:sz w:val="24"/>
+          <w:szCs w:val="24"/>
+          <w:lang w:val="es-419"/>
+        </w:rPr>
+        <w:t>77.964.038-8</w:t>
+      </w:r>
+    </w:p>
+    <w:p>
+      <w:pPr>
+        <w:spacing w:before="300" w:after="100"/>
+        <w:jc w:val="center"/>
+      </w:pPr>
+    </w:p>
+    <w:p>
+      <w:pPr>
+        <w:spacing w:before="300" w:after="100"/>
+        <w:jc w:val="center"/>
+        <w:rPr>
+          <w:b w:val="1"/>
+          <w:bCs w:val="1"/>
+        </w:rPr>
+      </w:pPr>
+      <w:r>
+        <w:br/>
+      </w:r>
+      <w:r>
+        <w:rPr>
+          <w:b w:val="1"/>
+          <w:bCs w:val="1"/>
+        </w:rPr>
+        <w:t>Antonia Valenzuela, 21.694.774-6, 202360600-6</w:t>
+      </w:r>
+    </w:p>
+    <w:p>
+      <w:pPr>
+        <w:spacing w:before="300" w:after="100"/>
+        <w:jc w:val="center"/>
+        <w:rPr>
+          <w:b w:val="1"/>
+          <w:bCs w:val="1"/>
+        </w:rPr>
+      </w:pPr>
+      <w:r>
+        <w:rPr>
+          <w:b w:val="1"/>
+          <w:bCs w:val="1"/>
+        </w:rPr>
+        <w:t>Clemente Luoni, 21.830.240-8, 202360592-1</w:t>
+      </w:r>
+    </w:p>
+    <w:p>
+      <w:pPr>
+        <w:spacing w:before="300" w:after="100"/>
+        <w:jc w:val="center"/>
+        <w:rPr>
+          <w:b w:val="1"/>
+          <w:bCs w:val="1"/>
+        </w:rPr>
+      </w:pPr>
+      <w:r>
+        <w:rPr>
+          <w:b w:val="1"/>
+          <w:bCs w:val="1"/>
+        </w:rPr>
+        <w:t>Florencia Palma</w:t>
+      </w:r>
+      <w:r>
+        <w:rPr>
+          <w:b w:val="1"/>
+          <w:bCs w:val="1"/>
+        </w:rPr>
+        <w:t>, 21.144.221-2, 202360558-1</w:t>
+      </w:r>
+    </w:p>
+    <w:p>
+      <w:pPr>
+        <w:spacing w:before="300" w:after="100"/>
+        <w:jc w:val="center"/>
+        <w:rPr>
+          <w:b w:val="1"/>
+          <w:bCs w:val="1"/>
+        </w:rPr>
+      </w:pPr>
+      <w:r>
+        <w:rPr>
+          <w:b w:val="1"/>
+          <w:bCs w:val="1"/>
+        </w:rPr>
+        <w:t>Gonzalo Orellana</w:t>
+      </w:r>
+      <w:r>
+        <w:rPr>
+          <w:b w:val="1"/>
+          <w:bCs w:val="1"/>
+        </w:rPr>
+        <w:t>, 21.742.345-7, 202360556-5</w:t>
+      </w:r>
+    </w:p>
+    <w:p>
+      <w:pPr>
+        <w:spacing w:before="300" w:after="100"/>
+        <w:jc w:val="center"/>
         <w:rPr>
           <w:b/>
           <w:bCs/>
-          <w:sz w:val="24"/>
-          <w:szCs w:val="24"/>
-        </w:rPr>
-        <w:t>Ruta-Papas Fritas</w:t>
-      </w:r>
-    </w:p>
-    <w:p>
-      <w:pPr>
-        <w:spacing w:before="300" w:after="100"/>
-        <w:jc w:val="both"/>
-        <w:rPr>
-          <w:b/>
-          <w:bCs/>
         </w:rPr>
       </w:pPr>
     </w:p>
@@ -118,104 +236,33 @@
         <w:spacing w:before="300" w:after="100"/>
         <w:jc w:val="center"/>
         <w:rPr>
+          <w:i w:val="1"/>
+          <w:iCs w:val="1"/>
+        </w:rPr>
+      </w:pPr>
+      <w:r>
+        <w:rPr>
           <w:b w:val="1"/>
           <w:bCs w:val="1"/>
         </w:rPr>
-      </w:pPr>
-      <w:r>
-        <w:br/>
-      </w:r>
+        <w:t>Repositorio GitHub:</w:t>
+      </w:r>
+    </w:p>
+    <w:p>
+      <w:pPr>
+        <w:spacing w:after="100"/>
+        <w:jc w:val="center"/>
+      </w:pPr>
       <w:r>
         <w:rPr>
           <w:b w:val="1"/>
           <w:bCs w:val="1"/>
         </w:rPr>
-        <w:t>Antonia Valenzuela, 21.694.774-6, 202360600-6</w:t>
-      </w:r>
-    </w:p>
-    <w:p>
-      <w:pPr>
-        <w:spacing w:before="300" w:after="100"/>
-        <w:jc w:val="center"/>
-        <w:rPr>
-          <w:b w:val="1"/>
-          <w:bCs w:val="1"/>
-        </w:rPr>
-      </w:pPr>
-      <w:r>
-        <w:rPr>
-          <w:b w:val="1"/>
-          <w:bCs w:val="1"/>
-        </w:rPr>
-        <w:t>Clemente Luoni, 21.830.240-8, 202360592-1</w:t>
-      </w:r>
-    </w:p>
-    <w:p>
-      <w:pPr>
-        <w:spacing w:before="300" w:after="100"/>
-        <w:jc w:val="center"/>
-        <w:rPr>
-          <w:b/>
-          <w:bCs/>
-        </w:rPr>
-      </w:pPr>
-      <w:r>
-        <w:rPr>
-          <w:b/>
-          <w:bCs/>
-        </w:rPr>
-        <w:t>Florencia Palma</w:t>
-      </w:r>
-    </w:p>
-    <w:p>
-      <w:pPr>
-        <w:spacing w:before="300" w:after="100"/>
-        <w:jc w:val="center"/>
-        <w:rPr>
-          <w:b w:val="1"/>
-          <w:bCs w:val="1"/>
-        </w:rPr>
-      </w:pPr>
-      <w:r>
-        <w:rPr>
-          <w:b w:val="1"/>
-          <w:bCs w:val="1"/>
-        </w:rPr>
-        <w:t>Gonzalo Orellana</w:t>
-      </w:r>
-      <w:r>
-        <w:rPr>
-          <w:b w:val="1"/>
-          <w:bCs w:val="1"/>
-        </w:rPr>
-        <w:t>, 21.742.345-7, 202360556-5</w:t>
-      </w:r>
-    </w:p>
-    <w:p>
-      <w:pPr>
-        <w:spacing w:before="300" w:after="100"/>
-        <w:jc w:val="center"/>
-        <w:rPr>
-          <w:b/>
-          <w:bCs/>
-        </w:rPr>
-      </w:pPr>
-    </w:p>
-    <w:p>
-      <w:pPr>
-        <w:spacing w:before="300" w:after="100"/>
-        <w:jc w:val="center"/>
-        <w:rPr>
-          <w:i w:val="1"/>
-          <w:iCs w:val="1"/>
-        </w:rPr>
-      </w:pPr>
-      <w:r>
-        <w:rPr>
-          <w:b w:val="1"/>
-          <w:bCs w:val="1"/>
-        </w:rPr>
-        <w:t>Repositorio GitHub:</w:t>
+        <w:t xml:space="preserve">Profesor: </w:t>
+      </w:r>
+      <w:r>
+        <w:rPr/>
+        <w:t>José Miguel González Paul</w:t>
       </w:r>
     </w:p>
     <w:p>
@@ -223,17 +270,6 @@
         <w:spacing w:after="100"/>
         <w:jc w:val="center"/>
       </w:pPr>
-      <w:r>
-        <w:rPr>
-          <w:b w:val="1"/>
-          <w:bCs w:val="1"/>
-        </w:rPr>
-        <w:t xml:space="preserve">Profesor: </w:t>
-      </w:r>
-      <w:r>
-        <w:rPr/>
-        <w:t>José Miguel González Paul</w:t>
-      </w:r>
     </w:p>
     <w:p>
       <w:pPr>
@@ -261,15 +297,27 @@
     </w:p>
     <w:p>
       <w:pPr>
+        <w:pStyle w:val="Normal"/>
         <w:spacing w:after="100"/>
         <w:jc w:val="center"/>
       </w:pPr>
     </w:p>
     <w:p>
       <w:pPr>
-        <w:spacing w:after="100"/>
-        <w:jc w:val="center"/>
-      </w:pPr>
+        <w:pStyle w:val="Ttulo"/>
+        <w:ind w:left="0"/>
+        <w:rPr>
+          <w:sz w:val="36"/>
+          <w:szCs w:val="36"/>
+        </w:rPr>
+      </w:pPr>
+      <w:r>
+        <w:rPr>
+          <w:sz w:val="36"/>
+          <w:szCs w:val="36"/>
+        </w:rPr>
+        <w:t>B. PYME y problema (evidencia)</w:t>
+      </w:r>
     </w:p>
     <w:p>
       <w:pPr>
@@ -309,16 +357,29 @@
       </w:pPr>
       <w:r>
         <w:rPr/>
-        <w:t>Nombre: Ruta.</w:t>
-      </w:r>
-    </w:p>
-    <w:p>
-      <w:pPr>
-        <w:pStyle w:val="Normal"/>
-      </w:pPr>
+        <w:t>Nombre: Ruta</w:t>
+      </w:r>
       <w:r>
         <w:rPr/>
-        <w:t>Rut: 20.929.312-9.</w:t>
+        <w:t xml:space="preserve"> Snack SpA</w:t>
+      </w:r>
+    </w:p>
+    <w:p>
+      <w:pPr>
+        <w:pStyle w:val="Normal"/>
+        <w:suppressLineNumbers w:val="0"/>
+        <w:bidi w:val="0"/>
+        <w:spacing w:before="0" w:beforeAutospacing="off" w:after="0" w:afterAutospacing="off" w:line="259" w:lineRule="auto"/>
+        <w:ind w:left="0" w:right="0"/>
+        <w:jc w:val="left"/>
+      </w:pPr>
+      <w:r>
+        <w:rPr/>
+        <w:t xml:space="preserve">Rut: </w:t>
+      </w:r>
+      <w:r>
+        <w:rPr/>
+        <w:t>77.964.038-8</w:t>
       </w:r>
     </w:p>
     <w:p>
@@ -1653,28 +1714,29 @@
     </w:p>
     <w:p>
       <w:pPr>
+        <w:pStyle w:val="Ttulo"/>
+        <w:rPr>
+          <w:noProof w:val="0"/>
+          <w:sz w:val="36"/>
+          <w:szCs w:val="36"/>
+          <w:lang w:val="es-419"/>
+        </w:rPr>
+      </w:pPr>
+      <w:r>
+        <w:rPr>
+          <w:noProof w:val="0"/>
+          <w:sz w:val="36"/>
+          <w:szCs w:val="36"/>
+          <w:lang w:val="es-419"/>
+        </w:rPr>
+        <w:t>C. Requerimientos desde cero</w:t>
+      </w:r>
+    </w:p>
+    <w:p>
+      <w:pPr>
         <w:pStyle w:val="Normal"/>
         <w:spacing w:before="240" w:beforeAutospacing="off" w:after="240" w:afterAutospacing="off"/>
         <w:ind w:left="0"/>
-        <w:rPr>
-          <w:rFonts w:ascii="Calibri" w:hAnsi="Calibri" w:eastAsia="Calibri" w:cs="Calibri"/>
-          <w:b w:val="0"/>
-          <w:bCs w:val="0"/>
-          <w:noProof w:val="0"/>
-          <w:sz w:val="22"/>
-          <w:szCs w:val="22"/>
-          <w:lang w:val="es-419"/>
-        </w:rPr>
-      </w:pPr>
-    </w:p>
-    <w:p>
-      <w:pPr>
-        <w:pStyle w:val="Prrafodelista"/>
-        <w:numPr>
-          <w:ilvl w:val="0"/>
-          <w:numId w:val="8"/>
-        </w:numPr>
-        <w:spacing w:before="240" w:beforeAutospacing="off" w:after="240" w:afterAutospacing="off"/>
         <w:rPr>
           <w:rFonts w:ascii="Calibri" w:hAnsi="Calibri" w:eastAsia="Calibri" w:cs="Calibri"/>
           <w:b w:val="1"/>
@@ -2532,6 +2594,7 @@
     <w:p>
       <w:pPr>
         <w:pStyle w:val="Normal"/>
+        <w:jc w:val="both"/>
       </w:pPr>
       <w:r>
         <w:rPr>
@@ -3724,6 +3787,903 @@
     <w:p>
       <w:pPr>
         <w:pStyle w:val="Ttulo"/>
+      </w:pPr>
+      <w:r>
+        <w:rPr>
+          <w:b w:val="1"/>
+          <w:bCs w:val="1"/>
+          <w:sz w:val="22"/>
+          <w:szCs w:val="22"/>
+        </w:rPr>
+        <w:t>8.2 Requisitos no funcionales</w:t>
+      </w:r>
+    </w:p>
+    <w:p>
+      <w:pPr>
+        <w:pStyle w:val="Ttulo"/>
+        <w:rPr>
+          <w:b w:val="0"/>
+          <w:bCs w:val="0"/>
+          <w:sz w:val="22"/>
+          <w:szCs w:val="22"/>
+        </w:rPr>
+      </w:pPr>
+    </w:p>
+    <w:p>
+      <w:pPr>
+        <w:pStyle w:val="Ttulo"/>
+        <w:rPr>
+          <w:b w:val="0"/>
+          <w:bCs w:val="0"/>
+          <w:sz w:val="22"/>
+          <w:szCs w:val="22"/>
+        </w:rPr>
+      </w:pPr>
+      <w:r>
+        <w:rPr>
+          <w:b w:val="0"/>
+          <w:bCs w:val="0"/>
+          <w:sz w:val="22"/>
+          <w:szCs w:val="22"/>
+        </w:rPr>
+        <w:t xml:space="preserve">Los requisitos no funcionales correspondes a ciertas </w:t>
+      </w:r>
+      <w:r>
+        <w:rPr>
+          <w:b w:val="0"/>
+          <w:bCs w:val="0"/>
+          <w:sz w:val="22"/>
+          <w:szCs w:val="22"/>
+        </w:rPr>
+        <w:t>características</w:t>
+      </w:r>
+      <w:r>
+        <w:rPr>
+          <w:b w:val="0"/>
+          <w:bCs w:val="0"/>
+          <w:sz w:val="22"/>
+          <w:szCs w:val="22"/>
+        </w:rPr>
+        <w:t xml:space="preserve"> que el SIG </w:t>
+      </w:r>
+      <w:r>
+        <w:rPr>
+          <w:b w:val="0"/>
+          <w:bCs w:val="0"/>
+          <w:sz w:val="22"/>
+          <w:szCs w:val="22"/>
+        </w:rPr>
+        <w:t>deberá</w:t>
+      </w:r>
+      <w:r>
+        <w:rPr>
+          <w:b w:val="0"/>
+          <w:bCs w:val="0"/>
+          <w:sz w:val="22"/>
+          <w:szCs w:val="22"/>
+        </w:rPr>
+        <w:t xml:space="preserve"> tener para funcionar correctamente y cumplir el </w:t>
+      </w:r>
+      <w:r>
+        <w:rPr>
+          <w:b w:val="0"/>
+          <w:bCs w:val="0"/>
+          <w:sz w:val="22"/>
+          <w:szCs w:val="22"/>
+        </w:rPr>
+        <w:t>objetivo</w:t>
+      </w:r>
+      <w:r>
+        <w:rPr>
+          <w:b w:val="0"/>
+          <w:bCs w:val="0"/>
+          <w:sz w:val="22"/>
+          <w:szCs w:val="22"/>
+        </w:rPr>
+        <w:t xml:space="preserve">, que a </w:t>
+      </w:r>
+      <w:r>
+        <w:rPr>
+          <w:b w:val="0"/>
+          <w:bCs w:val="0"/>
+          <w:sz w:val="22"/>
+          <w:szCs w:val="22"/>
+        </w:rPr>
+        <w:t>diferencia</w:t>
+      </w:r>
+      <w:r>
+        <w:rPr>
+          <w:b w:val="0"/>
+          <w:bCs w:val="0"/>
+          <w:sz w:val="22"/>
+          <w:szCs w:val="22"/>
+        </w:rPr>
+        <w:t xml:space="preserve"> de las funcionales no so</w:t>
+      </w:r>
+      <w:r>
+        <w:rPr>
+          <w:b w:val="0"/>
+          <w:bCs w:val="0"/>
+          <w:sz w:val="22"/>
+          <w:szCs w:val="22"/>
+        </w:rPr>
+        <w:t xml:space="preserve">n funciones que deba cumplir el sistema, sino </w:t>
+      </w:r>
+      <w:r>
+        <w:rPr>
+          <w:b w:val="0"/>
+          <w:bCs w:val="0"/>
+          <w:sz w:val="22"/>
+          <w:szCs w:val="22"/>
+        </w:rPr>
+        <w:t>características</w:t>
+      </w:r>
+      <w:r>
+        <w:rPr>
+          <w:b w:val="0"/>
+          <w:bCs w:val="0"/>
+          <w:sz w:val="22"/>
+          <w:szCs w:val="22"/>
+        </w:rPr>
+        <w:t xml:space="preserve"> de su funcionamiento. Estos se </w:t>
+      </w:r>
+      <w:r>
+        <w:rPr>
+          <w:b w:val="0"/>
+          <w:bCs w:val="0"/>
+          <w:sz w:val="22"/>
+          <w:szCs w:val="22"/>
+        </w:rPr>
+        <w:t>priorizarán</w:t>
+      </w:r>
+      <w:r>
+        <w:rPr>
+          <w:b w:val="0"/>
+          <w:bCs w:val="0"/>
+          <w:sz w:val="22"/>
+          <w:szCs w:val="22"/>
+        </w:rPr>
+        <w:t xml:space="preserve"> con la misma </w:t>
+      </w:r>
+      <w:r>
+        <w:rPr>
+          <w:b w:val="0"/>
+          <w:bCs w:val="0"/>
+          <w:sz w:val="22"/>
+          <w:szCs w:val="22"/>
+        </w:rPr>
+        <w:t>metodología</w:t>
+      </w:r>
+      <w:r>
+        <w:rPr>
+          <w:b w:val="0"/>
+          <w:bCs w:val="0"/>
+          <w:sz w:val="22"/>
+          <w:szCs w:val="22"/>
+        </w:rPr>
+        <w:t xml:space="preserve"> utilizada anteriormente, la </w:t>
+      </w:r>
+      <w:r>
+        <w:rPr>
+          <w:b w:val="0"/>
+          <w:bCs w:val="0"/>
+          <w:sz w:val="22"/>
+          <w:szCs w:val="22"/>
+        </w:rPr>
+        <w:t>metodología</w:t>
+      </w:r>
+      <w:r>
+        <w:rPr>
+          <w:b w:val="0"/>
+          <w:bCs w:val="0"/>
+          <w:sz w:val="22"/>
+          <w:szCs w:val="22"/>
+        </w:rPr>
+        <w:t xml:space="preserve"> MoSCoW.</w:t>
+      </w:r>
+    </w:p>
+    <w:tbl>
+      <w:tblPr>
+        <w:tblStyle w:val="TableGrid"/>
+        <w:tblW w:w="0" w:type="auto"/>
+        <w:tblLook w:val="06A0" w:firstRow="1" w:lastRow="0" w:firstColumn="1" w:lastColumn="0" w:noHBand="1" w:noVBand="1"/>
+      </w:tblPr>
+      <w:tblGrid>
+        <w:gridCol w:w="2385"/>
+        <w:gridCol w:w="2385"/>
+        <w:gridCol w:w="2385"/>
+        <w:gridCol w:w="2385"/>
+      </w:tblGrid>
+      <w:tr>
+        <w:trPr>
+          <w:trHeight w:val="300"/>
+        </w:trPr>
+        <w:tc>
+          <w:tcPr>
+            <w:tcW w:w="2385" w:type="dxa"/>
+            <w:tcMar/>
+          </w:tcPr>
+          <w:p>
+            <w:pPr>
+              <w:pStyle w:val="Ttulo"/>
+            </w:pPr>
+            <w:r>
+              <w:rPr>
+                <w:sz w:val="22"/>
+                <w:szCs w:val="22"/>
+              </w:rPr>
+              <w:t>ID (</w:t>
+            </w:r>
+            <w:r>
+              <w:rPr>
+                <w:sz w:val="22"/>
+                <w:szCs w:val="22"/>
+              </w:rPr>
+              <w:t>RNF-00</w:t>
+            </w:r>
+          </w:p>
+        </w:tc>
+        <w:tc>
+          <w:tcPr>
+            <w:tcW w:w="2385" w:type="dxa"/>
+            <w:tcMar/>
+          </w:tcPr>
+          <w:p>
+            <w:pPr>
+              <w:pStyle w:val="Ttulo"/>
+            </w:pPr>
+            <w:r>
+              <w:rPr>
+                <w:sz w:val="22"/>
+                <w:szCs w:val="22"/>
+              </w:rPr>
+              <w:t>Requisito no funcional</w:t>
+            </w:r>
+          </w:p>
+        </w:tc>
+        <w:tc>
+          <w:tcPr>
+            <w:tcW w:w="2385" w:type="dxa"/>
+            <w:tcMar/>
+          </w:tcPr>
+          <w:p>
+            <w:pPr>
+              <w:pStyle w:val="Ttulo"/>
+            </w:pPr>
+            <w:r>
+              <w:rPr>
+                <w:sz w:val="22"/>
+                <w:szCs w:val="22"/>
+              </w:rPr>
+              <w:t>Prioridad</w:t>
+            </w:r>
+          </w:p>
+        </w:tc>
+        <w:tc>
+          <w:tcPr>
+            <w:tcW w:w="2385" w:type="dxa"/>
+            <w:tcMar/>
+          </w:tcPr>
+          <w:p>
+            <w:pPr>
+              <w:pStyle w:val="Ttulo"/>
+            </w:pPr>
+            <w:r>
+              <w:rPr>
+                <w:sz w:val="22"/>
+                <w:szCs w:val="22"/>
+              </w:rPr>
+              <w:t>Trazabilidad al problema</w:t>
+            </w:r>
+          </w:p>
+        </w:tc>
+      </w:tr>
+      <w:tr>
+        <w:trPr>
+          <w:trHeight w:val="300"/>
+        </w:trPr>
+        <w:tc>
+          <w:tcPr>
+            <w:tcW w:w="2385" w:type="dxa"/>
+            <w:tcMar/>
+          </w:tcPr>
+          <w:p>
+            <w:pPr>
+              <w:pStyle w:val="Ttulo"/>
+            </w:pPr>
+            <w:r>
+              <w:rPr>
+                <w:sz w:val="22"/>
+                <w:szCs w:val="22"/>
+              </w:rPr>
+              <w:t>RNF-01</w:t>
+            </w:r>
+          </w:p>
+        </w:tc>
+        <w:tc>
+          <w:tcPr>
+            <w:tcW w:w="2385" w:type="dxa"/>
+            <w:tcMar/>
+          </w:tcPr>
+          <w:p>
+            <w:pPr>
+              <w:pStyle w:val="Ttulo"/>
+            </w:pPr>
+            <w:r>
+              <w:rPr>
+                <w:sz w:val="22"/>
+                <w:szCs w:val="22"/>
+              </w:rPr>
+              <w:t xml:space="preserve">El sistema tiene que ser simple y </w:t>
+            </w:r>
+            <w:r>
+              <w:rPr>
+                <w:sz w:val="22"/>
+                <w:szCs w:val="22"/>
+              </w:rPr>
+              <w:t>fácil</w:t>
+            </w:r>
+            <w:r>
+              <w:rPr>
+                <w:sz w:val="22"/>
+                <w:szCs w:val="22"/>
+              </w:rPr>
+              <w:t xml:space="preserve"> de usar.</w:t>
+            </w:r>
+          </w:p>
+        </w:tc>
+        <w:tc>
+          <w:tcPr>
+            <w:tcW w:w="2385" w:type="dxa"/>
+            <w:tcMar/>
+          </w:tcPr>
+          <w:p>
+            <w:pPr>
+              <w:pStyle w:val="Ttulo"/>
+            </w:pPr>
+            <w:r>
+              <w:rPr>
+                <w:sz w:val="22"/>
+                <w:szCs w:val="22"/>
+              </w:rPr>
+              <w:t>M</w:t>
+            </w:r>
+          </w:p>
+        </w:tc>
+        <w:tc>
+          <w:tcPr>
+            <w:tcW w:w="2385" w:type="dxa"/>
+            <w:tcMar/>
+          </w:tcPr>
+          <w:p>
+            <w:pPr>
+              <w:pStyle w:val="Ttulo"/>
+            </w:pPr>
+            <w:r>
+              <w:rPr>
+                <w:sz w:val="22"/>
+                <w:szCs w:val="22"/>
+              </w:rPr>
+              <w:t xml:space="preserve">Tiene que ser simple y </w:t>
+            </w:r>
+            <w:r>
+              <w:rPr>
+                <w:sz w:val="22"/>
+                <w:szCs w:val="22"/>
+              </w:rPr>
+              <w:t>fácil</w:t>
+            </w:r>
+            <w:r>
+              <w:rPr>
+                <w:sz w:val="22"/>
+                <w:szCs w:val="22"/>
+              </w:rPr>
+              <w:t xml:space="preserve"> para realmente ayudar al dueño.</w:t>
+            </w:r>
+          </w:p>
+        </w:tc>
+      </w:tr>
+      <w:tr>
+        <w:trPr>
+          <w:trHeight w:val="300"/>
+        </w:trPr>
+        <w:tc>
+          <w:tcPr>
+            <w:tcW w:w="2385" w:type="dxa"/>
+            <w:tcMar/>
+          </w:tcPr>
+          <w:p>
+            <w:pPr>
+              <w:pStyle w:val="Ttulo"/>
+            </w:pPr>
+            <w:r>
+              <w:rPr>
+                <w:sz w:val="22"/>
+                <w:szCs w:val="22"/>
+              </w:rPr>
+              <w:t>RNF-02</w:t>
+            </w:r>
+          </w:p>
+        </w:tc>
+        <w:tc>
+          <w:tcPr>
+            <w:tcW w:w="2385" w:type="dxa"/>
+            <w:tcMar/>
+          </w:tcPr>
+          <w:p>
+            <w:pPr>
+              <w:pStyle w:val="Ttulo"/>
+            </w:pPr>
+            <w:r>
+              <w:rPr>
+                <w:sz w:val="22"/>
+                <w:szCs w:val="22"/>
+              </w:rPr>
+              <w:t xml:space="preserve">La </w:t>
+            </w:r>
+            <w:r>
+              <w:rPr>
+                <w:sz w:val="22"/>
+                <w:szCs w:val="22"/>
+              </w:rPr>
+              <w:t>información</w:t>
+            </w:r>
+            <w:r>
+              <w:rPr>
+                <w:sz w:val="22"/>
+                <w:szCs w:val="22"/>
+              </w:rPr>
+              <w:t xml:space="preserve"> de cada pedido tiene que </w:t>
+            </w:r>
+            <w:r>
+              <w:rPr>
+                <w:sz w:val="22"/>
+                <w:szCs w:val="22"/>
+              </w:rPr>
+              <w:t>estar</w:t>
+            </w:r>
+            <w:r>
+              <w:rPr>
+                <w:sz w:val="22"/>
+                <w:szCs w:val="22"/>
+              </w:rPr>
+              <w:t xml:space="preserve"> ordenada y evitar falta de datos.</w:t>
+            </w:r>
+          </w:p>
+        </w:tc>
+        <w:tc>
+          <w:tcPr>
+            <w:tcW w:w="2385" w:type="dxa"/>
+            <w:tcMar/>
+          </w:tcPr>
+          <w:p>
+            <w:pPr>
+              <w:pStyle w:val="Ttulo"/>
+            </w:pPr>
+            <w:r>
+              <w:rPr>
+                <w:sz w:val="22"/>
+                <w:szCs w:val="22"/>
+              </w:rPr>
+              <w:t>M</w:t>
+            </w:r>
+          </w:p>
+        </w:tc>
+        <w:tc>
+          <w:tcPr>
+            <w:tcW w:w="2385" w:type="dxa"/>
+            <w:tcMar/>
+          </w:tcPr>
+          <w:p>
+            <w:pPr>
+              <w:pStyle w:val="Ttulo"/>
+            </w:pPr>
+            <w:r>
+              <w:rPr>
+                <w:sz w:val="22"/>
+                <w:szCs w:val="22"/>
+              </w:rPr>
+              <w:t xml:space="preserve">Que </w:t>
+            </w:r>
+            <w:r>
+              <w:rPr>
+                <w:sz w:val="22"/>
+                <w:szCs w:val="22"/>
+              </w:rPr>
+              <w:t>estén</w:t>
+            </w:r>
+            <w:r>
+              <w:rPr>
+                <w:sz w:val="22"/>
+                <w:szCs w:val="22"/>
+              </w:rPr>
+              <w:t xml:space="preserve"> todos los datos y ordenados facilita el seguimiento de los pedidos.</w:t>
+            </w:r>
+          </w:p>
+        </w:tc>
+      </w:tr>
+      <w:tr>
+        <w:trPr>
+          <w:trHeight w:val="300"/>
+        </w:trPr>
+        <w:tc>
+          <w:tcPr>
+            <w:tcW w:w="2385" w:type="dxa"/>
+            <w:tcMar/>
+          </w:tcPr>
+          <w:p>
+            <w:pPr>
+              <w:pStyle w:val="Ttulo"/>
+            </w:pPr>
+            <w:r>
+              <w:rPr>
+                <w:sz w:val="22"/>
+                <w:szCs w:val="22"/>
+              </w:rPr>
+              <w:t>RNF-03</w:t>
+            </w:r>
+          </w:p>
+        </w:tc>
+        <w:tc>
+          <w:tcPr>
+            <w:tcW w:w="2385" w:type="dxa"/>
+            <w:tcMar/>
+          </w:tcPr>
+          <w:p>
+            <w:pPr>
+              <w:pStyle w:val="Ttulo"/>
+            </w:pPr>
+            <w:r>
+              <w:rPr>
+                <w:sz w:val="22"/>
+                <w:szCs w:val="22"/>
+              </w:rPr>
+              <w:t xml:space="preserve">El SIG tiene que dejar que la </w:t>
+            </w:r>
+            <w:r>
+              <w:rPr>
+                <w:sz w:val="22"/>
+                <w:szCs w:val="22"/>
+              </w:rPr>
+              <w:t>información</w:t>
+            </w:r>
+            <w:r>
+              <w:rPr>
+                <w:sz w:val="22"/>
+                <w:szCs w:val="22"/>
+              </w:rPr>
+              <w:t xml:space="preserve"> de cada pedido sea consultada </w:t>
+            </w:r>
+            <w:r>
+              <w:rPr>
+                <w:sz w:val="22"/>
+                <w:szCs w:val="22"/>
+              </w:rPr>
+              <w:t>fácilmente</w:t>
+            </w:r>
+            <w:r>
+              <w:rPr>
+                <w:sz w:val="22"/>
+                <w:szCs w:val="22"/>
+              </w:rPr>
+              <w:t>.</w:t>
+            </w:r>
+          </w:p>
+        </w:tc>
+        <w:tc>
+          <w:tcPr>
+            <w:tcW w:w="2385" w:type="dxa"/>
+            <w:tcMar/>
+          </w:tcPr>
+          <w:p>
+            <w:pPr>
+              <w:pStyle w:val="Ttulo"/>
+            </w:pPr>
+            <w:r>
+              <w:rPr>
+                <w:sz w:val="22"/>
+                <w:szCs w:val="22"/>
+              </w:rPr>
+              <w:t>M</w:t>
+            </w:r>
+          </w:p>
+        </w:tc>
+        <w:tc>
+          <w:tcPr>
+            <w:tcW w:w="2385" w:type="dxa"/>
+            <w:tcMar/>
+          </w:tcPr>
+          <w:p>
+            <w:pPr>
+              <w:pStyle w:val="Ttulo"/>
+            </w:pPr>
+            <w:r>
+              <w:rPr>
+                <w:sz w:val="22"/>
+                <w:szCs w:val="22"/>
+              </w:rPr>
+              <w:t xml:space="preserve">Se </w:t>
+            </w:r>
+            <w:r>
+              <w:rPr>
+                <w:sz w:val="22"/>
+                <w:szCs w:val="22"/>
+              </w:rPr>
+              <w:t>busca</w:t>
+            </w:r>
+            <w:r>
+              <w:rPr>
+                <w:sz w:val="22"/>
+                <w:szCs w:val="22"/>
+              </w:rPr>
+              <w:t xml:space="preserve"> optimizar los tiempos que demora el dueño en consultar cada pedido.</w:t>
+            </w:r>
+          </w:p>
+        </w:tc>
+      </w:tr>
+      <w:tr>
+        <w:trPr>
+          <w:trHeight w:val="300"/>
+        </w:trPr>
+        <w:tc>
+          <w:tcPr>
+            <w:tcW w:w="2385" w:type="dxa"/>
+            <w:tcMar/>
+          </w:tcPr>
+          <w:p>
+            <w:pPr>
+              <w:pStyle w:val="Ttulo"/>
+            </w:pPr>
+            <w:r>
+              <w:rPr>
+                <w:sz w:val="22"/>
+                <w:szCs w:val="22"/>
+              </w:rPr>
+              <w:t>RNF-04</w:t>
+            </w:r>
+          </w:p>
+        </w:tc>
+        <w:tc>
+          <w:tcPr>
+            <w:tcW w:w="2385" w:type="dxa"/>
+            <w:tcMar/>
+          </w:tcPr>
+          <w:p>
+            <w:pPr>
+              <w:pStyle w:val="Ttulo"/>
+            </w:pPr>
+            <w:r>
+              <w:rPr>
+                <w:sz w:val="22"/>
+                <w:szCs w:val="22"/>
+              </w:rPr>
+              <w:t>El SIG tiene que contar con una contraseña de acceso</w:t>
+            </w:r>
+          </w:p>
+        </w:tc>
+        <w:tc>
+          <w:tcPr>
+            <w:tcW w:w="2385" w:type="dxa"/>
+            <w:tcMar/>
+          </w:tcPr>
+          <w:p>
+            <w:pPr>
+              <w:pStyle w:val="Ttulo"/>
+            </w:pPr>
+            <w:r>
+              <w:rPr>
+                <w:sz w:val="22"/>
+                <w:szCs w:val="22"/>
+              </w:rPr>
+              <w:t>S</w:t>
+            </w:r>
+          </w:p>
+        </w:tc>
+        <w:tc>
+          <w:tcPr>
+            <w:tcW w:w="2385" w:type="dxa"/>
+            <w:tcMar/>
+          </w:tcPr>
+          <w:p>
+            <w:pPr>
+              <w:pStyle w:val="Ttulo"/>
+            </w:pPr>
+            <w:r>
+              <w:rPr>
+                <w:sz w:val="22"/>
+                <w:szCs w:val="22"/>
+              </w:rPr>
+              <w:t xml:space="preserve">Esto busca evitar una </w:t>
+            </w:r>
+            <w:r>
+              <w:rPr>
+                <w:sz w:val="22"/>
+                <w:szCs w:val="22"/>
+              </w:rPr>
+              <w:t>posible</w:t>
+            </w:r>
+            <w:r>
+              <w:rPr>
+                <w:sz w:val="22"/>
+                <w:szCs w:val="22"/>
+              </w:rPr>
+              <w:t xml:space="preserve"> </w:t>
+            </w:r>
+            <w:r>
+              <w:rPr>
+                <w:sz w:val="22"/>
+                <w:szCs w:val="22"/>
+              </w:rPr>
+              <w:t>infiltración</w:t>
+            </w:r>
+            <w:r>
+              <w:rPr>
+                <w:sz w:val="22"/>
+                <w:szCs w:val="22"/>
+              </w:rPr>
+              <w:t xml:space="preserve"> de alguien no autorizado que cambie alguna </w:t>
+            </w:r>
+            <w:r>
+              <w:rPr>
+                <w:sz w:val="22"/>
+                <w:szCs w:val="22"/>
+              </w:rPr>
+              <w:t>información</w:t>
+            </w:r>
+            <w:r>
+              <w:rPr>
+                <w:sz w:val="22"/>
+                <w:szCs w:val="22"/>
+              </w:rPr>
+              <w:t>.</w:t>
+            </w:r>
+          </w:p>
+        </w:tc>
+      </w:tr>
+      <w:tr>
+        <w:trPr>
+          <w:trHeight w:val="300"/>
+        </w:trPr>
+        <w:tc>
+          <w:tcPr>
+            <w:tcW w:w="2385" w:type="dxa"/>
+            <w:tcMar/>
+          </w:tcPr>
+          <w:p>
+            <w:pPr>
+              <w:pStyle w:val="Ttulo"/>
+            </w:pPr>
+            <w:r>
+              <w:rPr>
+                <w:sz w:val="22"/>
+                <w:szCs w:val="22"/>
+              </w:rPr>
+              <w:t>RNF-05</w:t>
+            </w:r>
+          </w:p>
+        </w:tc>
+        <w:tc>
+          <w:tcPr>
+            <w:tcW w:w="2385" w:type="dxa"/>
+            <w:tcMar/>
+          </w:tcPr>
+          <w:p>
+            <w:pPr>
+              <w:pStyle w:val="Ttulo"/>
+            </w:pPr>
+            <w:r>
+              <w:rPr>
+                <w:sz w:val="22"/>
+                <w:szCs w:val="22"/>
+              </w:rPr>
+              <w:t>Deberá</w:t>
+            </w:r>
+            <w:r>
+              <w:rPr>
+                <w:sz w:val="22"/>
+                <w:szCs w:val="22"/>
+              </w:rPr>
+              <w:t xml:space="preserve"> generar una copia de </w:t>
+            </w:r>
+            <w:r>
+              <w:rPr>
+                <w:sz w:val="22"/>
+                <w:szCs w:val="22"/>
+              </w:rPr>
+              <w:t>seguridad</w:t>
+            </w:r>
+            <w:r>
+              <w:rPr>
+                <w:sz w:val="22"/>
+                <w:szCs w:val="22"/>
+              </w:rPr>
+              <w:t xml:space="preserve"> en base a </w:t>
+            </w:r>
+            <w:r>
+              <w:rPr>
+                <w:sz w:val="22"/>
+                <w:szCs w:val="22"/>
+              </w:rPr>
+              <w:t>algún</w:t>
+            </w:r>
+            <w:r>
+              <w:rPr>
+                <w:sz w:val="22"/>
+                <w:szCs w:val="22"/>
+              </w:rPr>
+              <w:t xml:space="preserve"> periodo de tiempo o </w:t>
+            </w:r>
+            <w:r>
+              <w:rPr>
+                <w:sz w:val="22"/>
+                <w:szCs w:val="22"/>
+              </w:rPr>
+              <w:t>número</w:t>
+            </w:r>
+            <w:r>
+              <w:rPr>
+                <w:sz w:val="22"/>
+                <w:szCs w:val="22"/>
+              </w:rPr>
+              <w:t xml:space="preserve"> de pedidos.</w:t>
+            </w:r>
+          </w:p>
+        </w:tc>
+        <w:tc>
+          <w:tcPr>
+            <w:tcW w:w="2385" w:type="dxa"/>
+            <w:tcMar/>
+          </w:tcPr>
+          <w:p>
+            <w:pPr>
+              <w:pStyle w:val="Ttulo"/>
+            </w:pPr>
+            <w:r>
+              <w:rPr>
+                <w:sz w:val="22"/>
+                <w:szCs w:val="22"/>
+              </w:rPr>
+              <w:t>S</w:t>
+            </w:r>
+          </w:p>
+        </w:tc>
+        <w:tc>
+          <w:tcPr>
+            <w:tcW w:w="2385" w:type="dxa"/>
+            <w:tcMar/>
+          </w:tcPr>
+          <w:p>
+            <w:pPr>
+              <w:pStyle w:val="Ttulo"/>
+            </w:pPr>
+            <w:r>
+              <w:rPr>
+                <w:sz w:val="22"/>
+                <w:szCs w:val="22"/>
+              </w:rPr>
+              <w:t xml:space="preserve">Se necesita un respaldo para no perder la </w:t>
+            </w:r>
+            <w:r>
+              <w:rPr>
+                <w:sz w:val="22"/>
+                <w:szCs w:val="22"/>
+              </w:rPr>
+              <w:t>información</w:t>
+            </w:r>
+            <w:r>
+              <w:rPr>
+                <w:sz w:val="22"/>
+                <w:szCs w:val="22"/>
+              </w:rPr>
+              <w:t>.</w:t>
+            </w:r>
+          </w:p>
+        </w:tc>
+      </w:tr>
+    </w:tbl>
+    <w:p>
+      <w:pPr>
+        <w:pStyle w:val="Ttulo"/>
         <w:rPr>
           <w:sz w:val="32"/>
           <w:szCs w:val="32"/>
@@ -3751,11 +4711,14 @@
     <w:p>
       <w:pPr>
         <w:pStyle w:val="Ttulo"/>
+      </w:pPr>
+      <w:r>
         <w:rPr>
           <w:sz w:val="32"/>
           <w:szCs w:val="32"/>
         </w:rPr>
-      </w:pPr>
+        <w:t>D. Procesos BPMN</w:t>
+      </w:r>
     </w:p>
     <w:p>
       <w:pPr>
@@ -3768,27 +4731,6 @@
     </w:p>
     <w:p>
       <w:pPr>
-        <w:pStyle w:val="Ttulo"/>
-      </w:pPr>
-      <w:r>
-        <w:rPr>
-          <w:sz w:val="32"/>
-          <w:szCs w:val="32"/>
-        </w:rPr>
-        <w:t>D. Procesos BPMN</w:t>
-      </w:r>
-    </w:p>
-    <w:p>
-      <w:pPr>
-        <w:pStyle w:val="Ttulo"/>
-        <w:rPr>
-          <w:sz w:val="32"/>
-          <w:szCs w:val="32"/>
-        </w:rPr>
-      </w:pPr>
-    </w:p>
-    <w:p>
-      <w:pPr>
         <w:pStyle w:val="Normal"/>
       </w:pPr>
       <w:r>
@@ -3809,7 +4751,7 @@
       </w:pPr>
       <w:r>
         <w:drawing>
-          <wp:inline wp14:editId="32882E55" wp14:anchorId="6ABE7605">
+          <wp:inline wp14:editId="269F67F0" wp14:anchorId="6ABE7605">
             <wp:extent cx="6057900" cy="2667000"/>
             <wp:effectExtent l="0" t="0" r="0" b="0"/>
             <wp:docPr id="2000107106" name="drawing"/>
@@ -3855,51 +4797,42 @@
       <w:pPr>
         <w:pStyle w:val="Normal"/>
         <w:ind w:left="0"/>
+      </w:pPr>
+      <w:r>
         <w:rPr>
           <w:b w:val="1"/>
           <w:bCs w:val="1"/>
         </w:rPr>
-      </w:pPr>
-    </w:p>
-    <w:p>
-      <w:pPr>
-        <w:pStyle w:val="Normal"/>
-        <w:ind w:left="0"/>
+        <w:t xml:space="preserve">BPMN </w:t>
+      </w:r>
+      <w:r>
         <w:rPr>
           <w:b w:val="1"/>
           <w:bCs w:val="1"/>
         </w:rPr>
-      </w:pPr>
-    </w:p>
-    <w:p>
-      <w:pPr>
-        <w:pStyle w:val="Normal"/>
-        <w:ind w:left="0"/>
+        <w:t>to</w:t>
+      </w:r>
+      <w:r>
         <w:rPr>
           <w:b w:val="1"/>
           <w:bCs w:val="1"/>
         </w:rPr>
-      </w:pPr>
-    </w:p>
-    <w:p>
-      <w:pPr>
-        <w:pStyle w:val="Normal"/>
-        <w:ind w:left="0"/>
+        <w:t xml:space="preserve">-be con </w:t>
+      </w:r>
+      <w:r>
         <w:rPr>
           <w:b w:val="1"/>
           <w:bCs w:val="1"/>
         </w:rPr>
-      </w:pPr>
-    </w:p>
-    <w:p>
-      <w:pPr>
-        <w:pStyle w:val="Normal"/>
-        <w:ind w:left="0"/>
+        <w:t>intervención</w:t>
+      </w:r>
+      <w:r>
         <w:rPr>
           <w:b w:val="1"/>
           <w:bCs w:val="1"/>
         </w:rPr>
-      </w:pPr>
+        <w:t xml:space="preserve"> del SIG</w:t>
+      </w:r>
     </w:p>
     <w:p>
       <w:pPr>
@@ -3910,100 +4843,9 @@
           <w:bCs w:val="1"/>
         </w:rPr>
       </w:pPr>
-    </w:p>
-    <w:p>
-      <w:pPr>
-        <w:pStyle w:val="Normal"/>
-        <w:ind w:left="0"/>
-        <w:rPr>
-          <w:b w:val="1"/>
-          <w:bCs w:val="1"/>
-        </w:rPr>
-      </w:pPr>
-    </w:p>
-    <w:p>
-      <w:pPr>
-        <w:pStyle w:val="Normal"/>
-        <w:ind w:left="0"/>
-        <w:rPr>
-          <w:b w:val="1"/>
-          <w:bCs w:val="1"/>
-        </w:rPr>
-      </w:pPr>
-    </w:p>
-    <w:p>
-      <w:pPr>
-        <w:pStyle w:val="Normal"/>
-        <w:ind w:left="0"/>
-        <w:rPr>
-          <w:b w:val="1"/>
-          <w:bCs w:val="1"/>
-        </w:rPr>
-      </w:pPr>
-    </w:p>
-    <w:p>
-      <w:pPr>
-        <w:pStyle w:val="Normal"/>
-        <w:ind w:left="0"/>
-        <w:rPr>
-          <w:b w:val="1"/>
-          <w:bCs w:val="1"/>
-        </w:rPr>
-      </w:pPr>
-    </w:p>
-    <w:p>
-      <w:pPr>
-        <w:pStyle w:val="Normal"/>
-        <w:ind w:left="0"/>
-      </w:pPr>
-      <w:r>
-        <w:rPr>
-          <w:b w:val="1"/>
-          <w:bCs w:val="1"/>
-        </w:rPr>
-        <w:t xml:space="preserve">BPMN </w:t>
-      </w:r>
-      <w:r>
-        <w:rPr>
-          <w:b w:val="1"/>
-          <w:bCs w:val="1"/>
-        </w:rPr>
-        <w:t>to</w:t>
-      </w:r>
-      <w:r>
-        <w:rPr>
-          <w:b w:val="1"/>
-          <w:bCs w:val="1"/>
-        </w:rPr>
-        <w:t xml:space="preserve">-be con </w:t>
-      </w:r>
-      <w:r>
-        <w:rPr>
-          <w:b w:val="1"/>
-          <w:bCs w:val="1"/>
-        </w:rPr>
-        <w:t>intervención</w:t>
-      </w:r>
-      <w:r>
-        <w:rPr>
-          <w:b w:val="1"/>
-          <w:bCs w:val="1"/>
-        </w:rPr>
-        <w:t xml:space="preserve"> del SIG</w:t>
-      </w:r>
-    </w:p>
-    <w:p>
-      <w:pPr>
-        <w:pStyle w:val="Normal"/>
-        <w:ind w:left="0"/>
-        <w:rPr>
-          <w:b w:val="1"/>
-          <w:bCs w:val="1"/>
-        </w:rPr>
-      </w:pPr>
       <w:r>
         <w:drawing>
-          <wp:inline wp14:editId="1B749E1E" wp14:anchorId="0D2F0102">
+          <wp:inline wp14:editId="3E635080" wp14:anchorId="0D2F0102">
             <wp:extent cx="6057900" cy="2667000"/>
             <wp:effectExtent l="0" t="0" r="0" b="0"/>
             <wp:docPr id="594886252" name="drawing"/>
@@ -4059,14 +4901,39 @@
       <w:pPr>
         <w:pStyle w:val="Normal"/>
         <w:ind w:left="0"/>
-      </w:pPr>
-      <w:r>
+        <w:jc w:val="both"/>
+      </w:pPr>
+      <w:r>
+        <w:rPr>
+          <w:rFonts w:ascii="Calibri" w:hAnsi="Calibri" w:eastAsia="Calibri" w:cs="Calibri"/>
+          <w:noProof w:val="0"/>
+          <w:sz w:val="22"/>
+          <w:szCs w:val="22"/>
+          <w:lang w:val="es-419"/>
+        </w:rPr>
+        <w:t>A partir de la comparación entre el proceso actual (AS-IS) y el proceso propuesto (TO-BE), se identifican mejoras orientadas a reducir los tiempos de preparación de los pedidos y fortalecer su gestión y seguimiento. A continuación, se resumen los principales elementos que se automatizan, controlan y miden con la implementación del nuevo proceso.</w:t>
+      </w:r>
+    </w:p>
+    <w:p>
+      <w:pPr>
+        <w:pStyle w:val="Normal"/>
+        <w:ind w:left="0"/>
+        <w:jc w:val="both"/>
         <w:rPr>
           <w:b w:val="1"/>
           <w:bCs w:val="1"/>
         </w:rPr>
-        <w:t>Tabla con breve explicación de las mejoras</w:t>
-      </w:r>
+      </w:pPr>
+    </w:p>
+    <w:p>
+      <w:pPr>
+        <w:pStyle w:val="Normal"/>
+        <w:ind w:left="0"/>
+        <w:rPr>
+          <w:b w:val="1"/>
+          <w:bCs w:val="1"/>
+        </w:rPr>
+      </w:pPr>
     </w:p>
     <w:p>
       <w:pPr>
@@ -4100,7 +4967,8 @@
           </w:tcPr>
           <w:p>
             <w:pPr>
-              <w:pStyle w:val="Normal"/>
+              <w:spacing w:before="0" w:beforeAutospacing="off" w:after="0" w:afterAutospacing="off"/>
+              <w:jc w:val="center"/>
             </w:pPr>
             <w:r>
               <w:rPr>
@@ -4118,7 +4986,8 @@
           </w:tcPr>
           <w:p>
             <w:pPr>
-              <w:pStyle w:val="Normal"/>
+              <w:spacing w:before="0" w:beforeAutospacing="off" w:after="0" w:afterAutospacing="off"/>
+              <w:jc w:val="center"/>
             </w:pPr>
             <w:r>
               <w:rPr>
@@ -4136,7 +5005,8 @@
           </w:tcPr>
           <w:p>
             <w:pPr>
-              <w:pStyle w:val="Normal"/>
+              <w:spacing w:before="0" w:beforeAutospacing="off" w:after="0" w:afterAutospacing="off"/>
+              <w:jc w:val="center"/>
             </w:pPr>
             <w:r>
               <w:rPr>
@@ -4159,20 +5029,18 @@
           </w:tcPr>
           <w:p>
             <w:pPr>
-              <w:pStyle w:val="Prrafodelista"/>
-              <w:numPr>
-                <w:ilvl w:val="0"/>
-                <w:numId w:val="11"/>
-              </w:numPr>
-              <w:jc w:val="both"/>
+              <w:spacing w:before="0" w:beforeAutospacing="off" w:after="0" w:afterAutospacing="off"/>
+            </w:pPr>
+            <w:r>
+              <w:rPr>
+                <w:b w:val="1"/>
+                <w:bCs w:val="1"/>
+              </w:rPr>
+              <w:t>Registro de pedidos:</w:t>
+            </w:r>
+            <w:r>
               <w:rPr/>
-            </w:pPr>
-            <w:r>
-              <w:rPr>
-                <w:b w:val="0"/>
-                <w:bCs w:val="0"/>
-              </w:rPr>
-              <w:t xml:space="preserve">Ingesta de datos: Captura e ingreso automático del pedido desde la tienda web a la base de datos central </w:t>
+              <w:t xml:space="preserve"> incorporación de un registro automático de las solicitudes/pedidos recibidos, evitando depender únicamente del manejo manual del pedido.</w:t>
             </w:r>
           </w:p>
         </w:tc>
@@ -4183,20 +5051,18 @@
           </w:tcPr>
           <w:p>
             <w:pPr>
-              <w:pStyle w:val="Prrafodelista"/>
-              <w:numPr>
-                <w:ilvl w:val="0"/>
-                <w:numId w:val="11"/>
-              </w:numPr>
-              <w:jc w:val="both"/>
+              <w:spacing w:before="0" w:beforeAutospacing="off" w:after="0" w:afterAutospacing="off"/>
+            </w:pPr>
+            <w:r>
+              <w:rPr>
+                <w:b w:val="1"/>
+                <w:bCs w:val="1"/>
+              </w:rPr>
+              <w:t>Seguimiento de pedidos:</w:t>
+            </w:r>
+            <w:r>
               <w:rPr/>
-            </w:pPr>
-            <w:r>
-              <w:rPr>
-                <w:b w:val="0"/>
-                <w:bCs w:val="0"/>
-              </w:rPr>
-              <w:t>Visibilidad de pedidos en riesgo: Identificación visual rápida (semáforo de alerta) de órdenes próximas a vencer su plazo de preparación</w:t>
+              <w:t xml:space="preserve"> control del estado de las solicitudes desde que son recibidas hasta que se gestiona su despacho.</w:t>
             </w:r>
           </w:p>
         </w:tc>
@@ -4207,20 +5073,29 @@
           </w:tcPr>
           <w:p>
             <w:pPr>
-              <w:pStyle w:val="Prrafodelista"/>
-              <w:numPr>
-                <w:ilvl w:val="0"/>
-                <w:numId w:val="11"/>
-              </w:numPr>
-              <w:jc w:val="both"/>
+              <w:spacing w:before="0" w:beforeAutospacing="off" w:after="0" w:afterAutospacing="off"/>
+            </w:pPr>
+            <w:r>
+              <w:rPr>
+                <w:b w:val="1"/>
+                <w:bCs w:val="1"/>
+              </w:rPr>
+              <w:t>Tiempo de preparación del pedido:</w:t>
+            </w:r>
+            <w:r>
               <w:rPr/>
-            </w:pPr>
-            <w:r>
-              <w:rPr>
-                <w:b w:val="0"/>
-                <w:bCs w:val="0"/>
-              </w:rPr>
-              <w:t>Tiempo de Ciclo Interno (KPI Operacional): Medición de las horas transcurridas desde la entrada del pedido hasta su entrega a la empresa de transporte (Meta: 2 días)</w:t>
+              <w:t xml:space="preserve"> reducción del tiempo de preparación desde </w:t>
+            </w:r>
+            <w:r>
+              <w:rPr>
+                <w:b w:val="1"/>
+                <w:bCs w:val="1"/>
+              </w:rPr>
+              <w:t>6 días en el AS-IS a 2 días en el TO-BE</w:t>
+            </w:r>
+            <w:r>
+              <w:rPr/>
+              <w:t>.</w:t>
             </w:r>
           </w:p>
         </w:tc>
@@ -4236,27 +5111,18 @@
           </w:tcPr>
           <w:p>
             <w:pPr>
-              <w:pStyle w:val="Prrafodelista"/>
-              <w:numPr>
-                <w:ilvl w:val="0"/>
-                <w:numId w:val="11"/>
-              </w:numPr>
-              <w:jc w:val="both"/>
+              <w:spacing w:before="0" w:beforeAutospacing="off" w:after="0" w:afterAutospacing="off"/>
+            </w:pPr>
+            <w:r>
+              <w:rPr>
+                <w:b w:val="1"/>
+                <w:bCs w:val="1"/>
+              </w:rPr>
+              <w:t>Notificación al responsable:</w:t>
+            </w:r>
+            <w:r>
               <w:rPr/>
-            </w:pPr>
-            <w:r>
-              <w:rPr>
-                <w:b w:val="0"/>
-                <w:bCs w:val="0"/>
-              </w:rPr>
-              <w:t xml:space="preserve">Priorización de la cola: Clasificación automática de los pedidos, según su </w:t>
-            </w:r>
-            <w:r>
-              <w:rPr>
-                <w:b w:val="0"/>
-                <w:bCs w:val="0"/>
-              </w:rPr>
-              <w:t>antiguedad</w:t>
+              <w:t xml:space="preserve"> el TO-BE incorpora una notificación asociada al pedido para informar al responsable y facilitar su gestión oportuna.</w:t>
             </w:r>
           </w:p>
         </w:tc>
@@ -4267,20 +5133,29 @@
           </w:tcPr>
           <w:p>
             <w:pPr>
-              <w:pStyle w:val="Prrafodelista"/>
-              <w:numPr>
-                <w:ilvl w:val="0"/>
-                <w:numId w:val="11"/>
-              </w:numPr>
-              <w:jc w:val="both"/>
+              <w:spacing w:before="0" w:beforeAutospacing="off" w:after="0" w:afterAutospacing="off"/>
+            </w:pPr>
+            <w:r>
+              <w:rPr>
+                <w:b w:val="1"/>
+                <w:bCs w:val="1"/>
+              </w:rPr>
+              <w:t>Gestión del despacho:</w:t>
+            </w:r>
+            <w:r>
               <w:rPr/>
-            </w:pPr>
-            <w:r>
-              <w:rPr>
-                <w:b w:val="0"/>
-                <w:bCs w:val="0"/>
-              </w:rPr>
-              <w:t>Integridad de la información: Erradicación de pedidos extraviados, traspasados con errores o postergados en planillas manuales</w:t>
+              <w:t xml:space="preserve"> incorporación de una etapa específica de </w:t>
+            </w:r>
+            <w:r>
+              <w:rPr>
+                <w:b w:val="1"/>
+                <w:bCs w:val="1"/>
+              </w:rPr>
+              <w:t>“Gestionar despacho”</w:t>
+            </w:r>
+            <w:r>
+              <w:rPr/>
+              <w:t>, permitiendo controlar el pedido antes del despacho.</w:t>
             </w:r>
           </w:p>
         </w:tc>
@@ -4291,17 +5166,19 @@
           </w:tcPr>
           <w:p>
             <w:pPr>
-              <w:pStyle w:val="Prrafodelista"/>
-              <w:numPr>
-                <w:ilvl w:val="0"/>
-                <w:numId w:val="11"/>
-              </w:numPr>
-              <w:jc w:val="both"/>
-              <w:rPr>
-                <w:b w:val="0"/>
-                <w:bCs w:val="0"/>
-              </w:rPr>
+              <w:spacing w:before="0" w:beforeAutospacing="off" w:after="0" w:afterAutospacing="off"/>
             </w:pPr>
+            <w:r>
+              <w:rPr>
+                <w:b w:val="1"/>
+                <w:bCs w:val="1"/>
+              </w:rPr>
+              <w:t>Reducción del tiempo del proceso:</w:t>
+            </w:r>
+            <w:r>
+              <w:rPr/>
+              <w:t xml:space="preserve"> comparación entre los tiempos del AS-IS y TO-BE para verificar la mejora obtenida con la automatización.</w:t>
+            </w:r>
           </w:p>
         </w:tc>
       </w:tr>
@@ -4316,23 +5193,18 @@
           </w:tcPr>
           <w:p>
             <w:pPr>
-              <w:pStyle w:val="Prrafodelista"/>
-              <w:numPr>
-                <w:ilvl w:val="0"/>
-                <w:numId w:val="11"/>
-              </w:numPr>
-              <w:jc w:val="both"/>
-              <w:rPr>
-                <w:b w:val="0"/>
-                <w:bCs w:val="0"/>
-              </w:rPr>
+              <w:spacing w:before="0" w:beforeAutospacing="off" w:after="0" w:afterAutospacing="off"/>
             </w:pPr>
             <w:r>
               <w:rPr>
-                <w:b w:val="0"/>
-                <w:bCs w:val="0"/>
-              </w:rPr>
-              <w:t>Notificaciones y Alertas: Disparo de recordatorios automáticos al dueño cuando una orden excede las 24 horas en estado "Pendiente"</w:t>
+                <w:b w:val="1"/>
+                <w:bCs w:val="1"/>
+              </w:rPr>
+              <w:t>Flujo de gestión del pedido:</w:t>
+            </w:r>
+            <w:r>
+              <w:rPr/>
+              <w:t xml:space="preserve"> se automatiza parte del tratamiento de la solicitud mediante el registro y la notificación incorporados al nuevo proceso.</w:t>
             </w:r>
           </w:p>
         </w:tc>
@@ -4343,42 +5215,19 @@
           </w:tcPr>
           <w:p>
             <w:pPr>
-              <w:pStyle w:val="Prrafodelista"/>
-              <w:numPr>
-                <w:ilvl w:val="0"/>
-                <w:numId w:val="11"/>
-              </w:numPr>
-              <w:jc w:val="both"/>
-              <w:rPr>
-                <w:b w:val="0"/>
-                <w:bCs w:val="0"/>
-              </w:rPr>
+              <w:spacing w:before="0" w:beforeAutospacing="off" w:after="0" w:afterAutospacing="off"/>
             </w:pPr>
             <w:r>
               <w:rPr>
-                <w:b w:val="0"/>
-                <w:bCs w:val="0"/>
-              </w:rPr>
-              <w:t>Estandarización del flujo: Control estricto del cambio de estados</w:t>
-            </w:r>
-            <w:r>
-              <w:rPr>
-                <w:b w:val="0"/>
-                <w:bCs w:val="0"/>
-              </w:rPr>
-              <w:t>.</w:t>
-            </w:r>
-          </w:p>
-          <w:p>
-            <w:pPr>
-              <w:pStyle w:val="Normal"/>
-              <w:ind w:left="0"/>
-              <w:jc w:val="both"/>
-              <w:rPr>
-                <w:b w:val="0"/>
-                <w:bCs w:val="0"/>
-              </w:rPr>
-            </w:pPr>
+                <w:b w:val="1"/>
+                <w:bCs w:val="1"/>
+              </w:rPr>
+              <w:t>Cumplimiento de los tiempos de preparación:</w:t>
+            </w:r>
+            <w:r>
+              <w:rPr/>
+              <w:t xml:space="preserve"> seguimiento para evitar que los pedidos permanezcan más tiempo del definido en la etapa de preparación.</w:t>
+            </w:r>
           </w:p>
         </w:tc>
         <w:tc>
@@ -4388,16 +5237,30 @@
           </w:tcPr>
           <w:p>
             <w:pPr>
-              <w:pStyle w:val="Prrafodelista"/>
-              <w:numPr>
-                <w:ilvl w:val="0"/>
-                <w:numId w:val="11"/>
-              </w:numPr>
+              <w:spacing w:before="0" w:beforeAutospacing="off" w:after="0" w:afterAutospacing="off"/>
+            </w:pPr>
+            <w:r>
               <w:rPr>
                 <w:b w:val="1"/>
                 <w:bCs w:val="1"/>
               </w:rPr>
-            </w:pPr>
+              <w:t>Cumplimiento del plazo objetivo:</w:t>
+            </w:r>
+            <w:r>
+              <w:rPr/>
+              <w:t xml:space="preserve"> porcentaje de pedidos que logran ser preparados dentro de la nueva meta de </w:t>
+            </w:r>
+            <w:r>
+              <w:rPr>
+                <w:b w:val="1"/>
+                <w:bCs w:val="1"/>
+              </w:rPr>
+              <w:t>2 días</w:t>
+            </w:r>
+            <w:r>
+              <w:rPr/>
+              <w:t>.</w:t>
+            </w:r>
           </w:p>
         </w:tc>
       </w:tr>
@@ -4434,6 +5297,186 @@
     </w:p>
     <w:p>
       <w:pPr>
+        <w:pStyle w:val="Normal"/>
+        <w:ind w:left="0"/>
+        <w:rPr>
+          <w:b w:val="0"/>
+          <w:bCs w:val="0"/>
+        </w:rPr>
+      </w:pPr>
+    </w:p>
+    <w:p>
+      <w:pPr>
+        <w:pStyle w:val="Normal"/>
+        <w:ind w:left="0"/>
+        <w:rPr>
+          <w:b w:val="0"/>
+          <w:bCs w:val="0"/>
+        </w:rPr>
+      </w:pPr>
+    </w:p>
+    <w:p>
+      <w:pPr>
+        <w:pStyle w:val="Normal"/>
+        <w:ind w:left="0"/>
+        <w:rPr>
+          <w:b w:val="0"/>
+          <w:bCs w:val="0"/>
+        </w:rPr>
+      </w:pPr>
+    </w:p>
+    <w:p>
+      <w:pPr>
+        <w:pStyle w:val="Normal"/>
+        <w:ind w:left="0"/>
+        <w:rPr>
+          <w:b w:val="0"/>
+          <w:bCs w:val="0"/>
+        </w:rPr>
+      </w:pPr>
+    </w:p>
+    <w:p>
+      <w:pPr>
+        <w:pStyle w:val="Normal"/>
+        <w:ind w:left="0"/>
+        <w:rPr>
+          <w:b w:val="0"/>
+          <w:bCs w:val="0"/>
+        </w:rPr>
+      </w:pPr>
+    </w:p>
+    <w:p>
+      <w:pPr>
+        <w:pStyle w:val="Normal"/>
+        <w:ind w:left="0"/>
+        <w:rPr>
+          <w:b w:val="0"/>
+          <w:bCs w:val="0"/>
+        </w:rPr>
+      </w:pPr>
+    </w:p>
+    <w:p>
+      <w:pPr>
+        <w:pStyle w:val="Normal"/>
+        <w:ind w:left="0"/>
+        <w:rPr>
+          <w:b w:val="0"/>
+          <w:bCs w:val="0"/>
+        </w:rPr>
+      </w:pPr>
+    </w:p>
+    <w:p>
+      <w:pPr>
+        <w:pStyle w:val="Normal"/>
+        <w:ind w:left="0"/>
+        <w:rPr>
+          <w:b w:val="0"/>
+          <w:bCs w:val="0"/>
+        </w:rPr>
+      </w:pPr>
+    </w:p>
+    <w:p>
+      <w:pPr>
+        <w:pStyle w:val="Normal"/>
+        <w:ind w:left="0"/>
+        <w:rPr>
+          <w:b w:val="0"/>
+          <w:bCs w:val="0"/>
+        </w:rPr>
+      </w:pPr>
+    </w:p>
+    <w:p>
+      <w:pPr>
+        <w:pStyle w:val="Normal"/>
+        <w:ind w:left="0"/>
+        <w:rPr>
+          <w:b w:val="0"/>
+          <w:bCs w:val="0"/>
+        </w:rPr>
+      </w:pPr>
+    </w:p>
+    <w:p>
+      <w:pPr>
+        <w:pStyle w:val="Normal"/>
+        <w:ind w:left="0"/>
+        <w:rPr>
+          <w:b w:val="0"/>
+          <w:bCs w:val="0"/>
+        </w:rPr>
+      </w:pPr>
+    </w:p>
+    <w:p>
+      <w:pPr>
+        <w:pStyle w:val="Normal"/>
+        <w:ind w:left="0"/>
+        <w:rPr>
+          <w:b w:val="0"/>
+          <w:bCs w:val="0"/>
+        </w:rPr>
+      </w:pPr>
+    </w:p>
+    <w:p>
+      <w:pPr>
+        <w:pStyle w:val="Normal"/>
+        <w:ind w:left="0"/>
+        <w:rPr>
+          <w:b w:val="0"/>
+          <w:bCs w:val="0"/>
+        </w:rPr>
+      </w:pPr>
+    </w:p>
+    <w:p>
+      <w:pPr>
+        <w:pStyle w:val="Normal"/>
+        <w:ind w:left="0"/>
+        <w:rPr>
+          <w:b w:val="0"/>
+          <w:bCs w:val="0"/>
+        </w:rPr>
+      </w:pPr>
+    </w:p>
+    <w:p>
+      <w:pPr>
+        <w:pStyle w:val="Normal"/>
+        <w:ind w:left="0"/>
+        <w:rPr>
+          <w:b w:val="0"/>
+          <w:bCs w:val="0"/>
+        </w:rPr>
+      </w:pPr>
+    </w:p>
+    <w:p>
+      <w:pPr>
+        <w:pStyle w:val="Normal"/>
+        <w:ind w:left="0"/>
+        <w:rPr>
+          <w:b w:val="0"/>
+          <w:bCs w:val="0"/>
+        </w:rPr>
+      </w:pPr>
+    </w:p>
+    <w:p>
+      <w:pPr>
+        <w:pStyle w:val="Normal"/>
+        <w:ind w:left="0"/>
+        <w:rPr>
+          <w:b w:val="0"/>
+          <w:bCs w:val="0"/>
+        </w:rPr>
+      </w:pPr>
+    </w:p>
+    <w:p>
+      <w:pPr>
+        <w:pStyle w:val="Normal"/>
+        <w:ind w:left="0"/>
+        <w:rPr>
+          <w:b w:val="0"/>
+          <w:bCs w:val="0"/>
+        </w:rPr>
+      </w:pPr>
+    </w:p>
+    <w:p>
+      <w:pPr>
         <w:pStyle w:val="Ttulo"/>
       </w:pPr>
       <w:r>
@@ -4448,41 +5491,468 @@
       <w:pPr>
         <w:pStyle w:val="Ttulo"/>
         <w:rPr>
+          <w:sz w:val="22"/>
+          <w:szCs w:val="22"/>
+        </w:rPr>
+      </w:pPr>
+      <w:r>
+        <w:drawing>
+          <wp:inline wp14:editId="415EFAD6" wp14:anchorId="562513F0">
+            <wp:extent cx="6649963" cy="3561670"/>
+            <wp:effectExtent l="0" t="0" r="0" b="0"/>
+            <wp:docPr id="2062252609" name="drawing"/>
+            <wp:cNvGraphicFramePr>
+              <a:graphicFrameLocks noChangeAspect="1"/>
+            </wp:cNvGraphicFramePr>
+            <a:graphic>
+              <a:graphicData xmlns:a="http://schemas.openxmlformats.org/drawingml/2006/main" uri="http://schemas.openxmlformats.org/drawingml/2006/picture">
+                <pic:pic xmlns:pic="http://schemas.openxmlformats.org/drawingml/2006/picture">
+                  <pic:nvPicPr>
+                    <pic:cNvPr id="2062252609" name="Picture 2062252609"/>
+                    <pic:cNvPicPr/>
+                  </pic:nvPicPr>
+                  <pic:blipFill>
+                    <a:blip xmlns:r="http://schemas.openxmlformats.org/officeDocument/2006/relationships" r:embed="rId539167495">
+                      <a:extLst>
+                        <a:ext uri="{28A0092B-C50C-407E-A947-70E740481C1C}">
+                          <a14:useLocalDpi xmlns:a14="http://schemas.microsoft.com/office/drawing/2010/main"/>
+                        </a:ext>
+                      </a:extLst>
+                    </a:blip>
+                    <a:stretch>
+                      <a:fillRect/>
+                    </a:stretch>
+                  </pic:blipFill>
+                  <pic:spPr>
+                    <a:xfrm rot="0">
+                      <a:off x="0" y="0"/>
+                      <a:ext cx="6649963" cy="3561670"/>
+                    </a:xfrm>
+                    <a:prstGeom prst="rect">
+                      <a:avLst/>
+                    </a:prstGeom>
+                  </pic:spPr>
+                </pic:pic>
+              </a:graphicData>
+            </a:graphic>
+          </wp:inline>
+        </w:drawing>
+      </w:r>
+      <w:r>
+        <w:rPr>
+          <w:sz w:val="22"/>
+          <w:szCs w:val="22"/>
+        </w:rPr>
+        <w:t xml:space="preserve">Del modelo adjuntado, se puede ver que las entidades principales, son Clientes, Pedidos, Despacho, Producto, </w:t>
+      </w:r>
+      <w:r>
+        <w:rPr>
+          <w:sz w:val="22"/>
+          <w:szCs w:val="22"/>
+        </w:rPr>
+        <w:t>Detalle_Pedido</w:t>
+      </w:r>
+      <w:r>
+        <w:rPr>
+          <w:sz w:val="22"/>
+          <w:szCs w:val="22"/>
+        </w:rPr>
+        <w:t>, donde cada una</w:t>
+      </w:r>
+      <w:r>
+        <w:rPr>
+          <w:sz w:val="22"/>
+          <w:szCs w:val="22"/>
+        </w:rPr>
+        <w:t xml:space="preserve"> de </w:t>
+      </w:r>
+      <w:bookmarkStart w:name="_Int_e7boZMBj" w:id="1134386539"/>
+      <w:r>
+        <w:rPr>
+          <w:sz w:val="22"/>
+          <w:szCs w:val="22"/>
+        </w:rPr>
+        <w:t>estas cuenta</w:t>
+      </w:r>
+      <w:bookmarkEnd w:id="1134386539"/>
+      <w:r>
+        <w:rPr>
+          <w:sz w:val="22"/>
+          <w:szCs w:val="22"/>
+        </w:rPr>
+        <w:t xml:space="preserve"> con sus atributos y </w:t>
+      </w:r>
+      <w:r>
+        <w:rPr>
+          <w:sz w:val="22"/>
+          <w:szCs w:val="22"/>
+        </w:rPr>
+        <w:t>Clave</w:t>
+      </w:r>
+      <w:r>
+        <w:rPr>
+          <w:sz w:val="22"/>
+          <w:szCs w:val="22"/>
+        </w:rPr>
+        <w:t xml:space="preserve">s primarias. Además de sus </w:t>
+      </w:r>
+      <w:r>
+        <w:rPr>
+          <w:sz w:val="22"/>
+          <w:szCs w:val="22"/>
+        </w:rPr>
+        <w:t xml:space="preserve">cardinalides. </w:t>
+      </w:r>
+    </w:p>
+    <w:p>
+      <w:pPr>
+        <w:pStyle w:val="Normal"/>
+        <w:jc w:val="both"/>
+        <w:rPr>
+          <w:highlight w:val="yellow"/>
+        </w:rPr>
+      </w:pPr>
+    </w:p>
+    <w:p>
+      <w:pPr>
+        <w:pStyle w:val="Normal"/>
+        <w:jc w:val="both"/>
+        <w:rPr>
+          <w:i w:val="0"/>
+          <w:iCs w:val="0"/>
+        </w:rPr>
+      </w:pPr>
+      <w:r>
+        <w:rPr>
+          <w:i w:val="0"/>
+          <w:iCs w:val="0"/>
+        </w:rPr>
+        <w:t>Por último, en esta parte hace falta justificar cómo el modelo ER, sostiene el proceso BPMN.</w:t>
+      </w:r>
+      <w:r>
+        <w:rPr>
+          <w:i w:val="0"/>
+          <w:iCs w:val="0"/>
+        </w:rPr>
+        <w:t xml:space="preserve"> </w:t>
+      </w:r>
+    </w:p>
+    <w:p>
+      <w:pPr>
+        <w:pStyle w:val="Normal"/>
+        <w:jc w:val="both"/>
+        <w:rPr>
+          <w:i w:val="0"/>
+          <w:iCs w:val="0"/>
+        </w:rPr>
+      </w:pPr>
+      <w:r>
+        <w:rPr>
+          <w:i w:val="0"/>
+          <w:iCs w:val="0"/>
+        </w:rPr>
+        <w:t>El modelo ER, sostiene el proceso rediseñado (</w:t>
+      </w:r>
+      <w:r>
+        <w:rPr>
+          <w:i w:val="0"/>
+          <w:iCs w:val="0"/>
+        </w:rPr>
+        <w:t>to</w:t>
+      </w:r>
+      <w:r>
+        <w:rPr>
+          <w:i w:val="0"/>
+          <w:iCs w:val="0"/>
+        </w:rPr>
+        <w:t>-be)</w:t>
+      </w:r>
+      <w:r>
+        <w:rPr>
+          <w:i w:val="0"/>
+          <w:iCs w:val="0"/>
+        </w:rPr>
+        <w:t xml:space="preserve">. Cuando el cliente realiza una compra en la web, la entrada del BPMN ejecuta un </w:t>
+      </w:r>
+      <w:r>
+        <w:rPr>
+          <w:i w:val="0"/>
+          <w:iCs w:val="0"/>
+        </w:rPr>
+        <w:t>Insert</w:t>
+      </w:r>
+      <w:r>
+        <w:rPr>
+          <w:i w:val="0"/>
+          <w:iCs w:val="0"/>
+        </w:rPr>
+        <w:t xml:space="preserve"> en </w:t>
+      </w:r>
+      <w:r>
+        <w:rPr>
+          <w:i w:val="0"/>
+          <w:iCs w:val="0"/>
+        </w:rPr>
+        <w:t>Cl</w:t>
+      </w:r>
+      <w:r>
+        <w:rPr>
+          <w:i w:val="0"/>
+          <w:iCs w:val="0"/>
+        </w:rPr>
+        <w:t xml:space="preserve">iente, Pedido (estado = "Pendiente") y </w:t>
+      </w:r>
+      <w:r>
+        <w:rPr>
+          <w:i w:val="0"/>
+          <w:iCs w:val="0"/>
+        </w:rPr>
+        <w:t>DetallePedido</w:t>
+      </w:r>
+      <w:r>
+        <w:rPr>
+          <w:i w:val="0"/>
+          <w:iCs w:val="0"/>
+        </w:rPr>
+        <w:t xml:space="preserve">, eso sí con </w:t>
+      </w:r>
+      <w:r>
+        <w:rPr>
+          <w:i w:val="0"/>
+          <w:iCs w:val="0"/>
+        </w:rPr>
+        <w:t>preciounitario</w:t>
+      </w:r>
+      <w:r>
+        <w:rPr>
+          <w:i w:val="0"/>
+          <w:iCs w:val="0"/>
+        </w:rPr>
+        <w:t xml:space="preserve"> congelado. </w:t>
+      </w:r>
+      <w:r>
+        <w:rPr>
+          <w:i w:val="0"/>
+          <w:iCs w:val="0"/>
+        </w:rPr>
+        <w:t xml:space="preserve">Para lograr evitar las postergaciones que se identificaron en el problema, el SIG consulta la base de datos y compara la hora actual con </w:t>
+      </w:r>
+      <w:r>
+        <w:rPr>
+          <w:i w:val="0"/>
+          <w:iCs w:val="0"/>
+        </w:rPr>
+        <w:t>Pedido.fechacompra</w:t>
+      </w:r>
+      <w:r>
+        <w:rPr>
+          <w:i w:val="0"/>
+          <w:iCs w:val="0"/>
+        </w:rPr>
+        <w:t xml:space="preserve">. </w:t>
+      </w:r>
+      <w:r>
+        <w:rPr>
+          <w:i w:val="0"/>
+          <w:iCs w:val="0"/>
+        </w:rPr>
+        <w:t>Si es que han transcurrido más de 24 horas se despliega una alerta visual.</w:t>
+      </w:r>
+      <w:r>
+        <w:rPr>
+          <w:i w:val="0"/>
+          <w:iCs w:val="0"/>
+        </w:rPr>
+        <w:t xml:space="preserve"> Así para después, al momento del empaque y entrega al </w:t>
+      </w:r>
+      <w:r>
+        <w:rPr>
+          <w:i w:val="0"/>
+          <w:iCs w:val="0"/>
+        </w:rPr>
+        <w:t>transporte</w:t>
+      </w:r>
+      <w:r>
+        <w:rPr>
+          <w:i w:val="0"/>
+          <w:iCs w:val="0"/>
+        </w:rPr>
+        <w:t xml:space="preserve"> para despachar, el dueño </w:t>
+      </w:r>
+      <w:r>
+        <w:rPr>
+          <w:i w:val="0"/>
+          <w:iCs w:val="0"/>
+        </w:rPr>
+        <w:t>actualiza</w:t>
+      </w:r>
+      <w:r>
+        <w:rPr>
+          <w:i w:val="0"/>
+          <w:iCs w:val="0"/>
+        </w:rPr>
+        <w:t xml:space="preserve"> el estado en pantalla, lo que genera una actualización en </w:t>
+      </w:r>
+      <w:r>
+        <w:rPr>
+          <w:i w:val="0"/>
+          <w:iCs w:val="0"/>
+        </w:rPr>
+        <w:t>Pedido.esta</w:t>
+      </w:r>
+      <w:r>
+        <w:rPr>
+          <w:i w:val="0"/>
+          <w:iCs w:val="0"/>
+        </w:rPr>
+        <w:t>dopedido</w:t>
+      </w:r>
+      <w:r>
+        <w:rPr>
+          <w:i w:val="0"/>
+          <w:iCs w:val="0"/>
+        </w:rPr>
+        <w:t xml:space="preserve"> a "Despachado/Enviado", registrando la marca de tiempo en </w:t>
+      </w:r>
+      <w:r>
+        <w:rPr>
+          <w:i w:val="0"/>
+          <w:iCs w:val="0"/>
+        </w:rPr>
+        <w:t>Despacho.fecha</w:t>
+      </w:r>
+      <w:r>
+        <w:rPr>
+          <w:i w:val="0"/>
+          <w:iCs w:val="0"/>
+        </w:rPr>
+        <w:t>_</w:t>
+      </w:r>
+      <w:r>
+        <w:rPr>
+          <w:i w:val="0"/>
+          <w:iCs w:val="0"/>
+        </w:rPr>
+        <w:t>entrega_transporte</w:t>
+      </w:r>
+      <w:r>
+        <w:rPr>
+          <w:i w:val="0"/>
+          <w:iCs w:val="0"/>
+        </w:rPr>
+        <w:t xml:space="preserve">. Finalmente, se puede calcular un indicador clave para identificar el éxito del SIG, que sería mediante la resta de </w:t>
+      </w:r>
+      <w:r>
+        <w:rPr>
+          <w:i w:val="0"/>
+          <w:iCs w:val="0"/>
+        </w:rPr>
+        <w:t>Despacho.fecha_entrega_tra</w:t>
+      </w:r>
+      <w:r>
+        <w:rPr>
+          <w:i w:val="0"/>
+          <w:iCs w:val="0"/>
+        </w:rPr>
+        <w:t>nspor</w:t>
+      </w:r>
+      <w:r>
+        <w:rPr>
+          <w:i w:val="0"/>
+          <w:iCs w:val="0"/>
+        </w:rPr>
+        <w:t>te</w:t>
+      </w:r>
+      <w:r>
+        <w:rPr>
+          <w:i w:val="0"/>
+          <w:iCs w:val="0"/>
+        </w:rPr>
+        <w:t xml:space="preserve"> – </w:t>
+      </w:r>
+      <w:r>
+        <w:rPr>
+          <w:i w:val="0"/>
+          <w:iCs w:val="0"/>
+        </w:rPr>
+        <w:t>Pedido.fecha_compra</w:t>
+      </w:r>
+      <w:r>
+        <w:rPr>
+          <w:i w:val="0"/>
+          <w:iCs w:val="0"/>
+        </w:rPr>
+        <w:t xml:space="preserve">, esperando ver como máximo los 2 días propuestos. </w:t>
+      </w:r>
+    </w:p>
+    <w:p>
+      <w:pPr>
+        <w:pStyle w:val="Normal"/>
+      </w:pPr>
+    </w:p>
+    <w:p>
+      <w:pPr>
+        <w:pStyle w:val="Normal"/>
+      </w:pPr>
+    </w:p>
+    <w:p>
+      <w:pPr>
+        <w:pStyle w:val="Normal"/>
+      </w:pPr>
+    </w:p>
+    <w:p>
+      <w:pPr>
+        <w:pStyle w:val="Normal"/>
+      </w:pPr>
+    </w:p>
+    <w:p>
+      <w:pPr>
+        <w:pStyle w:val="Normal"/>
+      </w:pPr>
+    </w:p>
+    <w:p>
+      <w:pPr>
+        <w:pStyle w:val="Ttulo"/>
+      </w:pPr>
+    </w:p>
+    <w:p>
+      <w:pPr>
+        <w:pStyle w:val="Ttulo"/>
+      </w:pPr>
+    </w:p>
+    <w:p>
+      <w:pPr>
+        <w:pStyle w:val="Ttulo"/>
+        <w:rPr>
           <w:sz w:val="32"/>
           <w:szCs w:val="32"/>
         </w:rPr>
       </w:pPr>
-    </w:p>
-    <w:p>
-      <w:pPr>
-        <w:pStyle w:val="Ttulo"/>
+      <w:r>
         <w:rPr>
           <w:sz w:val="32"/>
           <w:szCs w:val="32"/>
         </w:rPr>
-      </w:pPr>
-    </w:p>
-    <w:p>
-      <w:pPr>
-        <w:pStyle w:val="Ttulo"/>
+        <w:t xml:space="preserve">F. Arquitectura lógica y </w:t>
+      </w:r>
+      <w:r>
         <w:rPr>
           <w:sz w:val="32"/>
           <w:szCs w:val="32"/>
         </w:rPr>
-      </w:pPr>
-    </w:p>
-    <w:p>
-      <w:pPr>
-        <w:pStyle w:val="Ttulo"/>
+        <w:t>stack</w:t>
+      </w:r>
+      <w:r>
         <w:rPr>
           <w:sz w:val="32"/>
           <w:szCs w:val="32"/>
         </w:rPr>
-      </w:pPr>
-    </w:p>
-    <w:p>
-      <w:pPr>
-        <w:pStyle w:val="Ttulo"/>
+        <w:t xml:space="preserve"> tentativo</w:t>
+      </w:r>
+    </w:p>
+    <w:p>
+      <w:pPr>
+        <w:pStyle w:val="Normal"/>
         <w:rPr>
           <w:sz w:val="32"/>
           <w:szCs w:val="32"/>
@@ -4500,94 +5970,31 @@
     </w:p>
     <w:p>
       <w:pPr>
-        <w:pStyle w:val="Ttulo"/>
-        <w:rPr>
-          <w:sz w:val="32"/>
-          <w:szCs w:val="32"/>
-        </w:rPr>
-      </w:pPr>
-    </w:p>
-    <w:p>
-      <w:pPr>
-        <w:pStyle w:val="Ttulo"/>
-        <w:rPr>
-          <w:sz w:val="32"/>
-          <w:szCs w:val="32"/>
-        </w:rPr>
-      </w:pPr>
-    </w:p>
-    <w:p>
-      <w:pPr>
-        <w:pStyle w:val="Ttulo"/>
-        <w:rPr>
-          <w:sz w:val="32"/>
-          <w:szCs w:val="32"/>
-        </w:rPr>
-      </w:pPr>
-    </w:p>
-    <w:p>
-      <w:pPr>
-        <w:pStyle w:val="Ttulo"/>
-        <w:rPr>
-          <w:sz w:val="32"/>
-          <w:szCs w:val="32"/>
-        </w:rPr>
-      </w:pPr>
-    </w:p>
-    <w:p>
-      <w:pPr>
-        <w:pStyle w:val="Ttulo"/>
-        <w:rPr>
-          <w:sz w:val="32"/>
-          <w:szCs w:val="32"/>
-        </w:rPr>
-      </w:pPr>
-    </w:p>
-    <w:p>
-      <w:pPr>
-        <w:pStyle w:val="Ttulo"/>
-        <w:rPr>
-          <w:sz w:val="32"/>
-          <w:szCs w:val="32"/>
-        </w:rPr>
-      </w:pPr>
-      <w:r>
-        <w:rPr>
-          <w:sz w:val="32"/>
-          <w:szCs w:val="32"/>
-        </w:rPr>
-        <w:t xml:space="preserve">F. Arquitectura lógica y </w:t>
-      </w:r>
-      <w:r>
-        <w:rPr>
-          <w:sz w:val="32"/>
-          <w:szCs w:val="32"/>
-        </w:rPr>
-        <w:t>stack</w:t>
-      </w:r>
-      <w:r>
-        <w:rPr>
-          <w:sz w:val="32"/>
-          <w:szCs w:val="32"/>
-        </w:rPr>
-        <w:t xml:space="preserve"> tentativo</w:t>
-      </w:r>
-    </w:p>
-    <w:p>
-      <w:pPr>
-        <w:pStyle w:val="Normal"/>
-        <w:rPr>
-          <w:sz w:val="32"/>
-          <w:szCs w:val="32"/>
-        </w:rPr>
-      </w:pPr>
-    </w:p>
-    <w:p>
-      <w:pPr>
-        <w:pStyle w:val="Ttulo"/>
-        <w:rPr>
-          <w:sz w:val="32"/>
-          <w:szCs w:val="32"/>
+        <w:pStyle w:val="Normal"/>
+        <w:ind w:left="0"/>
+        <w:rPr>
+          <w:b w:val="0"/>
+          <w:bCs w:val="0"/>
+        </w:rPr>
+      </w:pPr>
+    </w:p>
+    <w:p>
+      <w:pPr>
+        <w:pStyle w:val="Normal"/>
+        <w:ind w:left="0"/>
+        <w:rPr>
+          <w:b w:val="0"/>
+          <w:bCs w:val="0"/>
+        </w:rPr>
+      </w:pPr>
+    </w:p>
+    <w:p>
+      <w:pPr>
+        <w:pStyle w:val="Normal"/>
+        <w:ind w:left="0"/>
+        <w:rPr>
+          <w:b w:val="0"/>
+          <w:bCs w:val="0"/>
         </w:rPr>
       </w:pPr>
     </w:p>
@@ -5048,7 +6455,7 @@
     </w:pPr>
     <w:r>
       <w:drawing>
-        <wp:anchor distT="0" distB="0" distL="114300" distR="114300" simplePos="0" relativeHeight="251658240" behindDoc="1" locked="0" layoutInCell="1" allowOverlap="1" wp14:anchorId="248B1DAB" wp14:editId="2C14E321">
+        <wp:anchor distT="0" distB="0" distL="114300" distR="114300" simplePos="0" relativeHeight="251658240" behindDoc="1" locked="0" layoutInCell="1" allowOverlap="1" wp14:anchorId="248B1DAB" wp14:editId="2B780CE5">
           <wp:simplePos x="0" y="0"/>
           <wp:positionH relativeFrom="column">
             <wp:posOffset>-695325</wp:posOffset>
@@ -5107,8 +6514,195 @@
 </w:hdr>
 </file>
 
+<file path=word/intelligence2.xml><?xml version="1.0" encoding="utf-8"?>
+<int2:intelligence xmlns:int2="http://schemas.microsoft.com/office/intelligence/2020/intelligence">
+  <int2:observations>
+    <int2:textHash int2:hashCode="7DuunLJiLQQj7d" int2:id="qoXDc3Xg">
+      <int2:state int2:type="spell" int2:value="Rejected"/>
+    </int2:textHash>
+    <int2:textHash int2:hashCode="pJMNf+KpNTg46e" int2:id="EfPyHOlk">
+      <int2:state int2:type="spell" int2:value="Rejected"/>
+    </int2:textHash>
+    <int2:bookmark int2:bookmarkName="_Int_e7boZMBj" int2:invalidationBookmarkName="" int2:hashCode="Ab58ENdbIBlk0q" int2:id="R1vBTtDV">
+      <int2:state int2:type="gram" int2:value="Rejected"/>
+    </int2:bookmark>
+  </int2:observations>
+  <int2:intelligenceSettings/>
+</int2:intelligence>
+</file>
+
 <file path=word/numbering.xml><?xml version="1.0" encoding="utf-8"?>
 <w:numbering xmlns:wpc="http://schemas.microsoft.com/office/word/2010/wordprocessingCanvas" xmlns:cx="http://schemas.microsoft.com/office/drawing/2014/chartex" xmlns:cx1="http://schemas.microsoft.com/office/drawing/2015/9/8/chartex" xmlns:cx2="http://schemas.microsoft.com/office/drawing/2015/10/21/chartex" xmlns:cx3="http://schemas.microsoft.com/office/drawing/2016/5/9/chartex" xmlns:cx4="http://schemas.microsoft.com/office/drawing/2016/5/10/chartex" xmlns:cx5="http://schemas.microsoft.com/office/drawing/2016/5/11/chartex" xmlns:cx6="http://schemas.microsoft.com/office/drawing/2016/5/12/chartex" xmlns:cx7="http://schemas.microsoft.com/office/drawing/2016/5/13/chartex" xmlns:cx8="http://schemas.microsoft.com/office/drawing/2016/5/14/chartex" xmlns:mc="http://schemas.openxmlformats.org/markup-compatibility/2006" xmlns:aink="http://schemas.microsoft.com/office/drawing/2016/ink" xmlns:am3d="http://schemas.microsoft.com/office/drawing/2017/model3d" xmlns:o="urn:schemas-microsoft-com:office:office" xmlns:oel="http://schemas.microsoft.com/office/2019/extlst" xmlns:r="http://schemas.openxmlformats.org/officeDocument/2006/relationships" xmlns:m="http://schemas.openxmlformats.org/officeDocument/2006/math" xmlns:v="urn:schemas-microsoft-com:vml" xmlns:wp14="http://schemas.microsoft.com/office/word/2010/wordprocessingDrawing" xmlns:wp="http://schemas.openxmlformats.org/drawingml/2006/wordprocessingDrawing" xmlns:w10="urn:schemas-microsoft-com:office:word" xmlns:w="http://schemas.openxmlformats.org/wordprocessingml/2006/main" xmlns:w14="http://schemas.microsoft.com/office/word/2010/wordml" xmlns:w15="http://schemas.microsoft.com/office/word/2012/wordml" xmlns:w16cex="http://schemas.microsoft.com/office/word/2018/wordml/cex" xmlns:w16cid="http://schemas.microsoft.com/office/word/2016/wordml/cid" xmlns:w16="http://schemas.microsoft.com/office/word/2018/wordml" xmlns:w16du="http://schemas.microsoft.com/office/word/2023/wordml/word16du" xmlns:w16sdtdh="http://schemas.microsoft.com/office/word/2020/wordml/sdtdatahash" xmlns:w16sdtfl="http://schemas.microsoft.com/office/word/2024/wordml/sdtformatlock" xmlns:w16se="http://schemas.microsoft.com/office/word/2015/wordml/symex" xmlns:wpg="http://schemas.microsoft.com/office/word/2010/wordprocessingGroup" xmlns:wpi="http://schemas.microsoft.com/office/word/2010/wordprocessingInk" xmlns:wne="http://schemas.microsoft.com/office/word/2006/wordml" xmlns:wps="http://schemas.microsoft.com/office/word/2010/wordprocessingShape" mc:Ignorable="w14 w15 w16se w16cid w16 w16cex w16sdtdh w16sdtfl w16du wp14">
+  <w:abstractNum xmlns:w="http://schemas.openxmlformats.org/wordprocessingml/2006/main" w:abstractNumId="12">
+    <w:nsid w:val="5284d148"/>
+    <w:multiLevelType xmlns:w="http://schemas.openxmlformats.org/wordprocessingml/2006/main" w:val="hybridMultilevel"/>
+    <w:lvl xmlns:w="http://schemas.openxmlformats.org/wordprocessingml/2006/main" w:ilvl="0">
+      <w:start w:val="1"/>
+      <w:numFmt w:val="upperLetter"/>
+      <w:lvlText w:val="%1."/>
+      <w:lvlJc w:val="left"/>
+      <w:pPr>
+        <w:ind w:left="720" w:hanging="360"/>
+      </w:pPr>
+    </w:lvl>
+    <w:lvl xmlns:w="http://schemas.openxmlformats.org/wordprocessingml/2006/main" w:ilvl="1">
+      <w:start w:val="1"/>
+      <w:numFmt w:val="lowerLetter"/>
+      <w:lvlText w:val="%2."/>
+      <w:lvlJc w:val="left"/>
+      <w:pPr>
+        <w:ind w:left="1440" w:hanging="360"/>
+      </w:pPr>
+    </w:lvl>
+    <w:lvl xmlns:w="http://schemas.openxmlformats.org/wordprocessingml/2006/main" w:ilvl="2">
+      <w:start w:val="1"/>
+      <w:numFmt w:val="lowerRoman"/>
+      <w:lvlText w:val="%3."/>
+      <w:lvlJc w:val="right"/>
+      <w:pPr>
+        <w:ind w:left="2160" w:hanging="180"/>
+      </w:pPr>
+    </w:lvl>
+    <w:lvl xmlns:w="http://schemas.openxmlformats.org/wordprocessingml/2006/main" w:ilvl="3">
+      <w:start w:val="1"/>
+      <w:numFmt w:val="decimal"/>
+      <w:lvlText w:val="%4."/>
+      <w:lvlJc w:val="left"/>
+      <w:pPr>
+        <w:ind w:left="2880" w:hanging="360"/>
+      </w:pPr>
+    </w:lvl>
+    <w:lvl xmlns:w="http://schemas.openxmlformats.org/wordprocessingml/2006/main" w:ilvl="4">
+      <w:start w:val="1"/>
+      <w:numFmt w:val="lowerLetter"/>
+      <w:lvlText w:val="%5."/>
+      <w:lvlJc w:val="left"/>
+      <w:pPr>
+        <w:ind w:left="3600" w:hanging="360"/>
+      </w:pPr>
+    </w:lvl>
+    <w:lvl xmlns:w="http://schemas.openxmlformats.org/wordprocessingml/2006/main" w:ilvl="5">
+      <w:start w:val="1"/>
+      <w:numFmt w:val="lowerRoman"/>
+      <w:lvlText w:val="%6."/>
+      <w:lvlJc w:val="right"/>
+      <w:pPr>
+        <w:ind w:left="4320" w:hanging="180"/>
+      </w:pPr>
+    </w:lvl>
+    <w:lvl xmlns:w="http://schemas.openxmlformats.org/wordprocessingml/2006/main" w:ilvl="6">
+      <w:start w:val="1"/>
+      <w:numFmt w:val="decimal"/>
+      <w:lvlText w:val="%7."/>
+      <w:lvlJc w:val="left"/>
+      <w:pPr>
+        <w:ind w:left="5040" w:hanging="360"/>
+      </w:pPr>
+    </w:lvl>
+    <w:lvl xmlns:w="http://schemas.openxmlformats.org/wordprocessingml/2006/main" w:ilvl="7">
+      <w:start w:val="1"/>
+      <w:numFmt w:val="lowerLetter"/>
+      <w:lvlText w:val="%8."/>
+      <w:lvlJc w:val="left"/>
+      <w:pPr>
+        <w:ind w:left="5760" w:hanging="360"/>
+      </w:pPr>
+    </w:lvl>
+    <w:lvl xmlns:w="http://schemas.openxmlformats.org/wordprocessingml/2006/main" w:ilvl="8">
+      <w:start w:val="1"/>
+      <w:numFmt w:val="lowerRoman"/>
+      <w:lvlText w:val="%9."/>
+      <w:lvlJc w:val="right"/>
+      <w:pPr>
+        <w:ind w:left="6480" w:hanging="180"/>
+      </w:pPr>
+    </w:lvl>
+  </w:abstractNum>
+  <w:abstractNum xmlns:w="http://schemas.openxmlformats.org/wordprocessingml/2006/main" w:abstractNumId="11">
+    <w:nsid w:val="fb0add0"/>
+    <w:multiLevelType xmlns:w="http://schemas.openxmlformats.org/wordprocessingml/2006/main" w:val="hybridMultilevel"/>
+    <w:lvl xmlns:w="http://schemas.openxmlformats.org/wordprocessingml/2006/main" w:ilvl="0">
+      <w:start w:val="1"/>
+      <w:numFmt w:val="upperLetter"/>
+      <w:lvlText w:val="%1."/>
+      <w:lvlJc w:val="left"/>
+      <w:pPr>
+        <w:ind w:left="720" w:hanging="360"/>
+      </w:pPr>
+    </w:lvl>
+    <w:lvl xmlns:w="http://schemas.openxmlformats.org/wordprocessingml/2006/main" w:ilvl="1">
+      <w:start w:val="1"/>
+      <w:numFmt w:val="lowerLetter"/>
+      <w:lvlText w:val="%2."/>
+      <w:lvlJc w:val="left"/>
+      <w:pPr>
+        <w:ind w:left="1440" w:hanging="360"/>
+      </w:pPr>
+    </w:lvl>
+    <w:lvl xmlns:w="http://schemas.openxmlformats.org/wordprocessingml/2006/main" w:ilvl="2">
+      <w:start w:val="1"/>
+      <w:numFmt w:val="lowerRoman"/>
+      <w:lvlText w:val="%3."/>
+      <w:lvlJc w:val="right"/>
+      <w:pPr>
+        <w:ind w:left="2160" w:hanging="180"/>
+      </w:pPr>
+    </w:lvl>
+    <w:lvl xmlns:w="http://schemas.openxmlformats.org/wordprocessingml/2006/main" w:ilvl="3">
+      <w:start w:val="1"/>
+      <w:numFmt w:val="decimal"/>
+      <w:lvlText w:val="%4."/>
+      <w:lvlJc w:val="left"/>
+      <w:pPr>
+        <w:ind w:left="2880" w:hanging="360"/>
+      </w:pPr>
+    </w:lvl>
+    <w:lvl xmlns:w="http://schemas.openxmlformats.org/wordprocessingml/2006/main" w:ilvl="4">
+      <w:start w:val="1"/>
+      <w:numFmt w:val="lowerLetter"/>
+      <w:lvlText w:val="%5."/>
+      <w:lvlJc w:val="left"/>
+      <w:pPr>
+        <w:ind w:left="3600" w:hanging="360"/>
+      </w:pPr>
+    </w:lvl>
+    <w:lvl xmlns:w="http://schemas.openxmlformats.org/wordprocessingml/2006/main" w:ilvl="5">
+      <w:start w:val="1"/>
+      <w:numFmt w:val="lowerRoman"/>
+      <w:lvlText w:val="%6."/>
+      <w:lvlJc w:val="right"/>
+      <w:pPr>
+        <w:ind w:left="4320" w:hanging="180"/>
+      </w:pPr>
+    </w:lvl>
+    <w:lvl xmlns:w="http://schemas.openxmlformats.org/wordprocessingml/2006/main" w:ilvl="6">
+      <w:start w:val="1"/>
+      <w:numFmt w:val="decimal"/>
+      <w:lvlText w:val="%7."/>
+      <w:lvlJc w:val="left"/>
+      <w:pPr>
+        <w:ind w:left="5040" w:hanging="360"/>
+      </w:pPr>
+    </w:lvl>
+    <w:lvl xmlns:w="http://schemas.openxmlformats.org/wordprocessingml/2006/main" w:ilvl="7">
+      <w:start w:val="1"/>
+      <w:numFmt w:val="lowerLetter"/>
+      <w:lvlText w:val="%8."/>
+      <w:lvlJc w:val="left"/>
+      <w:pPr>
+        <w:ind w:left="5760" w:hanging="360"/>
+      </w:pPr>
+    </w:lvl>
+    <w:lvl xmlns:w="http://schemas.openxmlformats.org/wordprocessingml/2006/main" w:ilvl="8">
+      <w:start w:val="1"/>
+      <w:numFmt w:val="lowerRoman"/>
+      <w:lvlText w:val="%9."/>
+      <w:lvlJc w:val="right"/>
+      <w:pPr>
+        <w:ind w:left="6480" w:hanging="180"/>
+      </w:pPr>
+    </w:lvl>
+  </w:abstractNum>
   <w:abstractNum xmlns:w="http://schemas.openxmlformats.org/wordprocessingml/2006/main" w:abstractNumId="10">
     <w:nsid w:val="32af5599"/>
     <w:multiLevelType xmlns:w="http://schemas.openxmlformats.org/wordprocessingml/2006/main" w:val="hybridMultilevel"/>
@@ -6379,6 +7973,12 @@
       </w:rPr>
     </w:lvl>
   </w:abstractNum>
+  <w:num w:numId="13">
+    <w:abstractNumId w:val="12"/>
+  </w:num>
+  <w:num w:numId="12">
+    <w:abstractNumId w:val="11"/>
+  </w:num>
   <w:num w:numId="11">
     <w:abstractNumId w:val="10"/>
   </w:num>

</xml_diff>